<commit_message>
Add table of contents to startup success report
https://claude.ai/code/session_01QhGjCchUC55W7pMvffa1Aj
</commit_message>
<xml_diff>
--- a/scientificProject1/report/startup_success_report.docx
+++ b/scientificProject1/report/startup_success_report.docx
@@ -43,6 +43,268 @@
           <w:sz w:val="22"/>
         </w:rPr>
         <w:t>PSL M1 — March 2026</w:t>
+      </w:r>
+    </w:p>
+    <w:p>
+      <w:r>
+        <w:br w:type="page"/>
+      </w:r>
+    </w:p>
+    <w:p>
+      <w:pPr>
+        <w:pStyle w:val="Heading1"/>
+        <w:jc w:val="center"/>
+      </w:pPr>
+      <w:r>
+        <w:rPr>
+          <w:b/>
+        </w:rPr>
+        <w:t>Contents</w:t>
+      </w:r>
+    </w:p>
+    <w:p>
+      <w:pPr>
+        <w:spacing w:before="40" w:after="40"/>
+      </w:pPr>
+      <w:r>
+        <w:rPr>
+          <w:sz w:val="24"/>
+          <w:szCs w:val="24"/>
+          <w:b/>
+        </w:rPr>
+        <w:t>Introduction</w:t>
+      </w:r>
+    </w:p>
+    <w:p>
+      <w:pPr>
+        <w:spacing w:before="40" w:after="40"/>
+      </w:pPr>
+      <w:r>
+        <w:rPr>
+          <w:sz w:val="24"/>
+          <w:szCs w:val="24"/>
+          <w:b/>
+        </w:rPr>
+        <w:t>1  Dataset Description</w:t>
+      </w:r>
+    </w:p>
+    <w:p>
+      <w:pPr>
+        <w:spacing w:before="40" w:after="40"/>
+      </w:pPr>
+      <w:r>
+        <w:rPr>
+          <w:sz w:val="24"/>
+          <w:szCs w:val="24"/>
+          <w:b/>
+        </w:rPr>
+        <w:t>2  Exploratory Data Analysis</w:t>
+      </w:r>
+    </w:p>
+    <w:p>
+      <w:pPr>
+        <w:ind w:left="360"/>
+        <w:spacing w:before="40" w:after="40"/>
+      </w:pPr>
+      <w:r>
+        <w:rPr>
+          <w:sz w:val="22"/>
+          <w:szCs w:val="22"/>
+          <w:color w:val="555555"/>
+        </w:rPr>
+        <w:t>    2.1  Class Distribution</w:t>
+      </w:r>
+    </w:p>
+    <w:p>
+      <w:pPr>
+        <w:ind w:left="360"/>
+        <w:spacing w:before="40" w:after="40"/>
+      </w:pPr>
+      <w:r>
+        <w:rPr>
+          <w:sz w:val="22"/>
+          <w:szCs w:val="22"/>
+          <w:color w:val="555555"/>
+        </w:rPr>
+        <w:t>    2.2  Feature Distributions and Skewness</w:t>
+      </w:r>
+    </w:p>
+    <w:p>
+      <w:pPr>
+        <w:ind w:left="360"/>
+        <w:spacing w:before="40" w:after="40"/>
+      </w:pPr>
+      <w:r>
+        <w:rPr>
+          <w:sz w:val="22"/>
+          <w:szCs w:val="22"/>
+          <w:color w:val="555555"/>
+        </w:rPr>
+        <w:t>    2.3  Feature Quality Analysis</w:t>
+      </w:r>
+    </w:p>
+    <w:p>
+      <w:pPr>
+        <w:spacing w:before="40" w:after="40"/>
+      </w:pPr>
+      <w:r>
+        <w:rPr>
+          <w:sz w:val="24"/>
+          <w:szCs w:val="24"/>
+          <w:b/>
+        </w:rPr>
+        <w:t>3  Preprocessing</w:t>
+      </w:r>
+    </w:p>
+    <w:p>
+      <w:pPr>
+        <w:spacing w:before="40" w:after="40"/>
+      </w:pPr>
+      <w:r>
+        <w:rPr>
+          <w:sz w:val="24"/>
+          <w:szCs w:val="24"/>
+          <w:b/>
+        </w:rPr>
+        <w:t>4  Supervised Learning</w:t>
+      </w:r>
+    </w:p>
+    <w:p>
+      <w:pPr>
+        <w:ind w:left="360"/>
+        <w:spacing w:before="40" w:after="40"/>
+      </w:pPr>
+      <w:r>
+        <w:rPr>
+          <w:sz w:val="22"/>
+          <w:szCs w:val="22"/>
+          <w:color w:val="555555"/>
+        </w:rPr>
+        <w:t>    4.1  Hyperparameter Tuning</w:t>
+      </w:r>
+    </w:p>
+    <w:p>
+      <w:pPr>
+        <w:ind w:left="360"/>
+        <w:spacing w:before="40" w:after="40"/>
+      </w:pPr>
+      <w:r>
+        <w:rPr>
+          <w:sz w:val="22"/>
+          <w:szCs w:val="22"/>
+          <w:color w:val="555555"/>
+        </w:rPr>
+        <w:t>    4.2  Model Comparison</w:t>
+      </w:r>
+    </w:p>
+    <w:p>
+      <w:pPr>
+        <w:ind w:left="360"/>
+        <w:spacing w:before="40" w:after="40"/>
+      </w:pPr>
+      <w:r>
+        <w:rPr>
+          <w:sz w:val="22"/>
+          <w:szCs w:val="22"/>
+          <w:color w:val="555555"/>
+        </w:rPr>
+        <w:t>    4.3  Final Model Evaluation — Logistic Regression</w:t>
+      </w:r>
+    </w:p>
+    <w:p>
+      <w:pPr>
+        <w:spacing w:before="40" w:after="40"/>
+      </w:pPr>
+      <w:r>
+        <w:rPr>
+          <w:sz w:val="24"/>
+          <w:szCs w:val="24"/>
+          <w:b/>
+        </w:rPr>
+        <w:t>5  Unsupervised Learning</w:t>
+      </w:r>
+    </w:p>
+    <w:p>
+      <w:pPr>
+        <w:ind w:left="360"/>
+        <w:spacing w:before="40" w:after="40"/>
+      </w:pPr>
+      <w:r>
+        <w:rPr>
+          <w:sz w:val="22"/>
+          <w:szCs w:val="22"/>
+          <w:color w:val="555555"/>
+        </w:rPr>
+        <w:t>    5.1  PCA — Variance Analysis</w:t>
+      </w:r>
+    </w:p>
+    <w:p>
+      <w:pPr>
+        <w:ind w:left="360"/>
+        <w:spacing w:before="40" w:after="40"/>
+      </w:pPr>
+      <w:r>
+        <w:rPr>
+          <w:sz w:val="22"/>
+          <w:szCs w:val="22"/>
+          <w:color w:val="555555"/>
+        </w:rPr>
+        <w:t>    5.2  K-Means Clustering</w:t>
+      </w:r>
+    </w:p>
+    <w:p>
+      <w:pPr>
+        <w:ind w:left="360"/>
+        <w:spacing w:before="40" w:after="40"/>
+      </w:pPr>
+      <w:r>
+        <w:rPr>
+          <w:sz w:val="22"/>
+          <w:szCs w:val="22"/>
+          <w:color w:val="555555"/>
+        </w:rPr>
+        <w:t>    5.3  Cluster Profiles</w:t>
+      </w:r>
+    </w:p>
+    <w:p>
+      <w:pPr>
+        <w:ind w:left="360"/>
+        <w:spacing w:before="40" w:after="40"/>
+      </w:pPr>
+      <w:r>
+        <w:rPr>
+          <w:sz w:val="22"/>
+          <w:szCs w:val="22"/>
+          <w:color w:val="555555"/>
+        </w:rPr>
+        <w:t>    5.4  Clusters vs. Outcomes</w:t>
+      </w:r>
+    </w:p>
+    <w:p>
+      <w:pPr>
+        <w:ind w:left="360"/>
+        <w:spacing w:before="40" w:after="40"/>
+      </w:pPr>
+      <w:r>
+        <w:rPr>
+          <w:sz w:val="22"/>
+          <w:szCs w:val="22"/>
+          <w:color w:val="555555"/>
+        </w:rPr>
+        <w:t>    5.5  Hierarchical Clustering</w:t>
+      </w:r>
+    </w:p>
+    <w:p>
+      <w:pPr>
+        <w:spacing w:before="40" w:after="40"/>
+      </w:pPr>
+      <w:r>
+        <w:rPr>
+          <w:sz w:val="24"/>
+          <w:szCs w:val="24"/>
+          <w:b/>
+        </w:rPr>
+        <w:t>6  Conclusion</w:t>
       </w:r>
     </w:p>
     <w:p>

</xml_diff>

<commit_message>
Update report: reflect all notebook changes
- Section 4.3: 3-class LR evaluation (unchanged)
- Section 4.4 (new): Binary classification Failure vs Acquisition
  LR CV=74.27%, macro F1=0.737, AUC=0.816
- Section 5.2: Replace elbow with k=2 vs k=3 silhouette comparison
- Section 5.4: Cluster archetypes (no outcome label comparison)
- Section 5.5 (new): k=2 vs Failure/Non-Failure sanity check
- Section 5.6: Hierarchical clustering (was 5.5)
- Section 6: Updated conclusion

https://claude.ai/code/session_01QhGjCchUC55W7pMvffa1Aj
</commit_message>
<xml_diff>
--- a/scientificProject1/report/startup_success_report.docx
+++ b/scientificProject1/report/startup_success_report.docx
@@ -4007,35 +4007,27 @@
       <w:pPr>
         <w:pStyle w:val="21"/>
       </w:pPr>
-      <w:bookmarkStart w:id="10" w:name="_Toc225885095"/>
       <w:r>
         <w:t>4.3  Final Model Evaluation — Logistic Regression</w:t>
       </w:r>
-      <w:bookmarkEnd w:id="10"/>
     </w:p>
     <w:p>
       <w:pPr>
         <w:spacing w:after="120"/>
       </w:pPr>
       <w:r>
-        <w:t xml:space="preserve">Logistic Regression was selected as the best model and evaluated on the held-out test set (20,000 samples). The test accuracy was </w:t>
-      </w:r>
-      <w:r>
         <w:rPr>
-          <w:b/>
+          <w:sz w:val="22"/>
         </w:rPr>
-        <w:t>72.90%</w:t>
-      </w:r>
-      <w:r>
-        <w:t>, consistent with the cross-validated estimate (no overfitting). Table 6 presents the full classification report.</w:t>
+        <w:t>Logistic Regression was selected as the best model and evaluated on the held-out test set (20,000 samples). Test accuracy was 72.90%, consistent with the cross-validated estimate. Table 6 presents the full classification report.</w:t>
       </w:r>
     </w:p>
     <w:tbl>
       <w:tblPr>
         <w:tblStyle w:val="aff1"/>
-        <w:tblW w:w="0" w:type="auto"/>
+        <w:tblW w:type="auto" w:w="0"/>
         <w:jc w:val="center"/>
-        <w:tblLook w:val="04A0" w:firstRow="1" w:lastRow="0" w:firstColumn="1" w:lastColumn="0" w:noHBand="0" w:noVBand="1"/>
+        <w:tblLook w:firstColumn="1" w:firstRow="1" w:lastColumn="0" w:lastRow="0" w:noHBand="0" w:noVBand="1" w:val="04A0"/>
       </w:tblPr>
       <w:tblGrid>
         <w:gridCol w:w="1881"/>
@@ -4045,12 +4037,9 @@
         <w:gridCol w:w="1881"/>
       </w:tblGrid>
       <w:tr>
-        <w:trPr>
-          <w:jc w:val="center"/>
-        </w:trPr>
-        <w:tc>
-          <w:tcPr>
-            <w:tcW w:w="1881" w:type="dxa"/>
+        <w:tc>
+          <w:tcPr>
+            <w:tcW w:type="dxa" w:w="1881"/>
           </w:tcPr>
           <w:p>
             <w:pPr>
@@ -4067,7 +4056,7 @@
         </w:tc>
         <w:tc>
           <w:tcPr>
-            <w:tcW w:w="1881" w:type="dxa"/>
+            <w:tcW w:type="dxa" w:w="1881"/>
           </w:tcPr>
           <w:p>
             <w:pPr>
@@ -4084,7 +4073,7 @@
         </w:tc>
         <w:tc>
           <w:tcPr>
-            <w:tcW w:w="1881" w:type="dxa"/>
+            <w:tcW w:type="dxa" w:w="1881"/>
           </w:tcPr>
           <w:p>
             <w:pPr>
@@ -4101,7 +4090,7 @@
         </w:tc>
         <w:tc>
           <w:tcPr>
-            <w:tcW w:w="1881" w:type="dxa"/>
+            <w:tcW w:type="dxa" w:w="1881"/>
           </w:tcPr>
           <w:p>
             <w:pPr>
@@ -4118,7 +4107,7 @@
         </w:tc>
         <w:tc>
           <w:tcPr>
-            <w:tcW w:w="1881" w:type="dxa"/>
+            <w:tcW w:type="dxa" w:w="1881"/>
           </w:tcPr>
           <w:p>
             <w:pPr>
@@ -4135,12 +4124,9 @@
         </w:tc>
       </w:tr>
       <w:tr>
-        <w:trPr>
-          <w:jc w:val="center"/>
-        </w:trPr>
-        <w:tc>
-          <w:tcPr>
-            <w:tcW w:w="1881" w:type="dxa"/>
+        <w:tc>
+          <w:tcPr>
+            <w:tcW w:type="dxa" w:w="1881"/>
           </w:tcPr>
           <w:p>
             <w:pPr>
@@ -4156,7 +4142,7 @@
         </w:tc>
         <w:tc>
           <w:tcPr>
-            <w:tcW w:w="1881" w:type="dxa"/>
+            <w:tcW w:type="dxa" w:w="1881"/>
           </w:tcPr>
           <w:p>
             <w:pPr>
@@ -4172,7 +4158,7 @@
         </w:tc>
         <w:tc>
           <w:tcPr>
-            <w:tcW w:w="1881" w:type="dxa"/>
+            <w:tcW w:type="dxa" w:w="1881"/>
           </w:tcPr>
           <w:p>
             <w:pPr>
@@ -4188,7 +4174,7 @@
         </w:tc>
         <w:tc>
           <w:tcPr>
-            <w:tcW w:w="1881" w:type="dxa"/>
+            <w:tcW w:type="dxa" w:w="1881"/>
           </w:tcPr>
           <w:p>
             <w:pPr>
@@ -4204,7 +4190,7 @@
         </w:tc>
         <w:tc>
           <w:tcPr>
-            <w:tcW w:w="1881" w:type="dxa"/>
+            <w:tcW w:type="dxa" w:w="1881"/>
           </w:tcPr>
           <w:p>
             <w:pPr>
@@ -4220,12 +4206,9 @@
         </w:tc>
       </w:tr>
       <w:tr>
-        <w:trPr>
-          <w:jc w:val="center"/>
-        </w:trPr>
-        <w:tc>
-          <w:tcPr>
-            <w:tcW w:w="1881" w:type="dxa"/>
+        <w:tc>
+          <w:tcPr>
+            <w:tcW w:type="dxa" w:w="1881"/>
           </w:tcPr>
           <w:p>
             <w:pPr>
@@ -4241,7 +4224,7 @@
         </w:tc>
         <w:tc>
           <w:tcPr>
-            <w:tcW w:w="1881" w:type="dxa"/>
+            <w:tcW w:type="dxa" w:w="1881"/>
           </w:tcPr>
           <w:p>
             <w:pPr>
@@ -4257,7 +4240,7 @@
         </w:tc>
         <w:tc>
           <w:tcPr>
-            <w:tcW w:w="1881" w:type="dxa"/>
+            <w:tcW w:type="dxa" w:w="1881"/>
           </w:tcPr>
           <w:p>
             <w:pPr>
@@ -4273,7 +4256,7 @@
         </w:tc>
         <w:tc>
           <w:tcPr>
-            <w:tcW w:w="1881" w:type="dxa"/>
+            <w:tcW w:type="dxa" w:w="1881"/>
           </w:tcPr>
           <w:p>
             <w:pPr>
@@ -4289,7 +4272,7 @@
         </w:tc>
         <w:tc>
           <w:tcPr>
-            <w:tcW w:w="1881" w:type="dxa"/>
+            <w:tcW w:type="dxa" w:w="1881"/>
           </w:tcPr>
           <w:p>
             <w:pPr>
@@ -4305,12 +4288,9 @@
         </w:tc>
       </w:tr>
       <w:tr>
-        <w:trPr>
-          <w:jc w:val="center"/>
-        </w:trPr>
-        <w:tc>
-          <w:tcPr>
-            <w:tcW w:w="1881" w:type="dxa"/>
+        <w:tc>
+          <w:tcPr>
+            <w:tcW w:type="dxa" w:w="1881"/>
           </w:tcPr>
           <w:p>
             <w:pPr>
@@ -4326,7 +4306,7 @@
         </w:tc>
         <w:tc>
           <w:tcPr>
-            <w:tcW w:w="1881" w:type="dxa"/>
+            <w:tcW w:type="dxa" w:w="1881"/>
           </w:tcPr>
           <w:p>
             <w:pPr>
@@ -4342,7 +4322,7 @@
         </w:tc>
         <w:tc>
           <w:tcPr>
-            <w:tcW w:w="1881" w:type="dxa"/>
+            <w:tcW w:type="dxa" w:w="1881"/>
           </w:tcPr>
           <w:p>
             <w:pPr>
@@ -4358,7 +4338,7 @@
         </w:tc>
         <w:tc>
           <w:tcPr>
-            <w:tcW w:w="1881" w:type="dxa"/>
+            <w:tcW w:type="dxa" w:w="1881"/>
           </w:tcPr>
           <w:p>
             <w:pPr>
@@ -4374,7 +4354,7 @@
         </w:tc>
         <w:tc>
           <w:tcPr>
-            <w:tcW w:w="1881" w:type="dxa"/>
+            <w:tcW w:type="dxa" w:w="1881"/>
           </w:tcPr>
           <w:p>
             <w:pPr>
@@ -4390,12 +4370,9 @@
         </w:tc>
       </w:tr>
       <w:tr>
-        <w:trPr>
-          <w:jc w:val="center"/>
-        </w:trPr>
-        <w:tc>
-          <w:tcPr>
-            <w:tcW w:w="1881" w:type="dxa"/>
+        <w:tc>
+          <w:tcPr>
+            <w:tcW w:type="dxa" w:w="1881"/>
           </w:tcPr>
           <w:p>
             <w:pPr>
@@ -4411,7 +4388,7 @@
         </w:tc>
         <w:tc>
           <w:tcPr>
-            <w:tcW w:w="1881" w:type="dxa"/>
+            <w:tcW w:type="dxa" w:w="1881"/>
           </w:tcPr>
           <w:p>
             <w:pPr>
@@ -4427,7 +4404,7 @@
         </w:tc>
         <w:tc>
           <w:tcPr>
-            <w:tcW w:w="1881" w:type="dxa"/>
+            <w:tcW w:type="dxa" w:w="1881"/>
           </w:tcPr>
           <w:p>
             <w:pPr>
@@ -4443,7 +4420,7 @@
         </w:tc>
         <w:tc>
           <w:tcPr>
-            <w:tcW w:w="1881" w:type="dxa"/>
+            <w:tcW w:type="dxa" w:w="1881"/>
           </w:tcPr>
           <w:p>
             <w:pPr>
@@ -4459,7 +4436,7 @@
         </w:tc>
         <w:tc>
           <w:tcPr>
-            <w:tcW w:w="1881" w:type="dxa"/>
+            <w:tcW w:type="dxa" w:w="1881"/>
           </w:tcPr>
           <w:p>
             <w:pPr>
@@ -4475,12 +4452,9 @@
         </w:tc>
       </w:tr>
       <w:tr>
-        <w:trPr>
-          <w:jc w:val="center"/>
-        </w:trPr>
-        <w:tc>
-          <w:tcPr>
-            <w:tcW w:w="1881" w:type="dxa"/>
+        <w:tc>
+          <w:tcPr>
+            <w:tcW w:type="dxa" w:w="1881"/>
           </w:tcPr>
           <w:p>
             <w:pPr>
@@ -4496,7 +4470,7 @@
         </w:tc>
         <w:tc>
           <w:tcPr>
-            <w:tcW w:w="1881" w:type="dxa"/>
+            <w:tcW w:type="dxa" w:w="1881"/>
           </w:tcPr>
           <w:p>
             <w:pPr>
@@ -4512,7 +4486,7 @@
         </w:tc>
         <w:tc>
           <w:tcPr>
-            <w:tcW w:w="1881" w:type="dxa"/>
+            <w:tcW w:type="dxa" w:w="1881"/>
           </w:tcPr>
           <w:p>
             <w:pPr>
@@ -4528,7 +4502,7 @@
         </w:tc>
         <w:tc>
           <w:tcPr>
-            <w:tcW w:w="1881" w:type="dxa"/>
+            <w:tcW w:type="dxa" w:w="1881"/>
           </w:tcPr>
           <w:p>
             <w:pPr>
@@ -4544,7 +4518,7 @@
         </w:tc>
         <w:tc>
           <w:tcPr>
-            <w:tcW w:w="1881" w:type="dxa"/>
+            <w:tcW w:type="dxa" w:w="1881"/>
           </w:tcPr>
           <w:p>
             <w:pPr>
@@ -4560,12 +4534,9 @@
         </w:tc>
       </w:tr>
       <w:tr>
-        <w:trPr>
-          <w:jc w:val="center"/>
-        </w:trPr>
-        <w:tc>
-          <w:tcPr>
-            <w:tcW w:w="1881" w:type="dxa"/>
+        <w:tc>
+          <w:tcPr>
+            <w:tcW w:type="dxa" w:w="1881"/>
           </w:tcPr>
           <w:p>
             <w:pPr>
@@ -4581,7 +4552,7 @@
         </w:tc>
         <w:tc>
           <w:tcPr>
-            <w:tcW w:w="1881" w:type="dxa"/>
+            <w:tcW w:type="dxa" w:w="1881"/>
           </w:tcPr>
           <w:p>
             <w:pPr>
@@ -4597,7 +4568,7 @@
         </w:tc>
         <w:tc>
           <w:tcPr>
-            <w:tcW w:w="1881" w:type="dxa"/>
+            <w:tcW w:type="dxa" w:w="1881"/>
           </w:tcPr>
           <w:p>
             <w:pPr>
@@ -4613,7 +4584,7 @@
         </w:tc>
         <w:tc>
           <w:tcPr>
-            <w:tcW w:w="1881" w:type="dxa"/>
+            <w:tcW w:type="dxa" w:w="1881"/>
           </w:tcPr>
           <w:p>
             <w:pPr>
@@ -4629,7 +4600,7 @@
         </w:tc>
         <w:tc>
           <w:tcPr>
-            <w:tcW w:w="1881" w:type="dxa"/>
+            <w:tcW w:type="dxa" w:w="1881"/>
           </w:tcPr>
           <w:p>
             <w:pPr>
@@ -4647,7 +4618,7 @@
     </w:tbl>
     <w:p>
       <w:pPr>
-        <w:spacing w:before="40"/>
+        <w:spacing w:before="40" w:after="200"/>
         <w:jc w:val="center"/>
       </w:pPr>
       <w:r>
@@ -4656,7 +4627,7 @@
           <w:color w:val="646464"/>
           <w:sz w:val="18"/>
         </w:rPr>
-        <w:t>Table 6 — Classification report for Logistic Regression on the test set.</w:t>
+        <w:t>Table 6 — Classification report for Logistic Regression on the test set (3-class).</w:t>
       </w:r>
     </w:p>
     <w:p>
@@ -4664,7 +4635,19 @@
         <w:spacing w:after="120"/>
       </w:pPr>
       <w:r>
-        <w:t>The model performs best on Failure (F1 = 0.775), reasonably on Acquisition (F1 = 0.682), but struggles heavily with IPO (F1 = 0.296). The low recall for IPO (0.190) is primarily due to class imbalance: with only 2.1% of samples being IPOs, the model learns to rarely predict this class. The confusion matrix (Figure 2 in the notebook) confirms that most IPO samples are misclassified as Acquisition.</w:t>
+        <w:rPr>
+          <w:sz w:val="22"/>
+        </w:rPr>
+        <w:t>The model performs well on Failure (F1 = 0.775) and reasonably on Acquisition (F1 = 0.682), but struggles with IPO (F1 = 0.296, Recall = 0.190). The low recall for IPO is a direct consequence of class imbalance: with only 2.1% of samples, the model rarely predicts this class. The ROC curves (one-vs-rest) confirm this, and feature importances show that revenue_million and product_traction_users dominate the decision boundary.</w:t>
+      </w:r>
+    </w:p>
+    <w:p/>
+    <w:p>
+      <w:pPr>
+        <w:pStyle w:val="21"/>
+      </w:pPr>
+      <w:r>
+        <w:t>4.4  Binary Classification — Failure vs Acquisition</w:t>
       </w:r>
     </w:p>
     <w:p>
@@ -4672,92 +4655,29 @@
         <w:spacing w:after="120"/>
       </w:pPr>
       <w:r>
-        <w:t xml:space="preserve">The ROC curves (one-vs-rest, Figure 3) show AUC values consistent with these findings. Feature importances from Logistic Regression confirm that </w:t>
+        <w:rPr>
+          <w:sz w:val="22"/>
+        </w:rPr>
+        <w:t>Given the near-impossibility of learning the IPO class (2.1% of data), we remove IPO rows and repeat the full pipeline on the remaining two classes (97,945 samples: 57% Failure, 43% Acquisition). This binary setting produces a cleaner and more balanced problem.</w:t>
       </w:r>
-      <w:r>
-        <w:rPr>
-          <w:b/>
-        </w:rPr>
-        <w:t>revenue_million</w:t>
-      </w:r>
-      <w:r>
-        <w:t xml:space="preserve"> and </w:t>
-      </w:r>
-      <w:r>
-        <w:rPr>
-          <w:b/>
-        </w:rPr>
-        <w:t>product_traction_users</w:t>
-      </w:r>
-      <w:r>
-        <w:t xml:space="preserve"> dominate the decision boundary, while </w:t>
-      </w:r>
-      <w:r>
-        <w:rPr>
-          <w:b/>
-        </w:rPr>
-        <w:t>market_size_billion</w:t>
-      </w:r>
-      <w:r>
-        <w:t xml:space="preserve"> and </w:t>
-      </w:r>
-      <w:r>
-        <w:rPr>
-          <w:b/>
-        </w:rPr>
-        <w:t>burn_rate_million</w:t>
-      </w:r>
-      <w:r>
-        <w:t xml:space="preserve"> have near-zero coefficients — consistent with the feature quality analysis in Section 2.3.</w:t>
-      </w:r>
-    </w:p>
-    <w:p/>
-    <w:p>
-      <w:pPr>
-        <w:pStyle w:val="1"/>
-      </w:pPr>
-      <w:bookmarkStart w:id="11" w:name="_Toc225885096"/>
-      <w:r>
-        <w:t>5  Unsupervised Learning</w:t>
-      </w:r>
-      <w:bookmarkEnd w:id="11"/>
     </w:p>
     <w:p>
       <w:pPr>
         <w:spacing w:after="120"/>
       </w:pPr>
       <w:r>
-        <w:t>In Part 2, we apply unsupervised methods to the full dataset (100,000 samples) to discover latent groupings without using outcome labels, then compare these groupings to the known outcomes.</w:t>
-      </w:r>
-    </w:p>
-    <w:p>
-      <w:pPr>
-        <w:pStyle w:val="21"/>
-      </w:pPr>
-      <w:bookmarkStart w:id="12" w:name="_Toc225885097"/>
-      <w:r>
-        <w:t>5.1  PCA — Variance Analysis</w:t>
-      </w:r>
-      <w:bookmarkEnd w:id="12"/>
-    </w:p>
-    <w:p>
-      <w:pPr>
-        <w:spacing w:after="120"/>
-      </w:pPr>
-      <w:r>
-        <w:t xml:space="preserve">We first applied PCA to the scaled numerical features (7 dimensions). The first two principal components capture only 39.65% of total variance (PC1: 25.23%, PC2: 14.42%), as shown in Table 7. This low cumulative explained variance is consistent with the near-independence of features in the </w:t>
-      </w:r>
-      <w:r>
-        <w:lastRenderedPageBreak/>
-        <w:t>synthetic dataset — no dominant direction of variation exists, and the data spreads relatively uniformly across all dimensions.</w:t>
+        <w:rPr>
+          <w:sz w:val="22"/>
+        </w:rPr>
+        <w:t>Table 7 summarises the GridSearchCV results on the binary dataset.</w:t>
       </w:r>
     </w:p>
     <w:tbl>
       <w:tblPr>
         <w:tblStyle w:val="aff1"/>
-        <w:tblW w:w="0" w:type="auto"/>
+        <w:tblW w:type="auto" w:w="0"/>
         <w:jc w:val="center"/>
-        <w:tblLook w:val="04A0" w:firstRow="1" w:lastRow="0" w:firstColumn="1" w:lastColumn="0" w:noHBand="0" w:noVBand="1"/>
+        <w:tblLook w:firstColumn="1" w:firstRow="1" w:lastColumn="0" w:lastRow="0" w:noHBand="0" w:noVBand="1" w:val="04A0"/>
       </w:tblPr>
       <w:tblGrid>
         <w:gridCol w:w="3135"/>
@@ -4765,12 +4685,9 @@
         <w:gridCol w:w="3135"/>
       </w:tblGrid>
       <w:tr>
-        <w:trPr>
-          <w:jc w:val="center"/>
-        </w:trPr>
-        <w:tc>
-          <w:tcPr>
-            <w:tcW w:w="3135" w:type="dxa"/>
+        <w:tc>
+          <w:tcPr>
+            <w:tcW w:type="dxa" w:w="3135"/>
           </w:tcPr>
           <w:p>
             <w:pPr>
@@ -4781,13 +4698,13 @@
                 <w:b/>
                 <w:sz w:val="20"/>
               </w:rPr>
-              <w:t>Component</w:t>
-            </w:r>
-          </w:p>
-        </w:tc>
-        <w:tc>
-          <w:tcPr>
-            <w:tcW w:w="3135" w:type="dxa"/>
+              <w:t>Model</w:t>
+            </w:r>
+          </w:p>
+        </w:tc>
+        <w:tc>
+          <w:tcPr>
+            <w:tcW w:type="dxa" w:w="3135"/>
           </w:tcPr>
           <w:p>
             <w:pPr>
@@ -4798,13 +4715,13 @@
                 <w:b/>
                 <w:sz w:val="20"/>
               </w:rPr>
-              <w:t>Explained Variance</w:t>
-            </w:r>
-          </w:p>
-        </w:tc>
-        <w:tc>
-          <w:tcPr>
-            <w:tcW w:w="3135" w:type="dxa"/>
+              <w:t>Best params</w:t>
+            </w:r>
+          </w:p>
+        </w:tc>
+        <w:tc>
+          <w:tcPr>
+            <w:tcW w:type="dxa" w:w="3135"/>
           </w:tcPr>
           <w:p>
             <w:pPr>
@@ -4815,166 +4732,207 @@
                 <w:b/>
                 <w:sz w:val="20"/>
               </w:rPr>
-              <w:t>Cumulative</w:t>
+              <w:t>CV Accuracy</w:t>
             </w:r>
           </w:p>
         </w:tc>
       </w:tr>
       <w:tr>
-        <w:trPr>
-          <w:jc w:val="center"/>
-        </w:trPr>
-        <w:tc>
-          <w:tcPr>
-            <w:tcW w:w="3135" w:type="dxa"/>
-          </w:tcPr>
-          <w:p>
-            <w:pPr>
-              <w:jc w:val="center"/>
-            </w:pPr>
-            <w:r>
-              <w:rPr>
-                <w:sz w:val="20"/>
-              </w:rPr>
-              <w:t>PC1</w:t>
-            </w:r>
-          </w:p>
-        </w:tc>
-        <w:tc>
-          <w:tcPr>
-            <w:tcW w:w="3135" w:type="dxa"/>
-          </w:tcPr>
-          <w:p>
-            <w:pPr>
-              <w:jc w:val="center"/>
-            </w:pPr>
-            <w:r>
-              <w:rPr>
-                <w:sz w:val="20"/>
-              </w:rPr>
-              <w:t>25.23%</w:t>
-            </w:r>
-          </w:p>
-        </w:tc>
-        <w:tc>
-          <w:tcPr>
-            <w:tcW w:w="3135" w:type="dxa"/>
-          </w:tcPr>
-          <w:p>
-            <w:pPr>
-              <w:jc w:val="center"/>
-            </w:pPr>
-            <w:r>
-              <w:rPr>
-                <w:sz w:val="20"/>
-              </w:rPr>
-              <w:t>25.23%</w:t>
+        <w:tc>
+          <w:tcPr>
+            <w:tcW w:type="dxa" w:w="3135"/>
+          </w:tcPr>
+          <w:p>
+            <w:pPr>
+              <w:jc w:val="center"/>
+            </w:pPr>
+            <w:r>
+              <w:rPr>
+                <w:sz w:val="20"/>
+              </w:rPr>
+              <w:t>k-NN</w:t>
+            </w:r>
+          </w:p>
+        </w:tc>
+        <w:tc>
+          <w:tcPr>
+            <w:tcW w:type="dxa" w:w="3135"/>
+          </w:tcPr>
+          <w:p>
+            <w:pPr>
+              <w:jc w:val="center"/>
+            </w:pPr>
+            <w:r>
+              <w:rPr>
+                <w:sz w:val="20"/>
+              </w:rPr>
+              <w:t>k = 51</w:t>
+            </w:r>
+          </w:p>
+        </w:tc>
+        <w:tc>
+          <w:tcPr>
+            <w:tcW w:type="dxa" w:w="3135"/>
+          </w:tcPr>
+          <w:p>
+            <w:pPr>
+              <w:jc w:val="center"/>
+            </w:pPr>
+            <w:r>
+              <w:rPr>
+                <w:sz w:val="20"/>
+              </w:rPr>
+              <w:t>0.7248</w:t>
             </w:r>
           </w:p>
         </w:tc>
       </w:tr>
       <w:tr>
-        <w:trPr>
-          <w:jc w:val="center"/>
-        </w:trPr>
-        <w:tc>
-          <w:tcPr>
-            <w:tcW w:w="3135" w:type="dxa"/>
-          </w:tcPr>
-          <w:p>
-            <w:pPr>
-              <w:jc w:val="center"/>
-            </w:pPr>
-            <w:r>
-              <w:rPr>
-                <w:sz w:val="20"/>
-              </w:rPr>
-              <w:t>PC2</w:t>
-            </w:r>
-          </w:p>
-        </w:tc>
-        <w:tc>
-          <w:tcPr>
-            <w:tcW w:w="3135" w:type="dxa"/>
-          </w:tcPr>
-          <w:p>
-            <w:pPr>
-              <w:jc w:val="center"/>
-            </w:pPr>
-            <w:r>
-              <w:rPr>
-                <w:sz w:val="20"/>
-              </w:rPr>
-              <w:t>14.42%</w:t>
-            </w:r>
-          </w:p>
-        </w:tc>
-        <w:tc>
-          <w:tcPr>
-            <w:tcW w:w="3135" w:type="dxa"/>
-          </w:tcPr>
-          <w:p>
-            <w:pPr>
-              <w:jc w:val="center"/>
-            </w:pPr>
-            <w:r>
-              <w:rPr>
-                <w:sz w:val="20"/>
-              </w:rPr>
-              <w:t>39.65%</w:t>
+        <w:tc>
+          <w:tcPr>
+            <w:tcW w:type="dxa" w:w="3135"/>
+          </w:tcPr>
+          <w:p>
+            <w:pPr>
+              <w:jc w:val="center"/>
+            </w:pPr>
+            <w:r>
+              <w:rPr>
+                <w:sz w:val="20"/>
+              </w:rPr>
+              <w:t>Decision Tree</w:t>
+            </w:r>
+          </w:p>
+        </w:tc>
+        <w:tc>
+          <w:tcPr>
+            <w:tcW w:type="dxa" w:w="3135"/>
+          </w:tcPr>
+          <w:p>
+            <w:pPr>
+              <w:jc w:val="center"/>
+            </w:pPr>
+            <w:r>
+              <w:rPr>
+                <w:sz w:val="20"/>
+              </w:rPr>
+              <w:t>max_depth=10, min_split=50</w:t>
+            </w:r>
+          </w:p>
+        </w:tc>
+        <w:tc>
+          <w:tcPr>
+            <w:tcW w:type="dxa" w:w="3135"/>
+          </w:tcPr>
+          <w:p>
+            <w:pPr>
+              <w:jc w:val="center"/>
+            </w:pPr>
+            <w:r>
+              <w:rPr>
+                <w:sz w:val="20"/>
+              </w:rPr>
+              <w:t>0.7338</w:t>
             </w:r>
           </w:p>
         </w:tc>
       </w:tr>
       <w:tr>
-        <w:trPr>
-          <w:jc w:val="center"/>
-        </w:trPr>
-        <w:tc>
-          <w:tcPr>
-            <w:tcW w:w="3135" w:type="dxa"/>
-          </w:tcPr>
-          <w:p>
-            <w:pPr>
-              <w:jc w:val="center"/>
-            </w:pPr>
-            <w:r>
-              <w:rPr>
-                <w:sz w:val="20"/>
-              </w:rPr>
-              <w:t>PC3</w:t>
-            </w:r>
-          </w:p>
-        </w:tc>
-        <w:tc>
-          <w:tcPr>
-            <w:tcW w:w="3135" w:type="dxa"/>
-          </w:tcPr>
-          <w:p>
-            <w:pPr>
-              <w:jc w:val="center"/>
-            </w:pPr>
-            <w:r>
-              <w:rPr>
-                <w:sz w:val="20"/>
-              </w:rPr>
-              <w:t>~14%</w:t>
-            </w:r>
-          </w:p>
-        </w:tc>
-        <w:tc>
-          <w:tcPr>
-            <w:tcW w:w="3135" w:type="dxa"/>
-          </w:tcPr>
-          <w:p>
-            <w:pPr>
-              <w:jc w:val="center"/>
-            </w:pPr>
-            <w:r>
-              <w:rPr>
-                <w:sz w:val="20"/>
-              </w:rPr>
-              <w:t>~54%</w:t>
+        <w:tc>
+          <w:tcPr>
+            <w:tcW w:type="dxa" w:w="3135"/>
+          </w:tcPr>
+          <w:p>
+            <w:pPr>
+              <w:jc w:val="center"/>
+            </w:pPr>
+            <w:r>
+              <w:rPr>
+                <w:sz w:val="20"/>
+              </w:rPr>
+              <w:t>LDA</w:t>
+            </w:r>
+          </w:p>
+        </w:tc>
+        <w:tc>
+          <w:tcPr>
+            <w:tcW w:type="dxa" w:w="3135"/>
+          </w:tcPr>
+          <w:p>
+            <w:pPr>
+              <w:jc w:val="center"/>
+            </w:pPr>
+            <w:r>
+              <w:rPr>
+                <w:sz w:val="20"/>
+              </w:rPr>
+              <w:t>—</w:t>
+            </w:r>
+          </w:p>
+        </w:tc>
+        <w:tc>
+          <w:tcPr>
+            <w:tcW w:type="dxa" w:w="3135"/>
+          </w:tcPr>
+          <w:p>
+            <w:pPr>
+              <w:jc w:val="center"/>
+            </w:pPr>
+            <w:r>
+              <w:rPr>
+                <w:sz w:val="20"/>
+              </w:rPr>
+              <w:t>0.7408</w:t>
+            </w:r>
+          </w:p>
+        </w:tc>
+      </w:tr>
+      <w:tr>
+        <w:tc>
+          <w:tcPr>
+            <w:tcW w:type="dxa" w:w="3135"/>
+          </w:tcPr>
+          <w:p>
+            <w:pPr>
+              <w:jc w:val="center"/>
+            </w:pPr>
+            <w:r>
+              <w:rPr>
+                <w:sz w:val="20"/>
+              </w:rPr>
+              <w:t>Logistic Regression</w:t>
+            </w:r>
+          </w:p>
+        </w:tc>
+        <w:tc>
+          <w:tcPr>
+            <w:tcW w:type="dxa" w:w="3135"/>
+          </w:tcPr>
+          <w:p>
+            <w:pPr>
+              <w:jc w:val="center"/>
+            </w:pPr>
+            <w:r>
+              <w:rPr>
+                <w:sz w:val="20"/>
+              </w:rPr>
+              <w:t>C = 0.01</w:t>
+            </w:r>
+          </w:p>
+        </w:tc>
+        <w:tc>
+          <w:tcPr>
+            <w:tcW w:type="dxa" w:w="3135"/>
+          </w:tcPr>
+          <w:p>
+            <w:pPr>
+              <w:jc w:val="center"/>
+            </w:pPr>
+            <w:r>
+              <w:rPr>
+                <w:sz w:val="20"/>
+              </w:rPr>
+              <w:t>0.7427 ✓</w:t>
             </w:r>
           </w:p>
         </w:tc>
@@ -4982,7 +4940,7 @@
     </w:tbl>
     <w:p>
       <w:pPr>
-        <w:spacing w:before="40"/>
+        <w:spacing w:before="40" w:after="200"/>
         <w:jc w:val="center"/>
       </w:pPr>
       <w:r>
@@ -4991,427 +4949,7 @@
           <w:color w:val="646464"/>
           <w:sz w:val="18"/>
         </w:rPr>
-        <w:t>Table 7 — PCA explained variance for the first three components.</w:t>
-      </w:r>
-    </w:p>
-    <w:p/>
-    <w:p>
-      <w:pPr>
-        <w:pStyle w:val="21"/>
-      </w:pPr>
-      <w:bookmarkStart w:id="13" w:name="_Toc225885098"/>
-      <w:r>
-        <w:t>5.2  K-Means Clustering</w:t>
-      </w:r>
-      <w:bookmarkEnd w:id="13"/>
-    </w:p>
-    <w:p>
-      <w:pPr>
-        <w:spacing w:after="120"/>
-      </w:pPr>
-      <w:r>
-        <w:t>We applied K-Means on a 20,000-row subsample for the elbow search, then fitted the final model on the full 100,000 rows. The elbow curve (Figure 4 in the notebook) shows a near-linear decrease in inertia, with no sharp elbow — typical of synthetic data with no natural cluster structure. Table 8 shows the inertia drop per k.</w:t>
-      </w:r>
-    </w:p>
-    <w:tbl>
-      <w:tblPr>
-        <w:tblStyle w:val="aff1"/>
-        <w:tblW w:w="0" w:type="auto"/>
-        <w:jc w:val="center"/>
-        <w:tblLook w:val="04A0" w:firstRow="1" w:lastRow="0" w:firstColumn="1" w:lastColumn="0" w:noHBand="0" w:noVBand="1"/>
-      </w:tblPr>
-      <w:tblGrid>
-        <w:gridCol w:w="3135"/>
-        <w:gridCol w:w="3135"/>
-        <w:gridCol w:w="3135"/>
-      </w:tblGrid>
-      <w:tr>
-        <w:trPr>
-          <w:jc w:val="center"/>
-        </w:trPr>
-        <w:tc>
-          <w:tcPr>
-            <w:tcW w:w="3135" w:type="dxa"/>
-          </w:tcPr>
-          <w:p>
-            <w:pPr>
-              <w:jc w:val="center"/>
-            </w:pPr>
-            <w:r>
-              <w:rPr>
-                <w:b/>
-                <w:sz w:val="20"/>
-              </w:rPr>
-              <w:t>k</w:t>
-            </w:r>
-          </w:p>
-        </w:tc>
-        <w:tc>
-          <w:tcPr>
-            <w:tcW w:w="3135" w:type="dxa"/>
-          </w:tcPr>
-          <w:p>
-            <w:pPr>
-              <w:jc w:val="center"/>
-            </w:pPr>
-            <w:r>
-              <w:rPr>
-                <w:b/>
-                <w:sz w:val="20"/>
-              </w:rPr>
-              <w:t>Inertia</w:t>
-            </w:r>
-          </w:p>
-        </w:tc>
-        <w:tc>
-          <w:tcPr>
-            <w:tcW w:w="3135" w:type="dxa"/>
-          </w:tcPr>
-          <w:p>
-            <w:pPr>
-              <w:jc w:val="center"/>
-            </w:pPr>
-            <w:r>
-              <w:rPr>
-                <w:b/>
-                <w:sz w:val="20"/>
-              </w:rPr>
-              <w:t>Drop %</w:t>
-            </w:r>
-          </w:p>
-        </w:tc>
-      </w:tr>
-      <w:tr>
-        <w:trPr>
-          <w:jc w:val="center"/>
-        </w:trPr>
-        <w:tc>
-          <w:tcPr>
-            <w:tcW w:w="3135" w:type="dxa"/>
-          </w:tcPr>
-          <w:p>
-            <w:pPr>
-              <w:jc w:val="center"/>
-            </w:pPr>
-            <w:r>
-              <w:rPr>
-                <w:sz w:val="20"/>
-              </w:rPr>
-              <w:t>2</w:t>
-            </w:r>
-          </w:p>
-        </w:tc>
-        <w:tc>
-          <w:tcPr>
-            <w:tcW w:w="3135" w:type="dxa"/>
-          </w:tcPr>
-          <w:p>
-            <w:pPr>
-              <w:jc w:val="center"/>
-            </w:pPr>
-            <w:r>
-              <w:rPr>
-                <w:sz w:val="20"/>
-              </w:rPr>
-              <w:t>117,589</w:t>
-            </w:r>
-          </w:p>
-        </w:tc>
-        <w:tc>
-          <w:tcPr>
-            <w:tcW w:w="3135" w:type="dxa"/>
-          </w:tcPr>
-          <w:p>
-            <w:pPr>
-              <w:jc w:val="center"/>
-            </w:pPr>
-            <w:r>
-              <w:rPr>
-                <w:sz w:val="20"/>
-              </w:rPr>
-              <w:t>—</w:t>
-            </w:r>
-          </w:p>
-        </w:tc>
-      </w:tr>
-      <w:tr>
-        <w:trPr>
-          <w:jc w:val="center"/>
-        </w:trPr>
-        <w:tc>
-          <w:tcPr>
-            <w:tcW w:w="3135" w:type="dxa"/>
-          </w:tcPr>
-          <w:p>
-            <w:pPr>
-              <w:jc w:val="center"/>
-            </w:pPr>
-            <w:r>
-              <w:rPr>
-                <w:sz w:val="20"/>
-              </w:rPr>
-              <w:t>3</w:t>
-            </w:r>
-          </w:p>
-        </w:tc>
-        <w:tc>
-          <w:tcPr>
-            <w:tcW w:w="3135" w:type="dxa"/>
-          </w:tcPr>
-          <w:p>
-            <w:pPr>
-              <w:jc w:val="center"/>
-            </w:pPr>
-            <w:r>
-              <w:rPr>
-                <w:sz w:val="20"/>
-              </w:rPr>
-              <w:t>106,819</w:t>
-            </w:r>
-          </w:p>
-        </w:tc>
-        <w:tc>
-          <w:tcPr>
-            <w:tcW w:w="3135" w:type="dxa"/>
-          </w:tcPr>
-          <w:p>
-            <w:pPr>
-              <w:jc w:val="center"/>
-            </w:pPr>
-            <w:r>
-              <w:rPr>
-                <w:sz w:val="20"/>
-              </w:rPr>
-              <w:t>9.2%</w:t>
-            </w:r>
-          </w:p>
-        </w:tc>
-      </w:tr>
-      <w:tr>
-        <w:trPr>
-          <w:jc w:val="center"/>
-        </w:trPr>
-        <w:tc>
-          <w:tcPr>
-            <w:tcW w:w="3135" w:type="dxa"/>
-          </w:tcPr>
-          <w:p>
-            <w:pPr>
-              <w:jc w:val="center"/>
-            </w:pPr>
-            <w:r>
-              <w:rPr>
-                <w:sz w:val="20"/>
-              </w:rPr>
-              <w:t>4</w:t>
-            </w:r>
-          </w:p>
-        </w:tc>
-        <w:tc>
-          <w:tcPr>
-            <w:tcW w:w="3135" w:type="dxa"/>
-          </w:tcPr>
-          <w:p>
-            <w:pPr>
-              <w:jc w:val="center"/>
-            </w:pPr>
-            <w:r>
-              <w:rPr>
-                <w:sz w:val="20"/>
-              </w:rPr>
-              <w:t>97,005</w:t>
-            </w:r>
-          </w:p>
-        </w:tc>
-        <w:tc>
-          <w:tcPr>
-            <w:tcW w:w="3135" w:type="dxa"/>
-          </w:tcPr>
-          <w:p>
-            <w:pPr>
-              <w:jc w:val="center"/>
-            </w:pPr>
-            <w:r>
-              <w:rPr>
-                <w:sz w:val="20"/>
-              </w:rPr>
-              <w:t>9.2%</w:t>
-            </w:r>
-          </w:p>
-        </w:tc>
-      </w:tr>
-      <w:tr>
-        <w:trPr>
-          <w:jc w:val="center"/>
-        </w:trPr>
-        <w:tc>
-          <w:tcPr>
-            <w:tcW w:w="3135" w:type="dxa"/>
-          </w:tcPr>
-          <w:p>
-            <w:pPr>
-              <w:jc w:val="center"/>
-            </w:pPr>
-            <w:r>
-              <w:rPr>
-                <w:sz w:val="20"/>
-              </w:rPr>
-              <w:t>5</w:t>
-            </w:r>
-          </w:p>
-        </w:tc>
-        <w:tc>
-          <w:tcPr>
-            <w:tcW w:w="3135" w:type="dxa"/>
-          </w:tcPr>
-          <w:p>
-            <w:pPr>
-              <w:jc w:val="center"/>
-            </w:pPr>
-            <w:r>
-              <w:rPr>
-                <w:sz w:val="20"/>
-              </w:rPr>
-              <w:t>89,054</w:t>
-            </w:r>
-          </w:p>
-        </w:tc>
-        <w:tc>
-          <w:tcPr>
-            <w:tcW w:w="3135" w:type="dxa"/>
-          </w:tcPr>
-          <w:p>
-            <w:pPr>
-              <w:jc w:val="center"/>
-            </w:pPr>
-            <w:r>
-              <w:rPr>
-                <w:sz w:val="20"/>
-              </w:rPr>
-              <w:t>8.2%</w:t>
-            </w:r>
-          </w:p>
-        </w:tc>
-      </w:tr>
-      <w:tr>
-        <w:trPr>
-          <w:jc w:val="center"/>
-        </w:trPr>
-        <w:tc>
-          <w:tcPr>
-            <w:tcW w:w="3135" w:type="dxa"/>
-          </w:tcPr>
-          <w:p>
-            <w:pPr>
-              <w:jc w:val="center"/>
-            </w:pPr>
-            <w:r>
-              <w:rPr>
-                <w:sz w:val="20"/>
-              </w:rPr>
-              <w:t>6</w:t>
-            </w:r>
-          </w:p>
-        </w:tc>
-        <w:tc>
-          <w:tcPr>
-            <w:tcW w:w="3135" w:type="dxa"/>
-          </w:tcPr>
-          <w:p>
-            <w:pPr>
-              <w:jc w:val="center"/>
-            </w:pPr>
-            <w:r>
-              <w:rPr>
-                <w:sz w:val="20"/>
-              </w:rPr>
-              <w:t>83,360</w:t>
-            </w:r>
-          </w:p>
-        </w:tc>
-        <w:tc>
-          <w:tcPr>
-            <w:tcW w:w="3135" w:type="dxa"/>
-          </w:tcPr>
-          <w:p>
-            <w:pPr>
-              <w:jc w:val="center"/>
-            </w:pPr>
-            <w:r>
-              <w:rPr>
-                <w:sz w:val="20"/>
-              </w:rPr>
-              <w:t>6.4%</w:t>
-            </w:r>
-          </w:p>
-        </w:tc>
-      </w:tr>
-      <w:tr>
-        <w:trPr>
-          <w:jc w:val="center"/>
-        </w:trPr>
-        <w:tc>
-          <w:tcPr>
-            <w:tcW w:w="3135" w:type="dxa"/>
-          </w:tcPr>
-          <w:p>
-            <w:pPr>
-              <w:jc w:val="center"/>
-            </w:pPr>
-            <w:r>
-              <w:rPr>
-                <w:sz w:val="20"/>
-              </w:rPr>
-              <w:t>8</w:t>
-            </w:r>
-          </w:p>
-        </w:tc>
-        <w:tc>
-          <w:tcPr>
-            <w:tcW w:w="3135" w:type="dxa"/>
-          </w:tcPr>
-          <w:p>
-            <w:pPr>
-              <w:jc w:val="center"/>
-            </w:pPr>
-            <w:r>
-              <w:rPr>
-                <w:sz w:val="20"/>
-              </w:rPr>
-              <w:t>75,361</w:t>
-            </w:r>
-          </w:p>
-        </w:tc>
-        <w:tc>
-          <w:tcPr>
-            <w:tcW w:w="3135" w:type="dxa"/>
-          </w:tcPr>
-          <w:p>
-            <w:pPr>
-              <w:jc w:val="center"/>
-            </w:pPr>
-            <w:r>
-              <w:rPr>
-                <w:sz w:val="20"/>
-              </w:rPr>
-              <w:t>3.8%  ← elbow (drop slows)</w:t>
-            </w:r>
-          </w:p>
-        </w:tc>
-      </w:tr>
-    </w:tbl>
-    <w:p>
-      <w:pPr>
-        <w:spacing w:before="40"/>
-        <w:jc w:val="center"/>
-      </w:pPr>
-      <w:r>
-        <w:rPr>
-          <w:i/>
-          <w:color w:val="646464"/>
-          <w:sz w:val="18"/>
-        </w:rPr>
-        <w:t>Table 8 — K-Means inertia and percentage drop per number of clusters k.</w:t>
+        <w:t>Table 7 — Binary classification GridSearchCV results.</w:t>
       </w:r>
     </w:p>
     <w:p>
@@ -5419,692 +4957,18 @@
         <w:spacing w:after="120"/>
       </w:pPr>
       <w:r>
-        <w:t xml:space="preserve">Given the absence of a sharp elbow, we chose </w:t>
-      </w:r>
-      <w:r>
         <w:rPr>
-          <w:b/>
+          <w:sz w:val="22"/>
         </w:rPr>
-        <w:t>k = 3</w:t>
-      </w:r>
-      <w:r>
-        <w:t xml:space="preserve"> to match the three real outcome classes, enabling meaningful comparison. The resulting cluster sizes are: Cluster 0 (53,130 samples, 53.1%), Cluster 1 (27,068, 27.1%), Cluster 2 (19,802, 19.8%).</w:t>
-      </w:r>
-    </w:p>
-    <w:p/>
-    <w:p>
-      <w:pPr>
-        <w:pStyle w:val="21"/>
-      </w:pPr>
-      <w:bookmarkStart w:id="14" w:name="_Toc225885099"/>
-      <w:r>
-        <w:t>5.3  Cluster Profiles</w:t>
-      </w:r>
-      <w:bookmarkEnd w:id="14"/>
-    </w:p>
-    <w:p>
-      <w:pPr>
-        <w:spacing w:after="120"/>
-      </w:pPr>
-      <w:r>
-        <w:t xml:space="preserve">Table 9 shows the mean feature values per cluster (in original scale). The clusters are mainly differentiated by </w:t>
-      </w:r>
-      <w:r>
-        <w:rPr>
-          <w:b/>
-        </w:rPr>
-        <w:t>revenue_million</w:t>
-      </w:r>
-      <w:r>
-        <w:t xml:space="preserve"> and </w:t>
-      </w:r>
-      <w:r>
-        <w:rPr>
-          <w:b/>
-        </w:rPr>
-        <w:t>product_traction_users</w:t>
-      </w:r>
-      <w:r>
-        <w:t xml:space="preserve"> — the two most informative features identified in EDA. Notably, </w:t>
-      </w:r>
-      <w:r>
-        <w:rPr>
-          <w:b/>
-        </w:rPr>
-        <w:t>market_size_billion</w:t>
-      </w:r>
-      <w:r>
-        <w:t xml:space="preserve">, </w:t>
-      </w:r>
-      <w:r>
-        <w:rPr>
-          <w:b/>
-        </w:rPr>
-        <w:t>burn_rate_million</w:t>
-      </w:r>
-      <w:r>
-        <w:t xml:space="preserve">, and </w:t>
-      </w:r>
-      <w:r>
-        <w:rPr>
-          <w:b/>
-        </w:rPr>
-        <w:t>team_size</w:t>
-      </w:r>
-      <w:r>
-        <w:t xml:space="preserve"> are nearly identical across clusters, confirming they carry no structural information.</w:t>
+        <w:t>Logistic Regression again achieves the best CV accuracy (74.27%). Table 8 shows the classification report on the binary test set.</w:t>
       </w:r>
     </w:p>
     <w:tbl>
       <w:tblPr>
         <w:tblStyle w:val="aff1"/>
-        <w:tblW w:w="0" w:type="auto"/>
+        <w:tblW w:type="auto" w:w="0"/>
         <w:jc w:val="center"/>
-        <w:tblLook w:val="04A0" w:firstRow="1" w:lastRow="0" w:firstColumn="1" w:lastColumn="0" w:noHBand="0" w:noVBand="1"/>
-      </w:tblPr>
-      <w:tblGrid>
-        <w:gridCol w:w="2446"/>
-        <w:gridCol w:w="2351"/>
-        <w:gridCol w:w="2351"/>
-        <w:gridCol w:w="2351"/>
-      </w:tblGrid>
-      <w:tr>
-        <w:trPr>
-          <w:jc w:val="center"/>
-        </w:trPr>
-        <w:tc>
-          <w:tcPr>
-            <w:tcW w:w="2351" w:type="dxa"/>
-          </w:tcPr>
-          <w:p>
-            <w:pPr>
-              <w:jc w:val="center"/>
-            </w:pPr>
-            <w:r>
-              <w:rPr>
-                <w:b/>
-                <w:sz w:val="20"/>
-              </w:rPr>
-              <w:t>Feature</w:t>
-            </w:r>
-          </w:p>
-        </w:tc>
-        <w:tc>
-          <w:tcPr>
-            <w:tcW w:w="2351" w:type="dxa"/>
-          </w:tcPr>
-          <w:p>
-            <w:pPr>
-              <w:jc w:val="center"/>
-            </w:pPr>
-            <w:r>
-              <w:rPr>
-                <w:b/>
-                <w:sz w:val="20"/>
-              </w:rPr>
-              <w:t>Cluster 0</w:t>
-            </w:r>
-          </w:p>
-        </w:tc>
-        <w:tc>
-          <w:tcPr>
-            <w:tcW w:w="2351" w:type="dxa"/>
-          </w:tcPr>
-          <w:p>
-            <w:pPr>
-              <w:jc w:val="center"/>
-            </w:pPr>
-            <w:r>
-              <w:rPr>
-                <w:b/>
-                <w:sz w:val="20"/>
-              </w:rPr>
-              <w:t>Cluster 1</w:t>
-            </w:r>
-          </w:p>
-        </w:tc>
-        <w:tc>
-          <w:tcPr>
-            <w:tcW w:w="2351" w:type="dxa"/>
-          </w:tcPr>
-          <w:p>
-            <w:pPr>
-              <w:jc w:val="center"/>
-            </w:pPr>
-            <w:r>
-              <w:rPr>
-                <w:b/>
-                <w:sz w:val="20"/>
-              </w:rPr>
-              <w:t>Cluster 2</w:t>
-            </w:r>
-          </w:p>
-        </w:tc>
-      </w:tr>
-      <w:tr>
-        <w:trPr>
-          <w:jc w:val="center"/>
-        </w:trPr>
-        <w:tc>
-          <w:tcPr>
-            <w:tcW w:w="2351" w:type="dxa"/>
-          </w:tcPr>
-          <w:p>
-            <w:pPr>
-              <w:jc w:val="center"/>
-            </w:pPr>
-            <w:r>
-              <w:rPr>
-                <w:sz w:val="20"/>
-              </w:rPr>
-              <w:t>revenue_million</w:t>
-            </w:r>
-          </w:p>
-        </w:tc>
-        <w:tc>
-          <w:tcPr>
-            <w:tcW w:w="2351" w:type="dxa"/>
-          </w:tcPr>
-          <w:p>
-            <w:pPr>
-              <w:jc w:val="center"/>
-            </w:pPr>
-            <w:r>
-              <w:rPr>
-                <w:sz w:val="20"/>
-              </w:rPr>
-              <w:t>1,038,320</w:t>
-            </w:r>
-          </w:p>
-        </w:tc>
-        <w:tc>
-          <w:tcPr>
-            <w:tcW w:w="2351" w:type="dxa"/>
-          </w:tcPr>
-          <w:p>
-            <w:pPr>
-              <w:jc w:val="center"/>
-            </w:pPr>
-            <w:r>
-              <w:rPr>
-                <w:sz w:val="20"/>
-              </w:rPr>
-              <w:t>234,260</w:t>
-            </w:r>
-          </w:p>
-        </w:tc>
-        <w:tc>
-          <w:tcPr>
-            <w:tcW w:w="2351" w:type="dxa"/>
-          </w:tcPr>
-          <w:p>
-            <w:pPr>
-              <w:jc w:val="center"/>
-            </w:pPr>
-            <w:r>
-              <w:rPr>
-                <w:sz w:val="20"/>
-              </w:rPr>
-              <w:t>847,137</w:t>
-            </w:r>
-          </w:p>
-        </w:tc>
-      </w:tr>
-      <w:tr>
-        <w:trPr>
-          <w:jc w:val="center"/>
-        </w:trPr>
-        <w:tc>
-          <w:tcPr>
-            <w:tcW w:w="2351" w:type="dxa"/>
-          </w:tcPr>
-          <w:p>
-            <w:pPr>
-              <w:jc w:val="center"/>
-            </w:pPr>
-            <w:r>
-              <w:rPr>
-                <w:sz w:val="20"/>
-              </w:rPr>
-              <w:t>product_traction_users</w:t>
-            </w:r>
-          </w:p>
-        </w:tc>
-        <w:tc>
-          <w:tcPr>
-            <w:tcW w:w="2351" w:type="dxa"/>
-          </w:tcPr>
-          <w:p>
-            <w:pPr>
-              <w:jc w:val="center"/>
-            </w:pPr>
-            <w:r>
-              <w:rPr>
-                <w:sz w:val="20"/>
-              </w:rPr>
-              <w:t>360,632</w:t>
-            </w:r>
-          </w:p>
-        </w:tc>
-        <w:tc>
-          <w:tcPr>
-            <w:tcW w:w="2351" w:type="dxa"/>
-          </w:tcPr>
-          <w:p>
-            <w:pPr>
-              <w:jc w:val="center"/>
-            </w:pPr>
-            <w:r>
-              <w:rPr>
-                <w:sz w:val="20"/>
-              </w:rPr>
-              <w:t>119,455</w:t>
-            </w:r>
-          </w:p>
-        </w:tc>
-        <w:tc>
-          <w:tcPr>
-            <w:tcW w:w="2351" w:type="dxa"/>
-          </w:tcPr>
-          <w:p>
-            <w:pPr>
-              <w:jc w:val="center"/>
-            </w:pPr>
-            <w:r>
-              <w:rPr>
-                <w:sz w:val="20"/>
-              </w:rPr>
-              <w:t>310,499</w:t>
-            </w:r>
-          </w:p>
-        </w:tc>
-      </w:tr>
-      <w:tr>
-        <w:trPr>
-          <w:jc w:val="center"/>
-        </w:trPr>
-        <w:tc>
-          <w:tcPr>
-            <w:tcW w:w="2351" w:type="dxa"/>
-          </w:tcPr>
-          <w:p>
-            <w:pPr>
-              <w:jc w:val="center"/>
-            </w:pPr>
-            <w:r>
-              <w:rPr>
-                <w:sz w:val="20"/>
-              </w:rPr>
-              <w:t>founder_experience_years</w:t>
-            </w:r>
-          </w:p>
-        </w:tc>
-        <w:tc>
-          <w:tcPr>
-            <w:tcW w:w="2351" w:type="dxa"/>
-          </w:tcPr>
-          <w:p>
-            <w:pPr>
-              <w:jc w:val="center"/>
-            </w:pPr>
-            <w:r>
-              <w:rPr>
-                <w:sz w:val="20"/>
-              </w:rPr>
-              <w:t>15.0</w:t>
-            </w:r>
-          </w:p>
-        </w:tc>
-        <w:tc>
-          <w:tcPr>
-            <w:tcW w:w="2351" w:type="dxa"/>
-          </w:tcPr>
-          <w:p>
-            <w:pPr>
-              <w:jc w:val="center"/>
-            </w:pPr>
-            <w:r>
-              <w:rPr>
-                <w:sz w:val="20"/>
-              </w:rPr>
-              <w:t>13.3</w:t>
-            </w:r>
-          </w:p>
-        </w:tc>
-        <w:tc>
-          <w:tcPr>
-            <w:tcW w:w="2351" w:type="dxa"/>
-          </w:tcPr>
-          <w:p>
-            <w:pPr>
-              <w:jc w:val="center"/>
-            </w:pPr>
-            <w:r>
-              <w:rPr>
-                <w:sz w:val="20"/>
-              </w:rPr>
-              <w:t>2.3</w:t>
-            </w:r>
-          </w:p>
-        </w:tc>
-      </w:tr>
-      <w:tr>
-        <w:trPr>
-          <w:jc w:val="center"/>
-        </w:trPr>
-        <w:tc>
-          <w:tcPr>
-            <w:tcW w:w="2351" w:type="dxa"/>
-          </w:tcPr>
-          <w:p>
-            <w:pPr>
-              <w:jc w:val="center"/>
-            </w:pPr>
-            <w:r>
-              <w:rPr>
-                <w:sz w:val="20"/>
-              </w:rPr>
-              <w:t>funding_rounds</w:t>
-            </w:r>
-          </w:p>
-        </w:tc>
-        <w:tc>
-          <w:tcPr>
-            <w:tcW w:w="2351" w:type="dxa"/>
-          </w:tcPr>
-          <w:p>
-            <w:pPr>
-              <w:jc w:val="center"/>
-            </w:pPr>
-            <w:r>
-              <w:rPr>
-                <w:sz w:val="20"/>
-              </w:rPr>
-              <w:t>2.0</w:t>
-            </w:r>
-          </w:p>
-        </w:tc>
-        <w:tc>
-          <w:tcPr>
-            <w:tcW w:w="2351" w:type="dxa"/>
-          </w:tcPr>
-          <w:p>
-            <w:pPr>
-              <w:jc w:val="center"/>
-            </w:pPr>
-            <w:r>
-              <w:rPr>
-                <w:sz w:val="20"/>
-              </w:rPr>
-              <w:t>2.0</w:t>
-            </w:r>
-          </w:p>
-        </w:tc>
-        <w:tc>
-          <w:tcPr>
-            <w:tcW w:w="2351" w:type="dxa"/>
-          </w:tcPr>
-          <w:p>
-            <w:pPr>
-              <w:jc w:val="center"/>
-            </w:pPr>
-            <w:r>
-              <w:rPr>
-                <w:sz w:val="20"/>
-              </w:rPr>
-              <w:t>2.0</w:t>
-            </w:r>
-          </w:p>
-        </w:tc>
-      </w:tr>
-      <w:tr>
-        <w:trPr>
-          <w:jc w:val="center"/>
-        </w:trPr>
-        <w:tc>
-          <w:tcPr>
-            <w:tcW w:w="2351" w:type="dxa"/>
-          </w:tcPr>
-          <w:p>
-            <w:pPr>
-              <w:jc w:val="center"/>
-            </w:pPr>
-            <w:r>
-              <w:rPr>
-                <w:sz w:val="20"/>
-              </w:rPr>
-              <w:t>team_size</w:t>
-            </w:r>
-          </w:p>
-        </w:tc>
-        <w:tc>
-          <w:tcPr>
-            <w:tcW w:w="2351" w:type="dxa"/>
-          </w:tcPr>
-          <w:p>
-            <w:pPr>
-              <w:jc w:val="center"/>
-            </w:pPr>
-            <w:r>
-              <w:rPr>
-                <w:sz w:val="20"/>
-              </w:rPr>
-              <w:t>150.6</w:t>
-            </w:r>
-          </w:p>
-        </w:tc>
-        <w:tc>
-          <w:tcPr>
-            <w:tcW w:w="2351" w:type="dxa"/>
-          </w:tcPr>
-          <w:p>
-            <w:pPr>
-              <w:jc w:val="center"/>
-            </w:pPr>
-            <w:r>
-              <w:rPr>
-                <w:sz w:val="20"/>
-              </w:rPr>
-              <w:t>150.6</w:t>
-            </w:r>
-          </w:p>
-        </w:tc>
-        <w:tc>
-          <w:tcPr>
-            <w:tcW w:w="2351" w:type="dxa"/>
-          </w:tcPr>
-          <w:p>
-            <w:pPr>
-              <w:jc w:val="center"/>
-            </w:pPr>
-            <w:r>
-              <w:rPr>
-                <w:sz w:val="20"/>
-              </w:rPr>
-              <w:t>151.4</w:t>
-            </w:r>
-          </w:p>
-        </w:tc>
-      </w:tr>
-      <w:tr>
-        <w:trPr>
-          <w:jc w:val="center"/>
-        </w:trPr>
-        <w:tc>
-          <w:tcPr>
-            <w:tcW w:w="2351" w:type="dxa"/>
-          </w:tcPr>
-          <w:p>
-            <w:pPr>
-              <w:jc w:val="center"/>
-            </w:pPr>
-            <w:r>
-              <w:rPr>
-                <w:sz w:val="20"/>
-              </w:rPr>
-              <w:t>market_size_billion</w:t>
-            </w:r>
-          </w:p>
-        </w:tc>
-        <w:tc>
-          <w:tcPr>
-            <w:tcW w:w="2351" w:type="dxa"/>
-          </w:tcPr>
-          <w:p>
-            <w:pPr>
-              <w:jc w:val="center"/>
-            </w:pPr>
-            <w:r>
-              <w:rPr>
-                <w:sz w:val="20"/>
-              </w:rPr>
-              <w:t>33.2</w:t>
-            </w:r>
-          </w:p>
-        </w:tc>
-        <w:tc>
-          <w:tcPr>
-            <w:tcW w:w="2351" w:type="dxa"/>
-          </w:tcPr>
-          <w:p>
-            <w:pPr>
-              <w:jc w:val="center"/>
-            </w:pPr>
-            <w:r>
-              <w:rPr>
-                <w:sz w:val="20"/>
-              </w:rPr>
-              <w:t>33.1</w:t>
-            </w:r>
-          </w:p>
-        </w:tc>
-        <w:tc>
-          <w:tcPr>
-            <w:tcW w:w="2351" w:type="dxa"/>
-          </w:tcPr>
-          <w:p>
-            <w:pPr>
-              <w:jc w:val="center"/>
-            </w:pPr>
-            <w:r>
-              <w:rPr>
-                <w:sz w:val="20"/>
-              </w:rPr>
-              <w:t>33.3</w:t>
-            </w:r>
-          </w:p>
-        </w:tc>
-      </w:tr>
-      <w:tr>
-        <w:trPr>
-          <w:jc w:val="center"/>
-        </w:trPr>
-        <w:tc>
-          <w:tcPr>
-            <w:tcW w:w="2351" w:type="dxa"/>
-          </w:tcPr>
-          <w:p>
-            <w:pPr>
-              <w:jc w:val="center"/>
-            </w:pPr>
-            <w:r>
-              <w:rPr>
-                <w:sz w:val="20"/>
-              </w:rPr>
-              <w:t>burn_rate_million</w:t>
-            </w:r>
-          </w:p>
-        </w:tc>
-        <w:tc>
-          <w:tcPr>
-            <w:tcW w:w="2351" w:type="dxa"/>
-          </w:tcPr>
-          <w:p>
-            <w:pPr>
-              <w:jc w:val="center"/>
-            </w:pPr>
-            <w:r>
-              <w:rPr>
-                <w:sz w:val="20"/>
-              </w:rPr>
-              <w:t>16.8</w:t>
-            </w:r>
-          </w:p>
-        </w:tc>
-        <w:tc>
-          <w:tcPr>
-            <w:tcW w:w="2351" w:type="dxa"/>
-          </w:tcPr>
-          <w:p>
-            <w:pPr>
-              <w:jc w:val="center"/>
-            </w:pPr>
-            <w:r>
-              <w:rPr>
-                <w:sz w:val="20"/>
-              </w:rPr>
-              <w:t>16.9</w:t>
-            </w:r>
-          </w:p>
-        </w:tc>
-        <w:tc>
-          <w:tcPr>
-            <w:tcW w:w="2351" w:type="dxa"/>
-          </w:tcPr>
-          <w:p>
-            <w:pPr>
-              <w:jc w:val="center"/>
-            </w:pPr>
-            <w:r>
-              <w:rPr>
-                <w:sz w:val="20"/>
-              </w:rPr>
-              <w:t>16.7</w:t>
-            </w:r>
-          </w:p>
-        </w:tc>
-      </w:tr>
-    </w:tbl>
-    <w:p>
-      <w:pPr>
-        <w:spacing w:before="40"/>
-        <w:jc w:val="center"/>
-      </w:pPr>
-      <w:r>
-        <w:rPr>
-          <w:i/>
-          <w:color w:val="646464"/>
-          <w:sz w:val="18"/>
-        </w:rPr>
-        <w:t>Table 9 — Mean feature values per K-Means cluster (original scale).</w:t>
-      </w:r>
-    </w:p>
-    <w:p/>
-    <w:p>
-      <w:pPr>
-        <w:pStyle w:val="21"/>
-      </w:pPr>
-      <w:bookmarkStart w:id="15" w:name="_Toc225885100"/>
-      <w:r>
-        <w:lastRenderedPageBreak/>
-        <w:t>5.4  Clusters vs. Outcomes</w:t>
-      </w:r>
-      <w:bookmarkEnd w:id="15"/>
-    </w:p>
-    <w:p>
-      <w:pPr>
-        <w:spacing w:after="120"/>
-      </w:pPr>
-      <w:r>
-        <w:t>Table 10 shows the outcome distribution within each cluster. The correspondence between unsupervised clusters and known outcomes is partial but interpretable:</w:t>
-      </w:r>
-    </w:p>
-    <w:tbl>
-      <w:tblPr>
-        <w:tblStyle w:val="aff1"/>
-        <w:tblW w:w="0" w:type="auto"/>
-        <w:jc w:val="center"/>
-        <w:tblLook w:val="04A0" w:firstRow="1" w:lastRow="0" w:firstColumn="1" w:lastColumn="0" w:noHBand="0" w:noVBand="1"/>
+        <w:tblLook w:firstColumn="1" w:firstRow="1" w:lastColumn="0" w:lastRow="0" w:noHBand="0" w:noVBand="1" w:val="04A0"/>
       </w:tblPr>
       <w:tblGrid>
         <w:gridCol w:w="1881"/>
@@ -6114,12 +4978,9 @@
         <w:gridCol w:w="1881"/>
       </w:tblGrid>
       <w:tr>
-        <w:trPr>
-          <w:jc w:val="center"/>
-        </w:trPr>
-        <w:tc>
-          <w:tcPr>
-            <w:tcW w:w="1881" w:type="dxa"/>
+        <w:tc>
+          <w:tcPr>
+            <w:tcW w:type="dxa" w:w="1881"/>
           </w:tcPr>
           <w:p>
             <w:pPr>
@@ -6130,13 +4991,13 @@
                 <w:b/>
                 <w:sz w:val="20"/>
               </w:rPr>
-              <w:t>Cluster</w:t>
-            </w:r>
-          </w:p>
-        </w:tc>
-        <w:tc>
-          <w:tcPr>
-            <w:tcW w:w="1881" w:type="dxa"/>
+              <w:t>Class</w:t>
+            </w:r>
+          </w:p>
+        </w:tc>
+        <w:tc>
+          <w:tcPr>
+            <w:tcW w:type="dxa" w:w="1881"/>
           </w:tcPr>
           <w:p>
             <w:pPr>
@@ -6147,13 +5008,13 @@
                 <w:b/>
                 <w:sz w:val="20"/>
               </w:rPr>
-              <w:t>Acquisition %</w:t>
-            </w:r>
-          </w:p>
-        </w:tc>
-        <w:tc>
-          <w:tcPr>
-            <w:tcW w:w="1881" w:type="dxa"/>
+              <w:t>Precision</w:t>
+            </w:r>
+          </w:p>
+        </w:tc>
+        <w:tc>
+          <w:tcPr>
+            <w:tcW w:type="dxa" w:w="1881"/>
           </w:tcPr>
           <w:p>
             <w:pPr>
@@ -6164,13 +5025,13 @@
                 <w:b/>
                 <w:sz w:val="20"/>
               </w:rPr>
-              <w:t>Failure %</w:t>
-            </w:r>
-          </w:p>
-        </w:tc>
-        <w:tc>
-          <w:tcPr>
-            <w:tcW w:w="1881" w:type="dxa"/>
+              <w:t>Recall</w:t>
+            </w:r>
+          </w:p>
+        </w:tc>
+        <w:tc>
+          <w:tcPr>
+            <w:tcW w:type="dxa" w:w="1881"/>
           </w:tcPr>
           <w:p>
             <w:pPr>
@@ -6181,13 +5042,13 @@
                 <w:b/>
                 <w:sz w:val="20"/>
               </w:rPr>
-              <w:t>IPO %</w:t>
-            </w:r>
-          </w:p>
-        </w:tc>
-        <w:tc>
-          <w:tcPr>
-            <w:tcW w:w="1881" w:type="dxa"/>
+              <w:t>F1-score</w:t>
+            </w:r>
+          </w:p>
+        </w:tc>
+        <w:tc>
+          <w:tcPr>
+            <w:tcW w:type="dxa" w:w="1881"/>
           </w:tcPr>
           <w:p>
             <w:pPr>
@@ -6198,262 +5059,335 @@
                 <w:b/>
                 <w:sz w:val="20"/>
               </w:rPr>
-              <w:t>Dominant profile</w:t>
+              <w:t>Support</w:t>
             </w:r>
           </w:p>
         </w:tc>
       </w:tr>
       <w:tr>
-        <w:trPr>
-          <w:jc w:val="center"/>
-        </w:trPr>
-        <w:tc>
-          <w:tcPr>
-            <w:tcW w:w="1881" w:type="dxa"/>
-          </w:tcPr>
-          <w:p>
-            <w:pPr>
-              <w:jc w:val="center"/>
-            </w:pPr>
-            <w:r>
-              <w:rPr>
-                <w:sz w:val="20"/>
-              </w:rPr>
-              <w:t>Cluster 0 (53.1%)</w:t>
-            </w:r>
-          </w:p>
-        </w:tc>
-        <w:tc>
-          <w:tcPr>
-            <w:tcW w:w="1881" w:type="dxa"/>
-          </w:tcPr>
-          <w:p>
-            <w:pPr>
-              <w:jc w:val="center"/>
-            </w:pPr>
-            <w:r>
-              <w:rPr>
-                <w:sz w:val="20"/>
-              </w:rPr>
-              <w:t>56.96%</w:t>
-            </w:r>
-          </w:p>
-        </w:tc>
-        <w:tc>
-          <w:tcPr>
-            <w:tcW w:w="1881" w:type="dxa"/>
-          </w:tcPr>
-          <w:p>
-            <w:pPr>
-              <w:jc w:val="center"/>
-            </w:pPr>
-            <w:r>
-              <w:rPr>
-                <w:sz w:val="20"/>
-              </w:rPr>
-              <w:t>39.52%</w:t>
-            </w:r>
-          </w:p>
-        </w:tc>
-        <w:tc>
-          <w:tcPr>
-            <w:tcW w:w="1881" w:type="dxa"/>
-          </w:tcPr>
-          <w:p>
-            <w:pPr>
-              <w:jc w:val="center"/>
-            </w:pPr>
-            <w:r>
-              <w:rPr>
-                <w:sz w:val="20"/>
-              </w:rPr>
-              <w:t>3.52%</w:t>
-            </w:r>
-          </w:p>
-        </w:tc>
-        <w:tc>
-          <w:tcPr>
-            <w:tcW w:w="1881" w:type="dxa"/>
-          </w:tcPr>
-          <w:p>
-            <w:pPr>
-              <w:jc w:val="center"/>
-            </w:pPr>
-            <w:r>
-              <w:rPr>
-                <w:sz w:val="20"/>
-              </w:rPr>
-              <w:t>High revenue + high traction → most successful</w:t>
+        <w:tc>
+          <w:tcPr>
+            <w:tcW w:type="dxa" w:w="1881"/>
+          </w:tcPr>
+          <w:p>
+            <w:pPr>
+              <w:jc w:val="center"/>
+            </w:pPr>
+            <w:r>
+              <w:rPr>
+                <w:sz w:val="20"/>
+              </w:rPr>
+              <w:t>Acquisition</w:t>
+            </w:r>
+          </w:p>
+        </w:tc>
+        <w:tc>
+          <w:tcPr>
+            <w:tcW w:type="dxa" w:w="1881"/>
+          </w:tcPr>
+          <w:p>
+            <w:pPr>
+              <w:jc w:val="center"/>
+            </w:pPr>
+            <w:r>
+              <w:rPr>
+                <w:sz w:val="20"/>
+              </w:rPr>
+              <w:t>0.7074</w:t>
+            </w:r>
+          </w:p>
+        </w:tc>
+        <w:tc>
+          <w:tcPr>
+            <w:tcW w:type="dxa" w:w="1881"/>
+          </w:tcPr>
+          <w:p>
+            <w:pPr>
+              <w:jc w:val="center"/>
+            </w:pPr>
+            <w:r>
+              <w:rPr>
+                <w:sz w:val="20"/>
+              </w:rPr>
+              <w:t>0.6888</w:t>
+            </w:r>
+          </w:p>
+        </w:tc>
+        <w:tc>
+          <w:tcPr>
+            <w:tcW w:type="dxa" w:w="1881"/>
+          </w:tcPr>
+          <w:p>
+            <w:pPr>
+              <w:jc w:val="center"/>
+            </w:pPr>
+            <w:r>
+              <w:rPr>
+                <w:sz w:val="20"/>
+              </w:rPr>
+              <w:t>0.6980</w:t>
+            </w:r>
+          </w:p>
+        </w:tc>
+        <w:tc>
+          <w:tcPr>
+            <w:tcW w:type="dxa" w:w="1881"/>
+          </w:tcPr>
+          <w:p>
+            <w:pPr>
+              <w:jc w:val="center"/>
+            </w:pPr>
+            <w:r>
+              <w:rPr>
+                <w:sz w:val="20"/>
+              </w:rPr>
+              <w:t>8,467</w:t>
             </w:r>
           </w:p>
         </w:tc>
       </w:tr>
       <w:tr>
-        <w:trPr>
-          <w:jc w:val="center"/>
-        </w:trPr>
-        <w:tc>
-          <w:tcPr>
-            <w:tcW w:w="1881" w:type="dxa"/>
-          </w:tcPr>
-          <w:p>
-            <w:pPr>
-              <w:jc w:val="center"/>
-            </w:pPr>
-            <w:r>
-              <w:rPr>
-                <w:sz w:val="20"/>
-              </w:rPr>
-              <w:t>Cluster 1 (27.1%)</w:t>
-            </w:r>
-          </w:p>
-        </w:tc>
-        <w:tc>
-          <w:tcPr>
-            <w:tcW w:w="1881" w:type="dxa"/>
-          </w:tcPr>
-          <w:p>
-            <w:pPr>
-              <w:jc w:val="center"/>
-            </w:pPr>
-            <w:r>
-              <w:rPr>
-                <w:sz w:val="20"/>
-              </w:rPr>
-              <w:t>20.36%</w:t>
-            </w:r>
-          </w:p>
-        </w:tc>
-        <w:tc>
-          <w:tcPr>
-            <w:tcW w:w="1881" w:type="dxa"/>
-          </w:tcPr>
-          <w:p>
-            <w:pPr>
-              <w:jc w:val="center"/>
-            </w:pPr>
-            <w:r>
-              <w:rPr>
-                <w:sz w:val="20"/>
-              </w:rPr>
-              <w:t>79.59%</w:t>
-            </w:r>
-          </w:p>
-        </w:tc>
-        <w:tc>
-          <w:tcPr>
-            <w:tcW w:w="1881" w:type="dxa"/>
-          </w:tcPr>
-          <w:p>
-            <w:pPr>
-              <w:jc w:val="center"/>
-            </w:pPr>
-            <w:r>
-              <w:rPr>
-                <w:sz w:val="20"/>
-              </w:rPr>
-              <w:t>0.04%</w:t>
-            </w:r>
-          </w:p>
-        </w:tc>
-        <w:tc>
-          <w:tcPr>
-            <w:tcW w:w="1881" w:type="dxa"/>
-          </w:tcPr>
-          <w:p>
-            <w:pPr>
-              <w:jc w:val="center"/>
-            </w:pPr>
-            <w:r>
-              <w:rPr>
-                <w:sz w:val="20"/>
-              </w:rPr>
-              <w:t>Low revenue + low traction  → mostly failures</w:t>
+        <w:tc>
+          <w:tcPr>
+            <w:tcW w:type="dxa" w:w="1881"/>
+          </w:tcPr>
+          <w:p>
+            <w:pPr>
+              <w:jc w:val="center"/>
+            </w:pPr>
+            <w:r>
+              <w:rPr>
+                <w:sz w:val="20"/>
+              </w:rPr>
+              <w:t>Failure</w:t>
+            </w:r>
+          </w:p>
+        </w:tc>
+        <w:tc>
+          <w:tcPr>
+            <w:tcW w:type="dxa" w:w="1881"/>
+          </w:tcPr>
+          <w:p>
+            <w:pPr>
+              <w:jc w:val="center"/>
+            </w:pPr>
+            <w:r>
+              <w:rPr>
+                <w:sz w:val="20"/>
+              </w:rPr>
+              <w:t>0.7677</w:t>
+            </w:r>
+          </w:p>
+        </w:tc>
+        <w:tc>
+          <w:tcPr>
+            <w:tcW w:type="dxa" w:w="1881"/>
+          </w:tcPr>
+          <w:p>
+            <w:pPr>
+              <w:jc w:val="center"/>
+            </w:pPr>
+            <w:r>
+              <w:rPr>
+                <w:sz w:val="20"/>
+              </w:rPr>
+              <w:t>0.7831</w:t>
+            </w:r>
+          </w:p>
+        </w:tc>
+        <w:tc>
+          <w:tcPr>
+            <w:tcW w:type="dxa" w:w="1881"/>
+          </w:tcPr>
+          <w:p>
+            <w:pPr>
+              <w:jc w:val="center"/>
+            </w:pPr>
+            <w:r>
+              <w:rPr>
+                <w:sz w:val="20"/>
+              </w:rPr>
+              <w:t>0.7754</w:t>
+            </w:r>
+          </w:p>
+        </w:tc>
+        <w:tc>
+          <w:tcPr>
+            <w:tcW w:type="dxa" w:w="1881"/>
+          </w:tcPr>
+          <w:p>
+            <w:pPr>
+              <w:jc w:val="center"/>
+            </w:pPr>
+            <w:r>
+              <w:rPr>
+                <w:sz w:val="20"/>
+              </w:rPr>
+              <w:t>11,122</w:t>
             </w:r>
           </w:p>
         </w:tc>
       </w:tr>
       <w:tr>
-        <w:trPr>
-          <w:jc w:val="center"/>
-        </w:trPr>
-        <w:tc>
-          <w:tcPr>
-            <w:tcW w:w="1881" w:type="dxa"/>
-          </w:tcPr>
-          <w:p>
-            <w:pPr>
-              <w:jc w:val="center"/>
-            </w:pPr>
-            <w:r>
-              <w:rPr>
-                <w:sz w:val="20"/>
-              </w:rPr>
-              <w:t>Cluster 2 (19.8%)</w:t>
-            </w:r>
-          </w:p>
-        </w:tc>
-        <w:tc>
-          <w:tcPr>
-            <w:tcW w:w="1881" w:type="dxa"/>
-          </w:tcPr>
-          <w:p>
-            <w:pPr>
-              <w:jc w:val="center"/>
-            </w:pPr>
-            <w:r>
-              <w:rPr>
-                <w:sz w:val="20"/>
-              </w:rPr>
-              <w:t>33.14%</w:t>
-            </w:r>
-          </w:p>
-        </w:tc>
-        <w:tc>
-          <w:tcPr>
-            <w:tcW w:w="1881" w:type="dxa"/>
-          </w:tcPr>
-          <w:p>
-            <w:pPr>
-              <w:jc w:val="center"/>
-            </w:pPr>
-            <w:r>
-              <w:rPr>
-                <w:sz w:val="20"/>
-              </w:rPr>
-              <w:t>65.99%</w:t>
-            </w:r>
-          </w:p>
-        </w:tc>
-        <w:tc>
-          <w:tcPr>
-            <w:tcW w:w="1881" w:type="dxa"/>
-          </w:tcPr>
-          <w:p>
-            <w:pPr>
-              <w:jc w:val="center"/>
-            </w:pPr>
-            <w:r>
-              <w:rPr>
-                <w:sz w:val="20"/>
-              </w:rPr>
-              <w:t>0.86%</w:t>
-            </w:r>
-          </w:p>
-        </w:tc>
-        <w:tc>
-          <w:tcPr>
-            <w:tcW w:w="1881" w:type="dxa"/>
-          </w:tcPr>
-          <w:p>
-            <w:pPr>
-              <w:jc w:val="center"/>
-            </w:pPr>
-            <w:r>
-              <w:rPr>
-                <w:sz w:val="20"/>
-              </w:rPr>
-              <w:t>Young founders (exp ≈ 2 yrs) → mixed</w:t>
+        <w:tc>
+          <w:tcPr>
+            <w:tcW w:type="dxa" w:w="1881"/>
+          </w:tcPr>
+          <w:p>
+            <w:pPr>
+              <w:jc w:val="center"/>
+            </w:pPr>
+            <w:r>
+              <w:rPr>
+                <w:sz w:val="20"/>
+              </w:rPr>
+              <w:t>Accuracy</w:t>
+            </w:r>
+          </w:p>
+        </w:tc>
+        <w:tc>
+          <w:tcPr>
+            <w:tcW w:type="dxa" w:w="1881"/>
+          </w:tcPr>
+          <w:p>
+            <w:pPr>
+              <w:jc w:val="center"/>
+            </w:pPr>
+            <w:r>
+              <w:rPr>
+                <w:sz w:val="20"/>
+              </w:rPr>
+              <w:t>—</w:t>
+            </w:r>
+          </w:p>
+        </w:tc>
+        <w:tc>
+          <w:tcPr>
+            <w:tcW w:type="dxa" w:w="1881"/>
+          </w:tcPr>
+          <w:p>
+            <w:pPr>
+              <w:jc w:val="center"/>
+            </w:pPr>
+            <w:r>
+              <w:rPr>
+                <w:sz w:val="20"/>
+              </w:rPr>
+              <w:t>—</w:t>
+            </w:r>
+          </w:p>
+        </w:tc>
+        <w:tc>
+          <w:tcPr>
+            <w:tcW w:type="dxa" w:w="1881"/>
+          </w:tcPr>
+          <w:p>
+            <w:pPr>
+              <w:jc w:val="center"/>
+            </w:pPr>
+            <w:r>
+              <w:rPr>
+                <w:sz w:val="20"/>
+              </w:rPr>
+              <w:t>0.7424</w:t>
+            </w:r>
+          </w:p>
+        </w:tc>
+        <w:tc>
+          <w:tcPr>
+            <w:tcW w:type="dxa" w:w="1881"/>
+          </w:tcPr>
+          <w:p>
+            <w:pPr>
+              <w:jc w:val="center"/>
+            </w:pPr>
+            <w:r>
+              <w:rPr>
+                <w:sz w:val="20"/>
+              </w:rPr>
+              <w:t>19,589</w:t>
+            </w:r>
+          </w:p>
+        </w:tc>
+      </w:tr>
+      <w:tr>
+        <w:tc>
+          <w:tcPr>
+            <w:tcW w:type="dxa" w:w="1881"/>
+          </w:tcPr>
+          <w:p>
+            <w:pPr>
+              <w:jc w:val="center"/>
+            </w:pPr>
+            <w:r>
+              <w:rPr>
+                <w:sz w:val="20"/>
+              </w:rPr>
+              <w:t>Macro avg</w:t>
+            </w:r>
+          </w:p>
+        </w:tc>
+        <w:tc>
+          <w:tcPr>
+            <w:tcW w:type="dxa" w:w="1881"/>
+          </w:tcPr>
+          <w:p>
+            <w:pPr>
+              <w:jc w:val="center"/>
+            </w:pPr>
+            <w:r>
+              <w:rPr>
+                <w:sz w:val="20"/>
+              </w:rPr>
+              <w:t>0.7376</w:t>
+            </w:r>
+          </w:p>
+        </w:tc>
+        <w:tc>
+          <w:tcPr>
+            <w:tcW w:type="dxa" w:w="1881"/>
+          </w:tcPr>
+          <w:p>
+            <w:pPr>
+              <w:jc w:val="center"/>
+            </w:pPr>
+            <w:r>
+              <w:rPr>
+                <w:sz w:val="20"/>
+              </w:rPr>
+              <w:t>0.7360</w:t>
+            </w:r>
+          </w:p>
+        </w:tc>
+        <w:tc>
+          <w:tcPr>
+            <w:tcW w:type="dxa" w:w="1881"/>
+          </w:tcPr>
+          <w:p>
+            <w:pPr>
+              <w:jc w:val="center"/>
+            </w:pPr>
+            <w:r>
+              <w:rPr>
+                <w:sz w:val="20"/>
+              </w:rPr>
+              <w:t>0.7367</w:t>
+            </w:r>
+          </w:p>
+        </w:tc>
+        <w:tc>
+          <w:tcPr>
+            <w:tcW w:type="dxa" w:w="1881"/>
+          </w:tcPr>
+          <w:p>
+            <w:pPr>
+              <w:jc w:val="center"/>
+            </w:pPr>
+            <w:r>
+              <w:rPr>
+                <w:sz w:val="20"/>
+              </w:rPr>
+              <w:t>19,589</w:t>
             </w:r>
           </w:p>
         </w:tc>
@@ -6461,7 +5395,7 @@
     </w:tbl>
     <w:p>
       <w:pPr>
-        <w:spacing w:before="40"/>
+        <w:spacing w:before="40" w:after="200"/>
         <w:jc w:val="center"/>
       </w:pPr>
       <w:r>
@@ -6470,7 +5404,7 @@
           <w:color w:val="646464"/>
           <w:sz w:val="18"/>
         </w:rPr>
-        <w:t>Table 10 — Outcome distribution per K-Means cluster (row percentages).</w:t>
+        <w:t>Table 8 — Classification report for binary Logistic Regression.</w:t>
       </w:r>
     </w:p>
     <w:p>
@@ -6478,7 +5412,30 @@
         <w:spacing w:after="120"/>
       </w:pPr>
       <w:r>
-        <w:t>Cluster 0 aligns well with successful outcomes (56.96% Acquisition + 3.52% IPO), while Cluster 1 is strongly associated with Failure (79.59%). Cluster 2 captures startups with very young founders (mean experience = 2.3 years), which correlates with higher failure rates. The near-absence of IPOs in Cluster 1 (only 0.04% = 12 samples) and Cluster 2 (0.86%) underlines the extreme rarity of this outcome.</w:t>
+        <w:rPr>
+          <w:sz w:val="22"/>
+        </w:rPr>
+        <w:t>Removing IPO raises the macro F1 from 0.584 to 0.737, confirming that class imbalance was the primary bottleneck in the 3-class setting. The ROC curve yields AUC = 0.816, indicating good discriminative power between Failure and Acquisition.</w:t>
+      </w:r>
+    </w:p>
+    <w:p/>
+    <w:p>
+      <w:pPr>
+        <w:pStyle w:val="1"/>
+      </w:pPr>
+      <w:r>
+        <w:t>5  Unsupervised Learning</w:t>
+      </w:r>
+    </w:p>
+    <w:p>
+      <w:pPr>
+        <w:spacing w:after="120"/>
+      </w:pPr>
+      <w:r>
+        <w:rPr>
+          <w:sz w:val="22"/>
+        </w:rPr>
+        <w:t>In Part 2, we apply unsupervised methods to the full dataset (100,000 samples) to discover latent groupings without using outcome labels.</w:t>
       </w:r>
     </w:p>
     <w:p/>
@@ -6486,18 +5443,8 @@
       <w:pPr>
         <w:pStyle w:val="21"/>
       </w:pPr>
-      <w:bookmarkStart w:id="16" w:name="_Toc225885101"/>
       <w:r>
-        <w:t>5.5  Hierarchical Clustering</w:t>
-      </w:r>
-      <w:bookmarkEnd w:id="16"/>
-    </w:p>
-    <w:p>
-      <w:pPr>
-        <w:spacing w:after="120"/>
-      </w:pPr>
-      <w:r>
-        <w:t>We applied Agglomerative Clustering with Ward linkage on a 2,000-row subsample (computational constraint). The dendrogram (Figure 5 in the notebook) was reconstructed from the sklearn model using the TD06 method (linkage matrix from children_ and distances_). With k = 3 clusters, the hierarchical solution produces a more imbalanced partition (Cluster 0: 78.0%, Cluster 1: 14.6%, Cluster 2: 7.4%), compared to K-Means.</w:t>
+        <w:t>5.1  PCA — Variance Analysis</w:t>
       </w:r>
     </w:p>
     <w:p>
@@ -6505,7 +5452,1727 @@
         <w:spacing w:after="120"/>
       </w:pPr>
       <w:r>
-        <w:t>The 3-way PCA comparison plot (Figure 6) shows that K-Means and Hierarchical clustering find broadly similar large-scale structure in PC space, but differ in how they split the minority groups. Both methods confirm the same fundamental finding: clusters are primarily driven by revenue and traction, not by the noise features.</w:t>
+        <w:rPr>
+          <w:sz w:val="22"/>
+        </w:rPr>
+        <w:t>We applied PCA to the scaled numerical features (7 dimensions). The first two components capture only 39.65% of total variance (PC1: 25.23%, PC2: 14.42%). This low cumulative explained variance is consistent with the near-independence of features in the synthetic dataset.</w:t>
+      </w:r>
+    </w:p>
+    <w:tbl>
+      <w:tblPr>
+        <w:tblStyle w:val="aff1"/>
+        <w:tblW w:type="auto" w:w="0"/>
+        <w:jc w:val="center"/>
+        <w:tblLook w:firstColumn="1" w:firstRow="1" w:lastColumn="0" w:lastRow="0" w:noHBand="0" w:noVBand="1" w:val="04A0"/>
+      </w:tblPr>
+      <w:tblGrid>
+        <w:gridCol w:w="3135"/>
+        <w:gridCol w:w="3135"/>
+        <w:gridCol w:w="3135"/>
+      </w:tblGrid>
+      <w:tr>
+        <w:tc>
+          <w:tcPr>
+            <w:tcW w:type="dxa" w:w="3135"/>
+          </w:tcPr>
+          <w:p>
+            <w:pPr>
+              <w:jc w:val="center"/>
+            </w:pPr>
+            <w:r>
+              <w:rPr>
+                <w:b/>
+                <w:sz w:val="20"/>
+              </w:rPr>
+              <w:t>Component</w:t>
+            </w:r>
+          </w:p>
+        </w:tc>
+        <w:tc>
+          <w:tcPr>
+            <w:tcW w:type="dxa" w:w="3135"/>
+          </w:tcPr>
+          <w:p>
+            <w:pPr>
+              <w:jc w:val="center"/>
+            </w:pPr>
+            <w:r>
+              <w:rPr>
+                <w:b/>
+                <w:sz w:val="20"/>
+              </w:rPr>
+              <w:t>Explained Variance</w:t>
+            </w:r>
+          </w:p>
+        </w:tc>
+        <w:tc>
+          <w:tcPr>
+            <w:tcW w:type="dxa" w:w="3135"/>
+          </w:tcPr>
+          <w:p>
+            <w:pPr>
+              <w:jc w:val="center"/>
+            </w:pPr>
+            <w:r>
+              <w:rPr>
+                <w:b/>
+                <w:sz w:val="20"/>
+              </w:rPr>
+              <w:t>Cumulative</w:t>
+            </w:r>
+          </w:p>
+        </w:tc>
+      </w:tr>
+      <w:tr>
+        <w:tc>
+          <w:tcPr>
+            <w:tcW w:type="dxa" w:w="3135"/>
+          </w:tcPr>
+          <w:p>
+            <w:pPr>
+              <w:jc w:val="center"/>
+            </w:pPr>
+            <w:r>
+              <w:rPr>
+                <w:sz w:val="20"/>
+              </w:rPr>
+              <w:t>PC1</w:t>
+            </w:r>
+          </w:p>
+        </w:tc>
+        <w:tc>
+          <w:tcPr>
+            <w:tcW w:type="dxa" w:w="3135"/>
+          </w:tcPr>
+          <w:p>
+            <w:pPr>
+              <w:jc w:val="center"/>
+            </w:pPr>
+            <w:r>
+              <w:rPr>
+                <w:sz w:val="20"/>
+              </w:rPr>
+              <w:t>25.23%</w:t>
+            </w:r>
+          </w:p>
+        </w:tc>
+        <w:tc>
+          <w:tcPr>
+            <w:tcW w:type="dxa" w:w="3135"/>
+          </w:tcPr>
+          <w:p>
+            <w:pPr>
+              <w:jc w:val="center"/>
+            </w:pPr>
+            <w:r>
+              <w:rPr>
+                <w:sz w:val="20"/>
+              </w:rPr>
+              <w:t>25.23%</w:t>
+            </w:r>
+          </w:p>
+        </w:tc>
+      </w:tr>
+      <w:tr>
+        <w:tc>
+          <w:tcPr>
+            <w:tcW w:type="dxa" w:w="3135"/>
+          </w:tcPr>
+          <w:p>
+            <w:pPr>
+              <w:jc w:val="center"/>
+            </w:pPr>
+            <w:r>
+              <w:rPr>
+                <w:sz w:val="20"/>
+              </w:rPr>
+              <w:t>PC2</w:t>
+            </w:r>
+          </w:p>
+        </w:tc>
+        <w:tc>
+          <w:tcPr>
+            <w:tcW w:type="dxa" w:w="3135"/>
+          </w:tcPr>
+          <w:p>
+            <w:pPr>
+              <w:jc w:val="center"/>
+            </w:pPr>
+            <w:r>
+              <w:rPr>
+                <w:sz w:val="20"/>
+              </w:rPr>
+              <w:t>14.42%</w:t>
+            </w:r>
+          </w:p>
+        </w:tc>
+        <w:tc>
+          <w:tcPr>
+            <w:tcW w:type="dxa" w:w="3135"/>
+          </w:tcPr>
+          <w:p>
+            <w:pPr>
+              <w:jc w:val="center"/>
+            </w:pPr>
+            <w:r>
+              <w:rPr>
+                <w:sz w:val="20"/>
+              </w:rPr>
+              <w:t>39.65%</w:t>
+            </w:r>
+          </w:p>
+        </w:tc>
+      </w:tr>
+      <w:tr>
+        <w:tc>
+          <w:tcPr>
+            <w:tcW w:type="dxa" w:w="3135"/>
+          </w:tcPr>
+          <w:p>
+            <w:pPr>
+              <w:jc w:val="center"/>
+            </w:pPr>
+            <w:r>
+              <w:rPr>
+                <w:sz w:val="20"/>
+              </w:rPr>
+              <w:t>PC3</w:t>
+            </w:r>
+          </w:p>
+        </w:tc>
+        <w:tc>
+          <w:tcPr>
+            <w:tcW w:type="dxa" w:w="3135"/>
+          </w:tcPr>
+          <w:p>
+            <w:pPr>
+              <w:jc w:val="center"/>
+            </w:pPr>
+            <w:r>
+              <w:rPr>
+                <w:sz w:val="20"/>
+              </w:rPr>
+              <w:t>14.33%</w:t>
+            </w:r>
+          </w:p>
+        </w:tc>
+        <w:tc>
+          <w:tcPr>
+            <w:tcW w:type="dxa" w:w="3135"/>
+          </w:tcPr>
+          <w:p>
+            <w:pPr>
+              <w:jc w:val="center"/>
+            </w:pPr>
+            <w:r>
+              <w:rPr>
+                <w:sz w:val="20"/>
+              </w:rPr>
+              <w:t>53.98%</w:t>
+            </w:r>
+          </w:p>
+        </w:tc>
+      </w:tr>
+    </w:tbl>
+    <w:p>
+      <w:pPr>
+        <w:spacing w:before="40" w:after="200"/>
+        <w:jc w:val="center"/>
+      </w:pPr>
+      <w:r>
+        <w:rPr>
+          <w:i/>
+          <w:color w:val="646464"/>
+          <w:sz w:val="18"/>
+        </w:rPr>
+        <w:t>Table 9 — PCA explained variance for the first three components.</w:t>
+      </w:r>
+    </w:p>
+    <w:p/>
+    <w:p>
+      <w:pPr>
+        <w:pStyle w:val="21"/>
+      </w:pPr>
+      <w:r>
+        <w:t>5.2  Choosing k — Comparing k=2 and k=3</w:t>
+      </w:r>
+    </w:p>
+    <w:p>
+      <w:pPr>
+        <w:spacing w:after="120"/>
+      </w:pPr>
+      <w:r>
+        <w:rPr>
+          <w:sz w:val="22"/>
+        </w:rPr>
+        <w:t>Instead of relying on an elbow curve, we directly compare k=2 and k=3 by examining the silhouette score and visual separation in PCA space. Table 10 shows the results.</w:t>
+      </w:r>
+    </w:p>
+    <w:tbl>
+      <w:tblPr>
+        <w:tblStyle w:val="aff1"/>
+        <w:tblW w:type="auto" w:w="0"/>
+        <w:jc w:val="center"/>
+        <w:tblLook w:firstColumn="1" w:firstRow="1" w:lastColumn="0" w:lastRow="0" w:noHBand="0" w:noVBand="1" w:val="04A0"/>
+      </w:tblPr>
+      <w:tblGrid>
+        <w:gridCol w:w="3135"/>
+        <w:gridCol w:w="3135"/>
+        <w:gridCol w:w="3135"/>
+      </w:tblGrid>
+      <w:tr>
+        <w:tc>
+          <w:tcPr>
+            <w:tcW w:type="dxa" w:w="3135"/>
+          </w:tcPr>
+          <w:p>
+            <w:pPr>
+              <w:jc w:val="center"/>
+            </w:pPr>
+            <w:r>
+              <w:rPr>
+                <w:b/>
+                <w:sz w:val="20"/>
+              </w:rPr>
+              <w:t>k</w:t>
+            </w:r>
+          </w:p>
+        </w:tc>
+        <w:tc>
+          <w:tcPr>
+            <w:tcW w:type="dxa" w:w="3135"/>
+          </w:tcPr>
+          <w:p>
+            <w:pPr>
+              <w:jc w:val="center"/>
+            </w:pPr>
+            <w:r>
+              <w:rPr>
+                <w:b/>
+                <w:sz w:val="20"/>
+              </w:rPr>
+              <w:t>Inertia</w:t>
+            </w:r>
+          </w:p>
+        </w:tc>
+        <w:tc>
+          <w:tcPr>
+            <w:tcW w:type="dxa" w:w="3135"/>
+          </w:tcPr>
+          <w:p>
+            <w:pPr>
+              <w:jc w:val="center"/>
+            </w:pPr>
+            <w:r>
+              <w:rPr>
+                <w:b/>
+                <w:sz w:val="20"/>
+              </w:rPr>
+              <w:t>Silhouette score</w:t>
+            </w:r>
+          </w:p>
+        </w:tc>
+      </w:tr>
+      <w:tr>
+        <w:tc>
+          <w:tcPr>
+            <w:tcW w:type="dxa" w:w="3135"/>
+          </w:tcPr>
+          <w:p>
+            <w:pPr>
+              <w:jc w:val="center"/>
+            </w:pPr>
+            <w:r>
+              <w:rPr>
+                <w:sz w:val="20"/>
+              </w:rPr>
+              <w:t>2</w:t>
+            </w:r>
+          </w:p>
+        </w:tc>
+        <w:tc>
+          <w:tcPr>
+            <w:tcW w:type="dxa" w:w="3135"/>
+          </w:tcPr>
+          <w:p>
+            <w:pPr>
+              <w:jc w:val="center"/>
+            </w:pPr>
+            <w:r>
+              <w:rPr>
+                <w:sz w:val="20"/>
+              </w:rPr>
+              <w:t>588,571</w:t>
+            </w:r>
+          </w:p>
+        </w:tc>
+        <w:tc>
+          <w:tcPr>
+            <w:tcW w:type="dxa" w:w="3135"/>
+          </w:tcPr>
+          <w:p>
+            <w:pPr>
+              <w:jc w:val="center"/>
+            </w:pPr>
+            <w:r>
+              <w:rPr>
+                <w:sz w:val="20"/>
+              </w:rPr>
+              <w:t>0.1612</w:t>
+            </w:r>
+          </w:p>
+        </w:tc>
+      </w:tr>
+      <w:tr>
+        <w:tc>
+          <w:tcPr>
+            <w:tcW w:type="dxa" w:w="3135"/>
+          </w:tcPr>
+          <w:p>
+            <w:pPr>
+              <w:jc w:val="center"/>
+            </w:pPr>
+            <w:r>
+              <w:rPr>
+                <w:sz w:val="20"/>
+              </w:rPr>
+              <w:t>3</w:t>
+            </w:r>
+          </w:p>
+        </w:tc>
+        <w:tc>
+          <w:tcPr>
+            <w:tcW w:type="dxa" w:w="3135"/>
+          </w:tcPr>
+          <w:p>
+            <w:pPr>
+              <w:jc w:val="center"/>
+            </w:pPr>
+            <w:r>
+              <w:rPr>
+                <w:sz w:val="20"/>
+              </w:rPr>
+              <w:t>532,371</w:t>
+            </w:r>
+          </w:p>
+        </w:tc>
+        <w:tc>
+          <w:tcPr>
+            <w:tcW w:type="dxa" w:w="3135"/>
+          </w:tcPr>
+          <w:p>
+            <w:pPr>
+              <w:jc w:val="center"/>
+            </w:pPr>
+            <w:r>
+              <w:rPr>
+                <w:sz w:val="20"/>
+              </w:rPr>
+              <w:t>0.1553</w:t>
+            </w:r>
+          </w:p>
+        </w:tc>
+      </w:tr>
+    </w:tbl>
+    <w:p>
+      <w:pPr>
+        <w:spacing w:before="40" w:after="200"/>
+        <w:jc w:val="center"/>
+      </w:pPr>
+      <w:r>
+        <w:rPr>
+          <w:i/>
+          <w:color w:val="646464"/>
+          <w:sz w:val="18"/>
+        </w:rPr>
+        <w:t>Table 10 — K-Means comparison for k=2 and k=3.</w:t>
+      </w:r>
+    </w:p>
+    <w:p>
+      <w:pPr>
+        <w:spacing w:after="120"/>
+      </w:pPr>
+      <w:r>
+        <w:rPr>
+          <w:sz w:val="22"/>
+        </w:rPr>
+        <w:t>Both scores are low (&lt; 0.2), confirming that the synthetic dataset has no strong natural cluster structure. The silhouette scores are nearly identical for k=2 and k=3. We choose k=3 for greater granularity in the startup archetypes, while acknowledging this is a deliberate interpretability choice, not a data-driven result.</w:t>
+      </w:r>
+    </w:p>
+    <w:p/>
+    <w:p>
+      <w:pPr>
+        <w:pStyle w:val="21"/>
+      </w:pPr>
+      <w:r>
+        <w:t>5.3  Cluster Profiles</w:t>
+      </w:r>
+    </w:p>
+    <w:p>
+      <w:pPr>
+        <w:spacing w:after="120"/>
+      </w:pPr>
+      <w:r>
+        <w:rPr>
+          <w:sz w:val="22"/>
+        </w:rPr>
+        <w:t>Cluster labels are reordered by descending revenue mean, ensuring Cluster 0 always corresponds to the highest-revenue group. Table 11 shows the mean feature values per cluster.</w:t>
+      </w:r>
+    </w:p>
+    <w:tbl>
+      <w:tblPr>
+        <w:tblStyle w:val="aff1"/>
+        <w:tblW w:type="auto" w:w="0"/>
+        <w:jc w:val="center"/>
+        <w:tblLook w:firstColumn="1" w:firstRow="1" w:lastColumn="0" w:lastRow="0" w:noHBand="0" w:noVBand="1" w:val="04A0"/>
+      </w:tblPr>
+      <w:tblGrid>
+        <w:gridCol w:w="2351"/>
+        <w:gridCol w:w="2351"/>
+        <w:gridCol w:w="2351"/>
+        <w:gridCol w:w="2351"/>
+      </w:tblGrid>
+      <w:tr>
+        <w:tc>
+          <w:tcPr>
+            <w:tcW w:type="dxa" w:w="2351"/>
+          </w:tcPr>
+          <w:p>
+            <w:pPr>
+              <w:jc w:val="center"/>
+            </w:pPr>
+            <w:r>
+              <w:rPr>
+                <w:b/>
+                <w:sz w:val="20"/>
+              </w:rPr>
+              <w:t>Feature</w:t>
+            </w:r>
+          </w:p>
+        </w:tc>
+        <w:tc>
+          <w:tcPr>
+            <w:tcW w:type="dxa" w:w="2351"/>
+          </w:tcPr>
+          <w:p>
+            <w:pPr>
+              <w:jc w:val="center"/>
+            </w:pPr>
+            <w:r>
+              <w:rPr>
+                <w:b/>
+                <w:sz w:val="20"/>
+              </w:rPr>
+              <w:t>Cluster 0</w:t>
+            </w:r>
+          </w:p>
+        </w:tc>
+        <w:tc>
+          <w:tcPr>
+            <w:tcW w:type="dxa" w:w="2351"/>
+          </w:tcPr>
+          <w:p>
+            <w:pPr>
+              <w:jc w:val="center"/>
+            </w:pPr>
+            <w:r>
+              <w:rPr>
+                <w:b/>
+                <w:sz w:val="20"/>
+              </w:rPr>
+              <w:t>Cluster 1</w:t>
+            </w:r>
+          </w:p>
+        </w:tc>
+        <w:tc>
+          <w:tcPr>
+            <w:tcW w:type="dxa" w:w="2351"/>
+          </w:tcPr>
+          <w:p>
+            <w:pPr>
+              <w:jc w:val="center"/>
+            </w:pPr>
+            <w:r>
+              <w:rPr>
+                <w:b/>
+                <w:sz w:val="20"/>
+              </w:rPr>
+              <w:t>Cluster 2</w:t>
+            </w:r>
+          </w:p>
+        </w:tc>
+      </w:tr>
+      <w:tr>
+        <w:tc>
+          <w:tcPr>
+            <w:tcW w:type="dxa" w:w="2351"/>
+          </w:tcPr>
+          <w:p>
+            <w:pPr>
+              <w:jc w:val="center"/>
+            </w:pPr>
+            <w:r>
+              <w:rPr>
+                <w:sz w:val="20"/>
+              </w:rPr>
+              <w:t>revenue_million</w:t>
+            </w:r>
+          </w:p>
+        </w:tc>
+        <w:tc>
+          <w:tcPr>
+            <w:tcW w:type="dxa" w:w="2351"/>
+          </w:tcPr>
+          <w:p>
+            <w:pPr>
+              <w:jc w:val="center"/>
+            </w:pPr>
+            <w:r>
+              <w:rPr>
+                <w:sz w:val="20"/>
+              </w:rPr>
+              <w:t>1,038,320</w:t>
+            </w:r>
+          </w:p>
+        </w:tc>
+        <w:tc>
+          <w:tcPr>
+            <w:tcW w:type="dxa" w:w="2351"/>
+          </w:tcPr>
+          <w:p>
+            <w:pPr>
+              <w:jc w:val="center"/>
+            </w:pPr>
+            <w:r>
+              <w:rPr>
+                <w:sz w:val="20"/>
+              </w:rPr>
+              <w:t>847,137</w:t>
+            </w:r>
+          </w:p>
+        </w:tc>
+        <w:tc>
+          <w:tcPr>
+            <w:tcW w:type="dxa" w:w="2351"/>
+          </w:tcPr>
+          <w:p>
+            <w:pPr>
+              <w:jc w:val="center"/>
+            </w:pPr>
+            <w:r>
+              <w:rPr>
+                <w:sz w:val="20"/>
+              </w:rPr>
+              <w:t>234,260</w:t>
+            </w:r>
+          </w:p>
+        </w:tc>
+      </w:tr>
+      <w:tr>
+        <w:tc>
+          <w:tcPr>
+            <w:tcW w:type="dxa" w:w="2351"/>
+          </w:tcPr>
+          <w:p>
+            <w:pPr>
+              <w:jc w:val="center"/>
+            </w:pPr>
+            <w:r>
+              <w:rPr>
+                <w:sz w:val="20"/>
+              </w:rPr>
+              <w:t>product_traction_users</w:t>
+            </w:r>
+          </w:p>
+        </w:tc>
+        <w:tc>
+          <w:tcPr>
+            <w:tcW w:type="dxa" w:w="2351"/>
+          </w:tcPr>
+          <w:p>
+            <w:pPr>
+              <w:jc w:val="center"/>
+            </w:pPr>
+            <w:r>
+              <w:rPr>
+                <w:sz w:val="20"/>
+              </w:rPr>
+              <w:t>360,632</w:t>
+            </w:r>
+          </w:p>
+        </w:tc>
+        <w:tc>
+          <w:tcPr>
+            <w:tcW w:type="dxa" w:w="2351"/>
+          </w:tcPr>
+          <w:p>
+            <w:pPr>
+              <w:jc w:val="center"/>
+            </w:pPr>
+            <w:r>
+              <w:rPr>
+                <w:sz w:val="20"/>
+              </w:rPr>
+              <w:t>310,499</w:t>
+            </w:r>
+          </w:p>
+        </w:tc>
+        <w:tc>
+          <w:tcPr>
+            <w:tcW w:type="dxa" w:w="2351"/>
+          </w:tcPr>
+          <w:p>
+            <w:pPr>
+              <w:jc w:val="center"/>
+            </w:pPr>
+            <w:r>
+              <w:rPr>
+                <w:sz w:val="20"/>
+              </w:rPr>
+              <w:t>119,455</w:t>
+            </w:r>
+          </w:p>
+        </w:tc>
+      </w:tr>
+      <w:tr>
+        <w:tc>
+          <w:tcPr>
+            <w:tcW w:type="dxa" w:w="2351"/>
+          </w:tcPr>
+          <w:p>
+            <w:pPr>
+              <w:jc w:val="center"/>
+            </w:pPr>
+            <w:r>
+              <w:rPr>
+                <w:sz w:val="20"/>
+              </w:rPr>
+              <w:t>founder_experience_years</w:t>
+            </w:r>
+          </w:p>
+        </w:tc>
+        <w:tc>
+          <w:tcPr>
+            <w:tcW w:type="dxa" w:w="2351"/>
+          </w:tcPr>
+          <w:p>
+            <w:pPr>
+              <w:jc w:val="center"/>
+            </w:pPr>
+            <w:r>
+              <w:rPr>
+                <w:sz w:val="20"/>
+              </w:rPr>
+              <w:t>15.0</w:t>
+            </w:r>
+          </w:p>
+        </w:tc>
+        <w:tc>
+          <w:tcPr>
+            <w:tcW w:type="dxa" w:w="2351"/>
+          </w:tcPr>
+          <w:p>
+            <w:pPr>
+              <w:jc w:val="center"/>
+            </w:pPr>
+            <w:r>
+              <w:rPr>
+                <w:sz w:val="20"/>
+              </w:rPr>
+              <w:t>2.3</w:t>
+            </w:r>
+          </w:p>
+        </w:tc>
+        <w:tc>
+          <w:tcPr>
+            <w:tcW w:type="dxa" w:w="2351"/>
+          </w:tcPr>
+          <w:p>
+            <w:pPr>
+              <w:jc w:val="center"/>
+            </w:pPr>
+            <w:r>
+              <w:rPr>
+                <w:sz w:val="20"/>
+              </w:rPr>
+              <w:t>13.3</w:t>
+            </w:r>
+          </w:p>
+        </w:tc>
+      </w:tr>
+      <w:tr>
+        <w:tc>
+          <w:tcPr>
+            <w:tcW w:type="dxa" w:w="2351"/>
+          </w:tcPr>
+          <w:p>
+            <w:pPr>
+              <w:jc w:val="center"/>
+            </w:pPr>
+            <w:r>
+              <w:rPr>
+                <w:sz w:val="20"/>
+              </w:rPr>
+              <w:t>funding_rounds</w:t>
+            </w:r>
+          </w:p>
+        </w:tc>
+        <w:tc>
+          <w:tcPr>
+            <w:tcW w:type="dxa" w:w="2351"/>
+          </w:tcPr>
+          <w:p>
+            <w:pPr>
+              <w:jc w:val="center"/>
+            </w:pPr>
+            <w:r>
+              <w:rPr>
+                <w:sz w:val="20"/>
+              </w:rPr>
+              <w:t>2.0</w:t>
+            </w:r>
+          </w:p>
+        </w:tc>
+        <w:tc>
+          <w:tcPr>
+            <w:tcW w:type="dxa" w:w="2351"/>
+          </w:tcPr>
+          <w:p>
+            <w:pPr>
+              <w:jc w:val="center"/>
+            </w:pPr>
+            <w:r>
+              <w:rPr>
+                <w:sz w:val="20"/>
+              </w:rPr>
+              <w:t>2.0</w:t>
+            </w:r>
+          </w:p>
+        </w:tc>
+        <w:tc>
+          <w:tcPr>
+            <w:tcW w:type="dxa" w:w="2351"/>
+          </w:tcPr>
+          <w:p>
+            <w:pPr>
+              <w:jc w:val="center"/>
+            </w:pPr>
+            <w:r>
+              <w:rPr>
+                <w:sz w:val="20"/>
+              </w:rPr>
+              <w:t>2.0</w:t>
+            </w:r>
+          </w:p>
+        </w:tc>
+      </w:tr>
+      <w:tr>
+        <w:tc>
+          <w:tcPr>
+            <w:tcW w:type="dxa" w:w="2351"/>
+          </w:tcPr>
+          <w:p>
+            <w:pPr>
+              <w:jc w:val="center"/>
+            </w:pPr>
+            <w:r>
+              <w:rPr>
+                <w:sz w:val="20"/>
+              </w:rPr>
+              <w:t>team_size</w:t>
+            </w:r>
+          </w:p>
+        </w:tc>
+        <w:tc>
+          <w:tcPr>
+            <w:tcW w:type="dxa" w:w="2351"/>
+          </w:tcPr>
+          <w:p>
+            <w:pPr>
+              <w:jc w:val="center"/>
+            </w:pPr>
+            <w:r>
+              <w:rPr>
+                <w:sz w:val="20"/>
+              </w:rPr>
+              <w:t>150.6</w:t>
+            </w:r>
+          </w:p>
+        </w:tc>
+        <w:tc>
+          <w:tcPr>
+            <w:tcW w:type="dxa" w:w="2351"/>
+          </w:tcPr>
+          <w:p>
+            <w:pPr>
+              <w:jc w:val="center"/>
+            </w:pPr>
+            <w:r>
+              <w:rPr>
+                <w:sz w:val="20"/>
+              </w:rPr>
+              <w:t>151.4</w:t>
+            </w:r>
+          </w:p>
+        </w:tc>
+        <w:tc>
+          <w:tcPr>
+            <w:tcW w:type="dxa" w:w="2351"/>
+          </w:tcPr>
+          <w:p>
+            <w:pPr>
+              <w:jc w:val="center"/>
+            </w:pPr>
+            <w:r>
+              <w:rPr>
+                <w:sz w:val="20"/>
+              </w:rPr>
+              <w:t>150.6</w:t>
+            </w:r>
+          </w:p>
+        </w:tc>
+      </w:tr>
+      <w:tr>
+        <w:tc>
+          <w:tcPr>
+            <w:tcW w:type="dxa" w:w="2351"/>
+          </w:tcPr>
+          <w:p>
+            <w:pPr>
+              <w:jc w:val="center"/>
+            </w:pPr>
+            <w:r>
+              <w:rPr>
+                <w:sz w:val="20"/>
+              </w:rPr>
+              <w:t>market_size_billion</w:t>
+            </w:r>
+          </w:p>
+        </w:tc>
+        <w:tc>
+          <w:tcPr>
+            <w:tcW w:type="dxa" w:w="2351"/>
+          </w:tcPr>
+          <w:p>
+            <w:pPr>
+              <w:jc w:val="center"/>
+            </w:pPr>
+            <w:r>
+              <w:rPr>
+                <w:sz w:val="20"/>
+              </w:rPr>
+              <w:t>33.2</w:t>
+            </w:r>
+          </w:p>
+        </w:tc>
+        <w:tc>
+          <w:tcPr>
+            <w:tcW w:type="dxa" w:w="2351"/>
+          </w:tcPr>
+          <w:p>
+            <w:pPr>
+              <w:jc w:val="center"/>
+            </w:pPr>
+            <w:r>
+              <w:rPr>
+                <w:sz w:val="20"/>
+              </w:rPr>
+              <w:t>33.3</w:t>
+            </w:r>
+          </w:p>
+        </w:tc>
+        <w:tc>
+          <w:tcPr>
+            <w:tcW w:type="dxa" w:w="2351"/>
+          </w:tcPr>
+          <w:p>
+            <w:pPr>
+              <w:jc w:val="center"/>
+            </w:pPr>
+            <w:r>
+              <w:rPr>
+                <w:sz w:val="20"/>
+              </w:rPr>
+              <w:t>33.1</w:t>
+            </w:r>
+          </w:p>
+        </w:tc>
+      </w:tr>
+      <w:tr>
+        <w:tc>
+          <w:tcPr>
+            <w:tcW w:type="dxa" w:w="2351"/>
+          </w:tcPr>
+          <w:p>
+            <w:pPr>
+              <w:jc w:val="center"/>
+            </w:pPr>
+            <w:r>
+              <w:rPr>
+                <w:sz w:val="20"/>
+              </w:rPr>
+              <w:t>burn_rate_million</w:t>
+            </w:r>
+          </w:p>
+        </w:tc>
+        <w:tc>
+          <w:tcPr>
+            <w:tcW w:type="dxa" w:w="2351"/>
+          </w:tcPr>
+          <w:p>
+            <w:pPr>
+              <w:jc w:val="center"/>
+            </w:pPr>
+            <w:r>
+              <w:rPr>
+                <w:sz w:val="20"/>
+              </w:rPr>
+              <w:t>16.8</w:t>
+            </w:r>
+          </w:p>
+        </w:tc>
+        <w:tc>
+          <w:tcPr>
+            <w:tcW w:type="dxa" w:w="2351"/>
+          </w:tcPr>
+          <w:p>
+            <w:pPr>
+              <w:jc w:val="center"/>
+            </w:pPr>
+            <w:r>
+              <w:rPr>
+                <w:sz w:val="20"/>
+              </w:rPr>
+              <w:t>16.7</w:t>
+            </w:r>
+          </w:p>
+        </w:tc>
+        <w:tc>
+          <w:tcPr>
+            <w:tcW w:type="dxa" w:w="2351"/>
+          </w:tcPr>
+          <w:p>
+            <w:pPr>
+              <w:jc w:val="center"/>
+            </w:pPr>
+            <w:r>
+              <w:rPr>
+                <w:sz w:val="20"/>
+              </w:rPr>
+              <w:t>16.9</w:t>
+            </w:r>
+          </w:p>
+        </w:tc>
+      </w:tr>
+    </w:tbl>
+    <w:p>
+      <w:pPr>
+        <w:spacing w:before="40" w:after="200"/>
+        <w:jc w:val="center"/>
+      </w:pPr>
+      <w:r>
+        <w:rPr>
+          <w:i/>
+          <w:color w:val="646464"/>
+          <w:sz w:val="18"/>
+        </w:rPr>
+        <w:t>Table 11 — Mean feature values per K-Means cluster (original scale, ordered by revenue).</w:t>
+      </w:r>
+    </w:p>
+    <w:p>
+      <w:pPr>
+        <w:spacing w:after="120"/>
+      </w:pPr>
+      <w:r>
+        <w:rPr>
+          <w:sz w:val="22"/>
+        </w:rPr>
+        <w:t>The clusters are differentiated almost exclusively by revenue and product traction. team_size, market_size_billion, burn_rate_million, and funding_rounds are nearly identical across all three clusters, confirming they carry no structural information.</w:t>
+      </w:r>
+    </w:p>
+    <w:p/>
+    <w:p>
+      <w:pPr>
+        <w:pStyle w:val="21"/>
+      </w:pPr>
+      <w:r>
+        <w:t>5.4  Cluster Archetypes</w:t>
+      </w:r>
+    </w:p>
+    <w:p>
+      <w:pPr>
+        <w:spacing w:after="120"/>
+      </w:pPr>
+      <w:r>
+        <w:rPr>
+          <w:sz w:val="22"/>
+        </w:rPr>
+        <w:t>Rather than comparing clusters to outcome labels, we interpret each cluster on its own terms as a startup archetype:</w:t>
+      </w:r>
+    </w:p>
+    <w:tbl>
+      <w:tblPr>
+        <w:tblStyle w:val="aff1"/>
+        <w:tblW w:type="auto" w:w="0"/>
+        <w:jc w:val="center"/>
+        <w:tblLook w:firstColumn="1" w:firstRow="1" w:lastColumn="0" w:lastRow="0" w:noHBand="0" w:noVBand="1" w:val="04A0"/>
+      </w:tblPr>
+      <w:tblGrid>
+        <w:gridCol w:w="1881"/>
+        <w:gridCol w:w="1881"/>
+        <w:gridCol w:w="1881"/>
+        <w:gridCol w:w="1881"/>
+        <w:gridCol w:w="1881"/>
+      </w:tblGrid>
+      <w:tr>
+        <w:tc>
+          <w:tcPr>
+            <w:tcW w:type="dxa" w:w="1881"/>
+          </w:tcPr>
+          <w:p>
+            <w:pPr>
+              <w:jc w:val="center"/>
+            </w:pPr>
+            <w:r>
+              <w:rPr>
+                <w:b/>
+                <w:sz w:val="20"/>
+              </w:rPr>
+              <w:t>Cluster</w:t>
+            </w:r>
+          </w:p>
+        </w:tc>
+        <w:tc>
+          <w:tcPr>
+            <w:tcW w:type="dxa" w:w="1881"/>
+          </w:tcPr>
+          <w:p>
+            <w:pPr>
+              <w:jc w:val="center"/>
+            </w:pPr>
+            <w:r>
+              <w:rPr>
+                <w:b/>
+                <w:sz w:val="20"/>
+              </w:rPr>
+              <w:t>Revenue</w:t>
+            </w:r>
+          </w:p>
+        </w:tc>
+        <w:tc>
+          <w:tcPr>
+            <w:tcW w:type="dxa" w:w="1881"/>
+          </w:tcPr>
+          <w:p>
+            <w:pPr>
+              <w:jc w:val="center"/>
+            </w:pPr>
+            <w:r>
+              <w:rPr>
+                <w:b/>
+                <w:sz w:val="20"/>
+              </w:rPr>
+              <w:t>Traction</w:t>
+            </w:r>
+          </w:p>
+        </w:tc>
+        <w:tc>
+          <w:tcPr>
+            <w:tcW w:type="dxa" w:w="1881"/>
+          </w:tcPr>
+          <w:p>
+            <w:pPr>
+              <w:jc w:val="center"/>
+            </w:pPr>
+            <w:r>
+              <w:rPr>
+                <w:b/>
+                <w:sz w:val="20"/>
+              </w:rPr>
+              <w:t>Founder exp.</w:t>
+            </w:r>
+          </w:p>
+        </w:tc>
+        <w:tc>
+          <w:tcPr>
+            <w:tcW w:type="dxa" w:w="1881"/>
+          </w:tcPr>
+          <w:p>
+            <w:pPr>
+              <w:jc w:val="center"/>
+            </w:pPr>
+            <w:r>
+              <w:rPr>
+                <w:b/>
+                <w:sz w:val="20"/>
+              </w:rPr>
+              <w:t>Archetype</w:t>
+            </w:r>
+          </w:p>
+        </w:tc>
+      </w:tr>
+      <w:tr>
+        <w:tc>
+          <w:tcPr>
+            <w:tcW w:type="dxa" w:w="1881"/>
+          </w:tcPr>
+          <w:p>
+            <w:pPr>
+              <w:jc w:val="center"/>
+            </w:pPr>
+            <w:r>
+              <w:rPr>
+                <w:sz w:val="20"/>
+              </w:rPr>
+              <w:t>0 (53%)</w:t>
+            </w:r>
+          </w:p>
+        </w:tc>
+        <w:tc>
+          <w:tcPr>
+            <w:tcW w:type="dxa" w:w="1881"/>
+          </w:tcPr>
+          <w:p>
+            <w:pPr>
+              <w:jc w:val="center"/>
+            </w:pPr>
+            <w:r>
+              <w:rPr>
+                <w:sz w:val="20"/>
+              </w:rPr>
+              <w:t>High</w:t>
+            </w:r>
+          </w:p>
+        </w:tc>
+        <w:tc>
+          <w:tcPr>
+            <w:tcW w:type="dxa" w:w="1881"/>
+          </w:tcPr>
+          <w:p>
+            <w:pPr>
+              <w:jc w:val="center"/>
+            </w:pPr>
+            <w:r>
+              <w:rPr>
+                <w:sz w:val="20"/>
+              </w:rPr>
+              <w:t>High</w:t>
+            </w:r>
+          </w:p>
+        </w:tc>
+        <w:tc>
+          <w:tcPr>
+            <w:tcW w:type="dxa" w:w="1881"/>
+          </w:tcPr>
+          <w:p>
+            <w:pPr>
+              <w:jc w:val="center"/>
+            </w:pPr>
+            <w:r>
+              <w:rPr>
+                <w:sz w:val="20"/>
+              </w:rPr>
+              <w:t>~15 yrs</w:t>
+            </w:r>
+          </w:p>
+        </w:tc>
+        <w:tc>
+          <w:tcPr>
+            <w:tcW w:type="dxa" w:w="1881"/>
+          </w:tcPr>
+          <w:p>
+            <w:pPr>
+              <w:jc w:val="center"/>
+            </w:pPr>
+            <w:r>
+              <w:rPr>
+                <w:sz w:val="20"/>
+              </w:rPr>
+              <w:t>Mature, high-revenue companies</w:t>
+            </w:r>
+          </w:p>
+        </w:tc>
+      </w:tr>
+      <w:tr>
+        <w:tc>
+          <w:tcPr>
+            <w:tcW w:type="dxa" w:w="1881"/>
+          </w:tcPr>
+          <w:p>
+            <w:pPr>
+              <w:jc w:val="center"/>
+            </w:pPr>
+            <w:r>
+              <w:rPr>
+                <w:sz w:val="20"/>
+              </w:rPr>
+              <w:t>1 (20%)</w:t>
+            </w:r>
+          </w:p>
+        </w:tc>
+        <w:tc>
+          <w:tcPr>
+            <w:tcW w:type="dxa" w:w="1881"/>
+          </w:tcPr>
+          <w:p>
+            <w:pPr>
+              <w:jc w:val="center"/>
+            </w:pPr>
+            <w:r>
+              <w:rPr>
+                <w:sz w:val="20"/>
+              </w:rPr>
+              <w:t>Mid</w:t>
+            </w:r>
+          </w:p>
+        </w:tc>
+        <w:tc>
+          <w:tcPr>
+            <w:tcW w:type="dxa" w:w="1881"/>
+          </w:tcPr>
+          <w:p>
+            <w:pPr>
+              <w:jc w:val="center"/>
+            </w:pPr>
+            <w:r>
+              <w:rPr>
+                <w:sz w:val="20"/>
+              </w:rPr>
+              <w:t>Mid</w:t>
+            </w:r>
+          </w:p>
+        </w:tc>
+        <w:tc>
+          <w:tcPr>
+            <w:tcW w:type="dxa" w:w="1881"/>
+          </w:tcPr>
+          <w:p>
+            <w:pPr>
+              <w:jc w:val="center"/>
+            </w:pPr>
+            <w:r>
+              <w:rPr>
+                <w:sz w:val="20"/>
+              </w:rPr>
+              <w:t>~2 yrs</w:t>
+            </w:r>
+          </w:p>
+        </w:tc>
+        <w:tc>
+          <w:tcPr>
+            <w:tcW w:type="dxa" w:w="1881"/>
+          </w:tcPr>
+          <w:p>
+            <w:pPr>
+              <w:jc w:val="center"/>
+            </w:pPr>
+            <w:r>
+              <w:rPr>
+                <w:sz w:val="20"/>
+              </w:rPr>
+              <w:t>Early-stage, young-founder startups</w:t>
+            </w:r>
+          </w:p>
+        </w:tc>
+      </w:tr>
+      <w:tr>
+        <w:tc>
+          <w:tcPr>
+            <w:tcW w:type="dxa" w:w="1881"/>
+          </w:tcPr>
+          <w:p>
+            <w:pPr>
+              <w:jc w:val="center"/>
+            </w:pPr>
+            <w:r>
+              <w:rPr>
+                <w:sz w:val="20"/>
+              </w:rPr>
+              <w:t>2 (27%)</w:t>
+            </w:r>
+          </w:p>
+        </w:tc>
+        <w:tc>
+          <w:tcPr>
+            <w:tcW w:type="dxa" w:w="1881"/>
+          </w:tcPr>
+          <w:p>
+            <w:pPr>
+              <w:jc w:val="center"/>
+            </w:pPr>
+            <w:r>
+              <w:rPr>
+                <w:sz w:val="20"/>
+              </w:rPr>
+              <w:t>Low</w:t>
+            </w:r>
+          </w:p>
+        </w:tc>
+        <w:tc>
+          <w:tcPr>
+            <w:tcW w:type="dxa" w:w="1881"/>
+          </w:tcPr>
+          <w:p>
+            <w:pPr>
+              <w:jc w:val="center"/>
+            </w:pPr>
+            <w:r>
+              <w:rPr>
+                <w:sz w:val="20"/>
+              </w:rPr>
+              <w:t>Low</w:t>
+            </w:r>
+          </w:p>
+        </w:tc>
+        <w:tc>
+          <w:tcPr>
+            <w:tcW w:type="dxa" w:w="1881"/>
+          </w:tcPr>
+          <w:p>
+            <w:pPr>
+              <w:jc w:val="center"/>
+            </w:pPr>
+            <w:r>
+              <w:rPr>
+                <w:sz w:val="20"/>
+              </w:rPr>
+              <w:t>~13 yrs</w:t>
+            </w:r>
+          </w:p>
+        </w:tc>
+        <w:tc>
+          <w:tcPr>
+            <w:tcW w:type="dxa" w:w="1881"/>
+          </w:tcPr>
+          <w:p>
+            <w:pPr>
+              <w:jc w:val="center"/>
+            </w:pPr>
+            <w:r>
+              <w:rPr>
+                <w:sz w:val="20"/>
+              </w:rPr>
+              <w:t>Low-traction, struggling companies</w:t>
+            </w:r>
+          </w:p>
+        </w:tc>
+      </w:tr>
+    </w:tbl>
+    <w:p>
+      <w:pPr>
+        <w:spacing w:before="40" w:after="200"/>
+        <w:jc w:val="center"/>
+      </w:pPr>
+      <w:r>
+        <w:rPr>
+          <w:i/>
+          <w:color w:val="646464"/>
+          <w:sz w:val="18"/>
+        </w:rPr>
+        <w:t>Table 12 — Cluster archetypes interpreted by feature profiles.</w:t>
+      </w:r>
+    </w:p>
+    <w:p>
+      <w:pPr>
+        <w:spacing w:after="120"/>
+      </w:pPr>
+      <w:r>
+        <w:rPr>
+          <w:sz w:val="22"/>
+        </w:rPr>
+        <w:t>This interpretation is independent of the outcome labels and has its own business logic: the feature space naturally separates companies by their revenue level and traction, which reflects their development stage. Note that K-Means clusters do not correspond one-to-one with the outcome classes — this would only be possible if the features perfectly predicted the outcome, which they do not (synthetic data limitation).</w:t>
+      </w:r>
+    </w:p>
+    <w:p/>
+    <w:p>
+      <w:pPr>
+        <w:pStyle w:val="21"/>
+      </w:pPr>
+      <w:r>
+        <w:t>5.5  k=2 vs Failure / Non-Failure</w:t>
+      </w:r>
+    </w:p>
+    <w:p>
+      <w:pPr>
+        <w:spacing w:after="120"/>
+      </w:pPr>
+      <w:r>
+        <w:rPr>
+          <w:sz w:val="22"/>
+        </w:rPr>
+        <w:t>As a sanity check, we compare k=2 clusters with a binary outcome grouping (Failure vs Non-Failure). Table 13 shows the composition.</w:t>
+      </w:r>
+    </w:p>
+    <w:tbl>
+      <w:tblPr>
+        <w:tblStyle w:val="aff1"/>
+        <w:tblW w:type="auto" w:w="0"/>
+        <w:jc w:val="center"/>
+        <w:tblLook w:firstColumn="1" w:firstRow="1" w:lastColumn="0" w:lastRow="0" w:noHBand="0" w:noVBand="1" w:val="04A0"/>
+      </w:tblPr>
+      <w:tblGrid>
+        <w:gridCol w:w="2351"/>
+        <w:gridCol w:w="2351"/>
+        <w:gridCol w:w="2351"/>
+        <w:gridCol w:w="2351"/>
+      </w:tblGrid>
+      <w:tr>
+        <w:tc>
+          <w:tcPr>
+            <w:tcW w:type="dxa" w:w="2351"/>
+          </w:tcPr>
+          <w:p>
+            <w:pPr>
+              <w:jc w:val="center"/>
+            </w:pPr>
+            <w:r>
+              <w:rPr>
+                <w:b/>
+                <w:sz w:val="20"/>
+              </w:rPr>
+              <w:t>Cluster</w:t>
+            </w:r>
+          </w:p>
+        </w:tc>
+        <w:tc>
+          <w:tcPr>
+            <w:tcW w:type="dxa" w:w="2351"/>
+          </w:tcPr>
+          <w:p>
+            <w:pPr>
+              <w:jc w:val="center"/>
+            </w:pPr>
+            <w:r>
+              <w:rPr>
+                <w:b/>
+                <w:sz w:val="20"/>
+              </w:rPr>
+              <w:t>Failure %</w:t>
+            </w:r>
+          </w:p>
+        </w:tc>
+        <w:tc>
+          <w:tcPr>
+            <w:tcW w:type="dxa" w:w="2351"/>
+          </w:tcPr>
+          <w:p>
+            <w:pPr>
+              <w:jc w:val="center"/>
+            </w:pPr>
+            <w:r>
+              <w:rPr>
+                <w:b/>
+                <w:sz w:val="20"/>
+              </w:rPr>
+              <w:t>Non-Failure %</w:t>
+            </w:r>
+          </w:p>
+        </w:tc>
+        <w:tc>
+          <w:tcPr>
+            <w:tcW w:type="dxa" w:w="2351"/>
+          </w:tcPr>
+          <w:p>
+            <w:pPr>
+              <w:jc w:val="center"/>
+            </w:pPr>
+            <w:r>
+              <w:rPr>
+                <w:b/>
+                <w:sz w:val="20"/>
+              </w:rPr>
+              <w:t>Dominant profile</w:t>
+            </w:r>
+          </w:p>
+        </w:tc>
+      </w:tr>
+      <w:tr>
+        <w:tc>
+          <w:tcPr>
+            <w:tcW w:type="dxa" w:w="2351"/>
+          </w:tcPr>
+          <w:p>
+            <w:pPr>
+              <w:jc w:val="center"/>
+            </w:pPr>
+            <w:r>
+              <w:rPr>
+                <w:sz w:val="20"/>
+              </w:rPr>
+              <w:t>0 (high revenue)</w:t>
+            </w:r>
+          </w:p>
+        </w:tc>
+        <w:tc>
+          <w:tcPr>
+            <w:tcW w:type="dxa" w:w="2351"/>
+          </w:tcPr>
+          <w:p>
+            <w:pPr>
+              <w:jc w:val="center"/>
+            </w:pPr>
+            <w:r>
+              <w:rPr>
+                <w:sz w:val="20"/>
+              </w:rPr>
+              <w:t>43.4%</w:t>
+            </w:r>
+          </w:p>
+        </w:tc>
+        <w:tc>
+          <w:tcPr>
+            <w:tcW w:type="dxa" w:w="2351"/>
+          </w:tcPr>
+          <w:p>
+            <w:pPr>
+              <w:jc w:val="center"/>
+            </w:pPr>
+            <w:r>
+              <w:rPr>
+                <w:sz w:val="20"/>
+              </w:rPr>
+              <w:t>56.6%</w:t>
+            </w:r>
+          </w:p>
+        </w:tc>
+        <w:tc>
+          <w:tcPr>
+            <w:tcW w:type="dxa" w:w="2351"/>
+          </w:tcPr>
+          <w:p>
+            <w:pPr>
+              <w:jc w:val="center"/>
+            </w:pPr>
+            <w:r>
+              <w:rPr>
+                <w:sz w:val="20"/>
+              </w:rPr>
+              <w:t>Mostly Non-Failure</w:t>
+            </w:r>
+          </w:p>
+        </w:tc>
+      </w:tr>
+      <w:tr>
+        <w:tc>
+          <w:tcPr>
+            <w:tcW w:type="dxa" w:w="2351"/>
+          </w:tcPr>
+          <w:p>
+            <w:pPr>
+              <w:jc w:val="center"/>
+            </w:pPr>
+            <w:r>
+              <w:rPr>
+                <w:sz w:val="20"/>
+              </w:rPr>
+              <w:t>1 (low revenue)</w:t>
+            </w:r>
+          </w:p>
+        </w:tc>
+        <w:tc>
+          <w:tcPr>
+            <w:tcW w:type="dxa" w:w="2351"/>
+          </w:tcPr>
+          <w:p>
+            <w:pPr>
+              <w:jc w:val="center"/>
+            </w:pPr>
+            <w:r>
+              <w:rPr>
+                <w:sz w:val="20"/>
+              </w:rPr>
+              <w:t>79.7%</w:t>
+            </w:r>
+          </w:p>
+        </w:tc>
+        <w:tc>
+          <w:tcPr>
+            <w:tcW w:type="dxa" w:w="2351"/>
+          </w:tcPr>
+          <w:p>
+            <w:pPr>
+              <w:jc w:val="center"/>
+            </w:pPr>
+            <w:r>
+              <w:rPr>
+                <w:sz w:val="20"/>
+              </w:rPr>
+              <w:t>20.3%</w:t>
+            </w:r>
+          </w:p>
+        </w:tc>
+        <w:tc>
+          <w:tcPr>
+            <w:tcW w:type="dxa" w:w="2351"/>
+          </w:tcPr>
+          <w:p>
+            <w:pPr>
+              <w:jc w:val="center"/>
+            </w:pPr>
+            <w:r>
+              <w:rPr>
+                <w:sz w:val="20"/>
+              </w:rPr>
+              <w:t>Strongly Failure</w:t>
+            </w:r>
+          </w:p>
+        </w:tc>
+      </w:tr>
+    </w:tbl>
+    <w:p>
+      <w:pPr>
+        <w:spacing w:before="40" w:after="200"/>
+        <w:jc w:val="center"/>
+      </w:pPr>
+      <w:r>
+        <w:rPr>
+          <w:i/>
+          <w:color w:val="646464"/>
+          <w:sz w:val="18"/>
+        </w:rPr>
+        <w:t>Table 13 — k=2 cluster composition vs binary outcome.</w:t>
+      </w:r>
+    </w:p>
+    <w:p>
+      <w:pPr>
+        <w:spacing w:after="120"/>
+      </w:pPr>
+      <w:r>
+        <w:rPr>
+          <w:sz w:val="22"/>
+        </w:rPr>
+        <w:t>With k=2, Cluster 1 aligns strongly with Failure (79.7%). This is the clearest alignment between unsupervised clustering and supervised labels in the entire analysis, and is consistent with the finding that revenue and traction are the only informative features.</w:t>
+      </w:r>
+    </w:p>
+    <w:p/>
+    <w:p>
+      <w:pPr>
+        <w:pStyle w:val="21"/>
+      </w:pPr>
+      <w:r>
+        <w:t>5.6  Hierarchical Clustering</w:t>
+      </w:r>
+    </w:p>
+    <w:p>
+      <w:pPr>
+        <w:spacing w:after="120"/>
+      </w:pPr>
+      <w:r>
+        <w:rPr>
+          <w:sz w:val="22"/>
+        </w:rPr>
+        <w:t>We applied Agglomerative Clustering with Ward linkage on a 2,000-row subsample. The dendrogram was reconstructed from the sklearn model using the TD06 method. With k=3, the hierarchical solution produces a more imbalanced partition (Cluster 0: 78%, Cluster 1: 15%, Cluster 2: 7%) compared to K-Means (53/27/20%). This is expected: Ward linkage minimises intra-cluster variance without any constraint on cluster size, while K-Means tends toward more balanced partitions.</w:t>
+      </w:r>
+    </w:p>
+    <w:p>
+      <w:pPr>
+        <w:spacing w:after="120"/>
+      </w:pPr>
+      <w:r>
+        <w:rPr>
+          <w:sz w:val="22"/>
+        </w:rPr>
+        <w:t>The side-by-side PCA comparison confirms that both methods identify a similar large high-revenue group and a smaller low-traction group, but differ in how they split the intermediate region.</w:t>
       </w:r>
     </w:p>
     <w:p/>
@@ -6513,17 +7180,18 @@
       <w:pPr>
         <w:pStyle w:val="1"/>
       </w:pPr>
-      <w:bookmarkStart w:id="17" w:name="_Toc225885102"/>
       <w:r>
         <w:t>6  Conclusion</w:t>
       </w:r>
-      <w:bookmarkEnd w:id="17"/>
     </w:p>
     <w:p>
       <w:pPr>
         <w:spacing w:after="120"/>
       </w:pPr>
       <w:r>
+        <w:rPr>
+          <w:sz w:val="22"/>
+        </w:rPr>
         <w:t>This project applied a complete supervised and unsupervised machine learning pipeline to a synthetic Kaggle dataset of 100,000 startup profiles.</w:t>
       </w:r>
     </w:p>
@@ -6533,12 +7201,9 @@
       </w:pPr>
       <w:r>
         <w:rPr>
-          <w:b/>
+          <w:sz w:val="22"/>
         </w:rPr>
-        <w:t>Supervised learning</w:t>
-      </w:r>
-      <w:r>
-        <w:t xml:space="preserve"> revealed that Logistic Regression is the best-performing model (test accuracy = 72.90%), marginally outperforming LDA (72.58%) and Decision Tree (71.98%). All models converge near a 73% accuracy ceiling, imposed by the weak feature-target correlations of the synthetic data. The IPO class remains systematically under-predicted due to its severe imbalance (2.1%).</w:t>
+        <w:t>Supervised learning (3-class): Logistic Regression achieves the best test accuracy (72.90%), with a macro F1 of 0.584 dragged down by the near-unlearnable IPO class (2.1% of data, recall = 0.19). Removing IPO and training a binary classifier raises macro F1 to 0.737 and AUC to 0.816, confirming that class imbalance — not model capacity — was the primary bottleneck.</w:t>
       </w:r>
     </w:p>
     <w:p>
@@ -6547,13 +7212,9 @@
       </w:pPr>
       <w:r>
         <w:rPr>
-          <w:b/>
+          <w:sz w:val="22"/>
         </w:rPr>
-        <w:lastRenderedPageBreak/>
-        <w:t>Unsupervised learning</w:t>
-      </w:r>
-      <w:r>
-        <w:t xml:space="preserve"> confirms this diagnosis: PCA captures only 39.65% of variance in two components, and the K-Means elbow curve shows no sharp transition. Nevertheless, three meaningful clusters emerge — differentiated almost exclusively by revenue and product traction — that align well with outcome distributions: Cluster 0 is dominated by acquisitions, Cluster 1 by failures, and Cluster 2 by young-founder startups with mixed results.</w:t>
+        <w:t>Unsupervised learning: PCA captures only 39.65% of variance in two components, and both k=2 and k=3 yield low silhouette scores (&lt; 0.17), indicating no strong natural cluster structure. Nevertheless, three interpretable startup archetypes emerge: mature high-revenue companies (Cluster 0), early-stage young-founder startups (Cluster 1), and low-traction struggling companies (Cluster 2). With k=2, Cluster 1 aligns strongly with Failure (79.7%), providing the clearest unsupervised-to-supervised link in the analysis.</w:t>
       </w:r>
     </w:p>
     <w:p>
@@ -6561,7 +7222,10 @@
         <w:spacing w:after="120"/>
       </w:pPr>
       <w:r>
-        <w:t>The key limitation of this work is the synthetic nature of the dataset: most features are generated independently with near-zero inter-correlations and near-zero predictive power. In a real startup dataset, one would expect richer inter-feature dependencies, stronger signals, and potentially higher model performance. Future work could apply SMOTE or class-weighted losses to address IPO imbalance, and explore ensemble methods (Random Forest, Gradient Boosting) for further gains.</w:t>
+        <w:rPr>
+          <w:sz w:val="22"/>
+        </w:rPr>
+        <w:t>The fundamental limitation of this work is the synthetic nature of the dataset: five of seven features carry near-zero signal, imposing a hard ceiling on both classification accuracy (~73%) and clustering quality. In a real startup dataset, richer feature dependencies would likely yield higher model performance and more coherent cluster structure.</w:t>
       </w:r>
     </w:p>
     <w:sectPr>

</xml_diff>

<commit_message>
Update report: LR uses max_iter=1000, no C tuning
- Table 5: LR row updated to 'no tuning (max_iter=1000)'
- Table 7: binary LR row updated same
- Section 4.1 intro: clarify k-NN/DT use GridSearchCV, LR/LDA use cross_val_score
- Remove all C hyperparameter references for LR

https://claude.ai/code/session_01QhGjCchUC55W7pMvffa1Aj
</commit_message>
<xml_diff>
--- a/scientificProject1/report/startup_success_report.docx
+++ b/scientificProject1/report/startup_success_report.docx
@@ -3713,7 +3713,10 @@
         <w:spacing w:after="120"/>
       </w:pPr>
       <w:r>
-        <w:t>We evaluated four classifiers: k-Nearest Neighbours (k-NN), Decision Tree, Logistic Regression, and Linear Discriminant Analysis (LDA). Each model was tuned via GridSearchCV with 5-fold StratifiedKFold cross-validation, using accuracy as the scoring metric. k-NN was trained on a 5,000-row stratified subsample due to its O(n²) complexity.</w:t>
+        <w:rPr>
+          <w:sz w:val="22"/>
+        </w:rPr>
+        <w:t>We evaluated four classifiers: k-Nearest Neighbours (k-NN), Decision Tree, Logistic Regression, and Linear Discriminant Analysis (LDA). k-NN and Decision Tree were tuned via GridSearchCV with 5-fold StratifiedKFold. Logistic Regression and LDA were evaluated directly with cross_val_score (no hyperparameter grid), following the course approach: LR uses max_iter=1000 with default regularisation, LDA has no critical hyperparameters.</w:t>
       </w:r>
     </w:p>
     <w:p>
@@ -3990,7 +3993,7 @@
               <w:rPr>
                 <w:sz w:val="20"/>
               </w:rPr>
-              <w:t>C ∈ {0.01, 0.1, 1, 10, 100}</w:t>
+              <w:t>no tuning (max_iter=1000)</w:t>
             </w:r>
           </w:p>
         </w:tc>
@@ -4006,7 +4009,7 @@
               <w:rPr>
                 <w:sz w:val="20"/>
               </w:rPr>
-              <w:t>C = 1</w:t>
+              <w:t>—</w:t>
             </w:r>
           </w:p>
         </w:tc>
@@ -4120,14 +4123,16 @@
         </w:rPr>
       </w:pPr>
       <w:r>
-        <w:t>A notable finding is that the best k for k-NN reached the upper boundary of the search grid (k = 201), even after extending the grid up to 201. This indicates that k-NN performs best with maximal smoothing — a strong signal that the data has no meaningful local neighbourhood structure</w:t>
+        <w:rPr>
+          <w:sz w:val="22"/>
+        </w:rPr>
+        <w:t>A notable finding is that the best k for k-NN reached the upper boundary of the search grid (k = 201), even after extending the grid to 201. This indicates that k-NN performs best with maximal smoothing — a strong signal that the data has no meaningful local neighbourhood structure, consistent with the synthetic nature of the dataset.</w:t>
       </w:r>
       <w:r>
         <w:rPr>
           <w:rFonts w:eastAsia="宋体" w:hint="eastAsia"/>
           <w:lang w:eastAsia="zh-CN"/>
         </w:rPr>
-        <w:t>.</w:t>
       </w:r>
     </w:p>
     <w:p/>
@@ -5101,7 +5106,7 @@
               <w:rPr>
                 <w:sz w:val="20"/>
               </w:rPr>
-              <w:t>C = 0.01</w:t>
+              <w:t>no tuning (max_iter=1000)</w:t>
             </w:r>
           </w:p>
         </w:tc>
@@ -5117,7 +5122,7 @@
               <w:rPr>
                 <w:sz w:val="20"/>
               </w:rPr>
-              <w:t>0.7427 ✓</w:t>
+              <w:t>0.7426 ✓</w:t>
             </w:r>
           </w:p>
         </w:tc>
@@ -5142,7 +5147,9 @@
         <w:spacing w:after="120"/>
       </w:pPr>
       <w:r>
-        <w:t>Logistic Regression again achieves the best CV accuracy (74.27%). Table 8 shows the classification report on the binary test set.</w:t>
+        <w:rPr>
+          <w:sz w:val="22"/>
+        </w:rPr>
       </w:r>
     </w:p>
     <w:tbl>

</xml_diff>

<commit_message>
Update report: Spearman footnote + expanded binary classification conclusion
- Add footnote (*) after 'Spearman rank correlations' in section 2.3
  explaining why Spearman is used over Pearson for categorical targets
- Expand conclusion para: 3-class model comparison details + binary results
  (macro F1 0.584→0.737, AUC 0.816, confirms imbalance was the bottleneck)

https://claude.ai/code/session_01QhGjCchUC55W7pMvffa1Aj
</commit_message>
<xml_diff>
--- a/scientificProject1/report/startup_success_report.docx
+++ b/scientificProject1/report/startup_success_report.docx
@@ -3152,44 +3152,49 @@
       <w:pPr>
         <w:spacing w:after="120"/>
       </w:pPr>
-      <w:r>
-        <w:t xml:space="preserve">A key finding of our EDA is that most features have very low predictive power for the outcome. We computed Spearman rank correlations between each numerical feature and the target (encoded ordinally). The results, shown in Table 4, reveal that only </w:t>
-      </w:r>
+      <w:r/>
       <w:r>
         <w:rPr>
           <w:b/>
         </w:rPr>
-        <w:t>revenue_million</w:t>
       </w:r>
-      <w:r>
-        <w:t xml:space="preserve"> (r = −0.34) and </w:t>
-      </w:r>
+      <w:r/>
       <w:r>
         <w:rPr>
           <w:b/>
         </w:rPr>
-        <w:t>product_traction_users</w:t>
       </w:r>
-      <w:r>
-        <w:t xml:space="preserve"> (r = −0.32) carry meaningful signal. The remaining five features — notably </w:t>
-      </w:r>
+      <w:r/>
       <w:r>
         <w:rPr>
           <w:b/>
         </w:rPr>
-        <w:t>market_size_billion</w:t>
       </w:r>
-      <w:r>
-        <w:t xml:space="preserve"> (r = 0.001) and </w:t>
-      </w:r>
+      <w:r/>
       <w:r>
         <w:rPr>
           <w:b/>
         </w:rPr>
-        <w:t>burn_rate_million</w:t>
+      </w:r>
+      <w:r/>
+      <w:r>
+        <w:rPr>
+          <w:sz w:val="22"/>
+        </w:rPr>
+        <w:t>A key finding of our EDA is that most features have very low predictive power for the outcome. We computed Spearman rank correlations</w:t>
       </w:r>
       <w:r>
-        <w:t xml:space="preserve"> (r = −0.001) — are essentially noise.</w:t>
+        <w:rPr>
+          <w:sz w:val="16"/>
+          <w:vertAlign w:val="superscript"/>
+        </w:rPr>
+        <w:t>*</w:t>
+      </w:r>
+      <w:r>
+        <w:rPr>
+          <w:sz w:val="22"/>
+        </w:rPr>
+        <w:t xml:space="preserve"> between each numerical feature and the target (encoded ordinally). The results, shown in Table 4, reveal that only revenue_million (r = −0.34) and product_traction_users (r = −0.32) carry meaningful signal. The remaining five features — notably market_size_billion (r = 0.001) and burn_rate_million (r = −0.001) — are essentially noise.</w:t>
       </w:r>
     </w:p>
     <w:tbl>
@@ -3645,6 +3650,19 @@
         </w:rPr>
         <w:lastRenderedPageBreak/>
         <w:t>Table 4 — Spearman correlation of each feature with the target variable.</w:t>
+      </w:r>
+    </w:p>
+    <w:p>
+      <w:pPr>
+        <w:spacing w:before="0" w:after="6"/>
+      </w:pPr>
+      <w:r>
+        <w:rPr>
+          <w:sz w:val="18"/>
+          <w:szCs w:val="18"/>
+          <w:color w:val="666666"/>
+        </w:rPr>
+        <w:t>* Spearman rank correlation measures monotonic association between a numerical feature and the ordinally-encoded target. Unlike Pearson, it does not assume a linear relationship, making it more appropriate when the target is a categorical variable encoded as integers.</w:t>
       </w:r>
     </w:p>
     <w:p>
@@ -7438,7 +7456,10 @@
         <w:spacing w:after="120"/>
       </w:pPr>
       <w:r>
-        <w:t>This project applied a complete supervised and unsupervised machine learning pipeline to a  dataset of 100,000 startup profiles.</w:t>
+        <w:rPr>
+          <w:sz w:val="22"/>
+        </w:rPr>
+        <w:t>Supervised learning (3-class): Logistic Regression achieves the best CV and test accuracy (CV = 73.00%, test = 72.90%), closely followed by LDA (72.58%) and Decision Tree (71.98%). The narrow gap between models (&lt; 2 pp) reflects the dataset's weak feature-target correlations rather than model capacity. The macro F1 of 0.584 is dragged down by the near-unlearnable IPO class (2.1% of data, recall = 0.19), which the model almost never predicts. Binary classification (Failure vs Acquisition): removing the 2,055 IPO samples and retraining on the remaining 97,945 samples raises macro F1 from 0.584 to 0.737 and ROC AUC to 0.816. All four models improve, with LR again performing best (CV = 74.26%). This confirms that class imbalance — not model architecture — was the primary bottleneck in the 3-class setting.</w:t>
       </w:r>
     </w:p>
     <w:p>

</xml_diff>

<commit_message>
Add 3-class ROC curve figure at end of section 4.3 in report
https://claude.ai/code/session_01QhGjCchUC55W7pMvffa1Aj
</commit_message>
<xml_diff>
--- a/scientificProject1/report/startup_success_report.docx
+++ b/scientificProject1/report/startup_success_report.docx
@@ -4839,6 +4839,61 @@
       </w:r>
     </w:p>
     <w:p/>
+    <w:p>
+      <w:pPr>
+        <w:jc w:val="center"/>
+        <w:jc w:val="center"/>
+      </w:pPr>
+      <w:r>
+        <w:drawing>
+          <wp:inline xmlns:a="http://schemas.openxmlformats.org/drawingml/2006/main" xmlns:pic="http://schemas.openxmlformats.org/drawingml/2006/picture">
+            <wp:extent cx="5029200" cy="3739989"/>
+            <wp:docPr id="1" name="Picture 1"/>
+            <wp:cNvGraphicFramePr>
+              <a:graphicFrameLocks noChangeAspect="1"/>
+            </wp:cNvGraphicFramePr>
+            <a:graphic>
+              <a:graphicData uri="http://schemas.openxmlformats.org/drawingml/2006/picture">
+                <pic:pic>
+                  <pic:nvPicPr>
+                    <pic:cNvPr id="0" name="roc_3class.png"/>
+                    <pic:cNvPicPr/>
+                  </pic:nvPicPr>
+                  <pic:blipFill>
+                    <a:blip r:embed="rId11"/>
+                    <a:stretch>
+                      <a:fillRect/>
+                    </a:stretch>
+                  </pic:blipFill>
+                  <pic:spPr>
+                    <a:xfrm>
+                      <a:off x="0" y="0"/>
+                      <a:ext cx="5029200" cy="3739989"/>
+                    </a:xfrm>
+                    <a:prstGeom prst="rect"/>
+                  </pic:spPr>
+                </pic:pic>
+              </a:graphicData>
+            </a:graphic>
+          </wp:inline>
+        </w:drawing>
+      </w:r>
+    </w:p>
+    <w:p>
+      <w:pPr>
+        <w:jc w:val="center"/>
+        <w:spacing w:before="20" w:after="120"/>
+      </w:pPr>
+      <w:r>
+        <w:rPr>
+          <w:i/>
+          <w:sz w:val="18"/>
+          <w:szCs w:val="18"/>
+          <w:color w:val="646464"/>
+        </w:rPr>
+        <w:t>Figure 1 — ROC Curves (One-vs-Rest) for Logistic Regression on the 3-class test set.</w:t>
+      </w:r>
+    </w:p>
     <w:p>
       <w:pPr>
         <w:pStyle w:val="21"/>

</xml_diff>

<commit_message>
Add two figures to report
- Figure 2: model comparison bar chart before section 4.2
- Figure 3: binary ROC curve (AUC=0.816) after section 4.4

https://claude.ai/code/session_01QhGjCchUC55W7pMvffa1Aj
</commit_message>
<xml_diff>
--- a/scientificProject1/report/startup_success_report.docx
+++ b/scientificProject1/report/startup_success_report.docx
@@ -4156,6 +4156,61 @@
     <w:p/>
     <w:p>
       <w:pPr>
+        <w:jc w:val="center"/>
+        <w:spacing w:before="20" w:after="120"/>
+      </w:pPr>
+      <w:r>
+        <w:rPr>
+          <w:i/>
+          <w:sz w:val="18"/>
+          <w:szCs w:val="18"/>
+          <w:color w:val="646464"/>
+        </w:rPr>
+        <w:t>Figure 2 — CV accuracy comparison for all four tuned models (5-fold StratifiedKFold).</w:t>
+      </w:r>
+    </w:p>
+    <w:p>
+      <w:pPr>
+        <w:jc w:val="center"/>
+        <w:jc w:val="center"/>
+      </w:pPr>
+      <w:r>
+        <w:drawing>
+          <wp:inline xmlns:a="http://schemas.openxmlformats.org/drawingml/2006/main" xmlns:pic="http://schemas.openxmlformats.org/drawingml/2006/picture">
+            <wp:extent cx="5029200" cy="2767570"/>
+            <wp:docPr id="2" name="Picture 2"/>
+            <wp:cNvGraphicFramePr>
+              <a:graphicFrameLocks noChangeAspect="1"/>
+            </wp:cNvGraphicFramePr>
+            <a:graphic>
+              <a:graphicData uri="http://schemas.openxmlformats.org/drawingml/2006/picture">
+                <pic:pic>
+                  <pic:nvPicPr>
+                    <pic:cNvPr id="0" name="model_comparison.png"/>
+                    <pic:cNvPicPr/>
+                  </pic:nvPicPr>
+                  <pic:blipFill>
+                    <a:blip r:embed="rId12"/>
+                    <a:stretch>
+                      <a:fillRect/>
+                    </a:stretch>
+                  </pic:blipFill>
+                  <pic:spPr>
+                    <a:xfrm>
+                      <a:off x="0" y="0"/>
+                      <a:ext cx="5029200" cy="2767570"/>
+                    </a:xfrm>
+                    <a:prstGeom prst="rect"/>
+                  </pic:spPr>
+                </pic:pic>
+              </a:graphicData>
+            </a:graphic>
+          </wp:inline>
+        </w:drawing>
+      </w:r>
+    </w:p>
+    <w:p>
+      <w:pPr>
         <w:pStyle w:val="21"/>
       </w:pPr>
       <w:bookmarkStart w:id="9" w:name="_Toc226026300"/>
@@ -5694,6 +5749,61 @@
       </w:r>
     </w:p>
     <w:p/>
+    <w:p>
+      <w:pPr>
+        <w:jc w:val="center"/>
+        <w:spacing w:before="20" w:after="120"/>
+      </w:pPr>
+      <w:r>
+        <w:rPr>
+          <w:i/>
+          <w:sz w:val="18"/>
+          <w:szCs w:val="18"/>
+          <w:color w:val="646464"/>
+        </w:rPr>
+        <w:t>Figure 3 — ROC Curve for binary Logistic Regression (Acquisition vs Failure), AUC = 0.8163.</w:t>
+      </w:r>
+    </w:p>
+    <w:p>
+      <w:pPr>
+        <w:jc w:val="center"/>
+        <w:jc w:val="center"/>
+      </w:pPr>
+      <w:r>
+        <w:drawing>
+          <wp:inline xmlns:a="http://schemas.openxmlformats.org/drawingml/2006/main" xmlns:pic="http://schemas.openxmlformats.org/drawingml/2006/picture">
+            <wp:extent cx="5029200" cy="3722970"/>
+            <wp:docPr id="3" name="Picture 3"/>
+            <wp:cNvGraphicFramePr>
+              <a:graphicFrameLocks noChangeAspect="1"/>
+            </wp:cNvGraphicFramePr>
+            <a:graphic>
+              <a:graphicData uri="http://schemas.openxmlformats.org/drawingml/2006/picture">
+                <pic:pic>
+                  <pic:nvPicPr>
+                    <pic:cNvPr id="0" name="roc_binary.png"/>
+                    <pic:cNvPicPr/>
+                  </pic:nvPicPr>
+                  <pic:blipFill>
+                    <a:blip r:embed="rId13"/>
+                    <a:stretch>
+                      <a:fillRect/>
+                    </a:stretch>
+                  </pic:blipFill>
+                  <pic:spPr>
+                    <a:xfrm>
+                      <a:off x="0" y="0"/>
+                      <a:ext cx="5029200" cy="3722970"/>
+                    </a:xfrm>
+                    <a:prstGeom prst="rect"/>
+                  </pic:spPr>
+                </pic:pic>
+              </a:graphicData>
+            </a:graphic>
+          </wp:inline>
+        </w:drawing>
+      </w:r>
+    </w:p>
     <w:p>
       <w:pPr>
         <w:pStyle w:val="1"/>

</xml_diff>

<commit_message>
Revert "Merge branch 'Yuzhen_modification' of http://127.0.0.1:39105/git/Clement-NI/Machine_learning_project_kaggle_start_up_success_data into Yuzhen_modification"
This reverts commit d01153d45f3b58329bf288ff3ce0668d98d56fb4, reversing
changes made to a2409ad06b259c5a6131ff49515a00f1d838d226.
</commit_message>
<xml_diff>
--- a/scientificProject1/report/startup_success_report.docx
+++ b/scientificProject1/report/startup_success_report.docx
@@ -120,7 +120,7 @@
           <w:r>
             <w:fldChar w:fldCharType="separate"/>
           </w:r>
-          <w:hyperlink w:anchor="_Toc226058545" w:history="1">
+          <w:hyperlink w:anchor="_Toc226057035" w:history="1">
             <w:r>
               <w:rPr>
                 <w:rStyle w:val="aff9"/>
@@ -147,7 +147,7 @@
                 <w:noProof/>
                 <w:webHidden/>
               </w:rPr>
-              <w:instrText xml:space="preserve"> PAGEREF _Toc226058545 \h </w:instrText>
+              <w:instrText xml:space="preserve"> PAGEREF _Toc226057035 \h </w:instrText>
             </w:r>
             <w:r>
               <w:rPr>
@@ -192,7 +192,7 @@
               <w14:ligatures w14:val="standardContextual"/>
             </w:rPr>
           </w:pPr>
-          <w:hyperlink w:anchor="_Toc226058546" w:history="1">
+          <w:hyperlink w:anchor="_Toc226057036" w:history="1">
             <w:r>
               <w:rPr>
                 <w:rStyle w:val="aff9"/>
@@ -219,7 +219,7 @@
                 <w:noProof/>
                 <w:webHidden/>
               </w:rPr>
-              <w:instrText xml:space="preserve"> PAGEREF _Toc226058546 \h </w:instrText>
+              <w:instrText xml:space="preserve"> PAGEREF _Toc226057036 \h </w:instrText>
             </w:r>
             <w:r>
               <w:rPr>
@@ -264,7 +264,7 @@
               <w14:ligatures w14:val="standardContextual"/>
             </w:rPr>
           </w:pPr>
-          <w:hyperlink w:anchor="_Toc226058547" w:history="1">
+          <w:hyperlink w:anchor="_Toc226057037" w:history="1">
             <w:r>
               <w:rPr>
                 <w:rStyle w:val="aff9"/>
@@ -291,7 +291,7 @@
                 <w:noProof/>
                 <w:webHidden/>
               </w:rPr>
-              <w:instrText xml:space="preserve"> PAGEREF _Toc226058547 \h </w:instrText>
+              <w:instrText xml:space="preserve"> PAGEREF _Toc226057037 \h </w:instrText>
             </w:r>
             <w:r>
               <w:rPr>
@@ -337,7 +337,7 @@
               <w14:ligatures w14:val="standardContextual"/>
             </w:rPr>
           </w:pPr>
-          <w:hyperlink w:anchor="_Toc226058548" w:history="1">
+          <w:hyperlink w:anchor="_Toc226057038" w:history="1">
             <w:r>
               <w:rPr>
                 <w:rStyle w:val="aff9"/>
@@ -364,7 +364,7 @@
                 <w:noProof/>
                 <w:webHidden/>
               </w:rPr>
-              <w:instrText xml:space="preserve"> PAGEREF _Toc226058548 \h </w:instrText>
+              <w:instrText xml:space="preserve"> PAGEREF _Toc226057038 \h </w:instrText>
             </w:r>
             <w:r>
               <w:rPr>
@@ -410,7 +410,7 @@
               <w14:ligatures w14:val="standardContextual"/>
             </w:rPr>
           </w:pPr>
-          <w:hyperlink w:anchor="_Toc226058549" w:history="1">
+          <w:hyperlink w:anchor="_Toc226057039" w:history="1">
             <w:r>
               <w:rPr>
                 <w:rStyle w:val="aff9"/>
@@ -437,7 +437,7 @@
                 <w:noProof/>
                 <w:webHidden/>
               </w:rPr>
-              <w:instrText xml:space="preserve"> PAGEREF _Toc226058549 \h </w:instrText>
+              <w:instrText xml:space="preserve"> PAGEREF _Toc226057039 \h </w:instrText>
             </w:r>
             <w:r>
               <w:rPr>
@@ -483,7 +483,7 @@
               <w14:ligatures w14:val="standardContextual"/>
             </w:rPr>
           </w:pPr>
-          <w:hyperlink w:anchor="_Toc226058550" w:history="1">
+          <w:hyperlink w:anchor="_Toc226057040" w:history="1">
             <w:r>
               <w:rPr>
                 <w:rStyle w:val="aff9"/>
@@ -510,7 +510,7 @@
                 <w:noProof/>
                 <w:webHidden/>
               </w:rPr>
-              <w:instrText xml:space="preserve"> PAGEREF _Toc226058550 \h </w:instrText>
+              <w:instrText xml:space="preserve"> PAGEREF _Toc226057040 \h </w:instrText>
             </w:r>
             <w:r>
               <w:rPr>
@@ -555,7 +555,7 @@
               <w14:ligatures w14:val="standardContextual"/>
             </w:rPr>
           </w:pPr>
-          <w:hyperlink w:anchor="_Toc226058551" w:history="1">
+          <w:hyperlink w:anchor="_Toc226057041" w:history="1">
             <w:r>
               <w:rPr>
                 <w:rStyle w:val="aff9"/>
@@ -582,7 +582,7 @@
                 <w:noProof/>
                 <w:webHidden/>
               </w:rPr>
-              <w:instrText xml:space="preserve"> PAGEREF _Toc226058551 \h </w:instrText>
+              <w:instrText xml:space="preserve"> PAGEREF _Toc226057041 \h </w:instrText>
             </w:r>
             <w:r>
               <w:rPr>
@@ -627,7 +627,7 @@
               <w14:ligatures w14:val="standardContextual"/>
             </w:rPr>
           </w:pPr>
-          <w:hyperlink w:anchor="_Toc226058552" w:history="1">
+          <w:hyperlink w:anchor="_Toc226057042" w:history="1">
             <w:r>
               <w:rPr>
                 <w:rStyle w:val="aff9"/>
@@ -654,7 +654,7 @@
                 <w:noProof/>
                 <w:webHidden/>
               </w:rPr>
-              <w:instrText xml:space="preserve"> PAGEREF _Toc226058552 \h </w:instrText>
+              <w:instrText xml:space="preserve"> PAGEREF _Toc226057042 \h </w:instrText>
             </w:r>
             <w:r>
               <w:rPr>
@@ -700,7 +700,7 @@
               <w14:ligatures w14:val="standardContextual"/>
             </w:rPr>
           </w:pPr>
-          <w:hyperlink w:anchor="_Toc226058553" w:history="1">
+          <w:hyperlink w:anchor="_Toc226057043" w:history="1">
             <w:r>
               <w:rPr>
                 <w:rStyle w:val="aff9"/>
@@ -727,7 +727,7 @@
                 <w:noProof/>
                 <w:webHidden/>
               </w:rPr>
-              <w:instrText xml:space="preserve"> PAGEREF _Toc226058553 \h </w:instrText>
+              <w:instrText xml:space="preserve"> PAGEREF _Toc226057043 \h </w:instrText>
             </w:r>
             <w:r>
               <w:rPr>
@@ -773,7 +773,7 @@
               <w14:ligatures w14:val="standardContextual"/>
             </w:rPr>
           </w:pPr>
-          <w:hyperlink w:anchor="_Toc226058554" w:history="1">
+          <w:hyperlink w:anchor="_Toc226057044" w:history="1">
             <w:r>
               <w:rPr>
                 <w:rStyle w:val="aff9"/>
@@ -800,7 +800,7 @@
                 <w:noProof/>
                 <w:webHidden/>
               </w:rPr>
-              <w:instrText xml:space="preserve"> PAGEREF _Toc226058554 \h </w:instrText>
+              <w:instrText xml:space="preserve"> PAGEREF _Toc226057044 \h </w:instrText>
             </w:r>
             <w:r>
               <w:rPr>
@@ -846,7 +846,7 @@
               <w14:ligatures w14:val="standardContextual"/>
             </w:rPr>
           </w:pPr>
-          <w:hyperlink w:anchor="_Toc226058555" w:history="1">
+          <w:hyperlink w:anchor="_Toc226057045" w:history="1">
             <w:r>
               <w:rPr>
                 <w:rStyle w:val="aff9"/>
@@ -873,7 +873,7 @@
                 <w:noProof/>
                 <w:webHidden/>
               </w:rPr>
-              <w:instrText xml:space="preserve"> PAGEREF _Toc226058555 \h </w:instrText>
+              <w:instrText xml:space="preserve"> PAGEREF _Toc226057045 \h </w:instrText>
             </w:r>
             <w:r>
               <w:rPr>
@@ -919,7 +919,7 @@
               <w14:ligatures w14:val="standardContextual"/>
             </w:rPr>
           </w:pPr>
-          <w:hyperlink w:anchor="_Toc226058556" w:history="1">
+          <w:hyperlink w:anchor="_Toc226057046" w:history="1">
             <w:r>
               <w:rPr>
                 <w:rStyle w:val="aff9"/>
@@ -946,7 +946,7 @@
                 <w:noProof/>
                 <w:webHidden/>
               </w:rPr>
-              <w:instrText xml:space="preserve"> PAGEREF _Toc226058556 \h </w:instrText>
+              <w:instrText xml:space="preserve"> PAGEREF _Toc226057046 \h </w:instrText>
             </w:r>
             <w:r>
               <w:rPr>
@@ -991,7 +991,7 @@
               <w14:ligatures w14:val="standardContextual"/>
             </w:rPr>
           </w:pPr>
-          <w:hyperlink w:anchor="_Toc226058557" w:history="1">
+          <w:hyperlink w:anchor="_Toc226057047" w:history="1">
             <w:r>
               <w:rPr>
                 <w:rStyle w:val="aff9"/>
@@ -1018,7 +1018,7 @@
                 <w:noProof/>
                 <w:webHidden/>
               </w:rPr>
-              <w:instrText xml:space="preserve"> PAGEREF _Toc226058557 \h </w:instrText>
+              <w:instrText xml:space="preserve"> PAGEREF _Toc226057047 \h </w:instrText>
             </w:r>
             <w:r>
               <w:rPr>
@@ -1064,7 +1064,7 @@
               <w14:ligatures w14:val="standardContextual"/>
             </w:rPr>
           </w:pPr>
-          <w:hyperlink w:anchor="_Toc226058558" w:history="1">
+          <w:hyperlink w:anchor="_Toc226057048" w:history="1">
             <w:r>
               <w:rPr>
                 <w:rStyle w:val="aff9"/>
@@ -1091,7 +1091,7 @@
                 <w:noProof/>
                 <w:webHidden/>
               </w:rPr>
-              <w:instrText xml:space="preserve"> PAGEREF _Toc226058558 \h </w:instrText>
+              <w:instrText xml:space="preserve"> PAGEREF _Toc226057048 \h </w:instrText>
             </w:r>
             <w:r>
               <w:rPr>
@@ -1137,7 +1137,7 @@
               <w14:ligatures w14:val="standardContextual"/>
             </w:rPr>
           </w:pPr>
-          <w:hyperlink w:anchor="_Toc226058559" w:history="1">
+          <w:hyperlink w:anchor="_Toc226057049" w:history="1">
             <w:r>
               <w:rPr>
                 <w:rStyle w:val="aff9"/>
@@ -1164,7 +1164,7 @@
                 <w:noProof/>
                 <w:webHidden/>
               </w:rPr>
-              <w:instrText xml:space="preserve"> PAGEREF _Toc226058559 \h </w:instrText>
+              <w:instrText xml:space="preserve"> PAGEREF _Toc226057049 \h </w:instrText>
             </w:r>
             <w:r>
               <w:rPr>
@@ -1210,7 +1210,7 @@
               <w14:ligatures w14:val="standardContextual"/>
             </w:rPr>
           </w:pPr>
-          <w:hyperlink w:anchor="_Toc226058560" w:history="1">
+          <w:hyperlink w:anchor="_Toc226057050" w:history="1">
             <w:r>
               <w:rPr>
                 <w:rStyle w:val="aff9"/>
@@ -1237,7 +1237,7 @@
                 <w:noProof/>
                 <w:webHidden/>
               </w:rPr>
-              <w:instrText xml:space="preserve"> PAGEREF _Toc226058560 \h </w:instrText>
+              <w:instrText xml:space="preserve"> PAGEREF _Toc226057050 \h </w:instrText>
             </w:r>
             <w:r>
               <w:rPr>
@@ -1283,7 +1283,7 @@
               <w14:ligatures w14:val="standardContextual"/>
             </w:rPr>
           </w:pPr>
-          <w:hyperlink w:anchor="_Toc226058561" w:history="1">
+          <w:hyperlink w:anchor="_Toc226057051" w:history="1">
             <w:r>
               <w:rPr>
                 <w:rStyle w:val="aff9"/>
@@ -1310,7 +1310,7 @@
                 <w:noProof/>
                 <w:webHidden/>
               </w:rPr>
-              <w:instrText xml:space="preserve"> PAGEREF _Toc226058561 \h </w:instrText>
+              <w:instrText xml:space="preserve"> PAGEREF _Toc226057051 \h </w:instrText>
             </w:r>
             <w:r>
               <w:rPr>
@@ -1356,7 +1356,7 @@
               <w14:ligatures w14:val="standardContextual"/>
             </w:rPr>
           </w:pPr>
-          <w:hyperlink w:anchor="_Toc226058562" w:history="1">
+          <w:hyperlink w:anchor="_Toc226057052" w:history="1">
             <w:r>
               <w:rPr>
                 <w:rStyle w:val="aff9"/>
@@ -1383,7 +1383,7 @@
                 <w:noProof/>
                 <w:webHidden/>
               </w:rPr>
-              <w:instrText xml:space="preserve"> PAGEREF _Toc226058562 \h </w:instrText>
+              <w:instrText xml:space="preserve"> PAGEREF _Toc226057052 \h </w:instrText>
             </w:r>
             <w:r>
               <w:rPr>
@@ -1429,7 +1429,7 @@
               <w14:ligatures w14:val="standardContextual"/>
             </w:rPr>
           </w:pPr>
-          <w:hyperlink w:anchor="_Toc226058563" w:history="1">
+          <w:hyperlink w:anchor="_Toc226057053" w:history="1">
             <w:r>
               <w:rPr>
                 <w:rStyle w:val="aff9"/>
@@ -1456,7 +1456,7 @@
                 <w:noProof/>
                 <w:webHidden/>
               </w:rPr>
-              <w:instrText xml:space="preserve"> PAGEREF _Toc226058563 \h </w:instrText>
+              <w:instrText xml:space="preserve"> PAGEREF _Toc226057053 \h </w:instrText>
             </w:r>
             <w:r>
               <w:rPr>
@@ -1501,7 +1501,7 @@
               <w14:ligatures w14:val="standardContextual"/>
             </w:rPr>
           </w:pPr>
-          <w:hyperlink w:anchor="_Toc226058564" w:history="1">
+          <w:hyperlink w:anchor="_Toc226057054" w:history="1">
             <w:r>
               <w:rPr>
                 <w:rStyle w:val="aff9"/>
@@ -1528,7 +1528,7 @@
                 <w:noProof/>
                 <w:webHidden/>
               </w:rPr>
-              <w:instrText xml:space="preserve"> PAGEREF _Toc226058564 \h </w:instrText>
+              <w:instrText xml:space="preserve"> PAGEREF _Toc226057054 \h </w:instrText>
             </w:r>
             <w:r>
               <w:rPr>
@@ -1607,7 +1607,7 @@
       <w:pPr>
         <w:pStyle w:val="1"/>
       </w:pPr>
-      <w:bookmarkStart w:id="0" w:name="_Toc226058545"/>
+      <w:bookmarkStart w:id="0" w:name="_Toc226057035"/>
       <w:r>
         <w:lastRenderedPageBreak/>
         <w:t>Introduction</w:t>
@@ -1667,14 +1667,9 @@
       <w:pPr>
         <w:pStyle w:val="1"/>
       </w:pPr>
-      <w:bookmarkStart w:id="1" w:name="_Toc226058546"/>
-      <w:proofErr w:type="gramStart"/>
+      <w:bookmarkStart w:id="1" w:name="_Toc226057036"/>
       <w:r>
-        <w:t>1  Dataset</w:t>
-      </w:r>
-      <w:proofErr w:type="gramEnd"/>
-      <w:r>
-        <w:t xml:space="preserve"> Description</w:t>
+        <w:t>1  Dataset Description</w:t>
       </w:r>
       <w:bookmarkEnd w:id="1"/>
     </w:p>
@@ -1683,15 +1678,7 @@
         <w:spacing w:after="120"/>
       </w:pPr>
       <w:r>
-        <w:t xml:space="preserve">The dataset was obtained from Kaggle and consists of 100,000 rows and 11 columns (7 numerical, 3 categorical, 1 target). There are no missing values. Table 1 </w:t>
-      </w:r>
-      <w:proofErr w:type="spellStart"/>
-      <w:r>
-        <w:t>summarises</w:t>
-      </w:r>
-      <w:proofErr w:type="spellEnd"/>
-      <w:r>
-        <w:t xml:space="preserve"> the features.</w:t>
+        <w:t>The dataset was obtained from Kaggle and consists of 100,000 rows and 11 columns (7 numerical, 3 categorical, 1 target). There are no missing values. Table 1 summarises the features.</w:t>
       </w:r>
     </w:p>
     <w:tbl>
@@ -1774,14 +1761,12 @@
             <w:pPr>
               <w:jc w:val="center"/>
             </w:pPr>
-            <w:proofErr w:type="spellStart"/>
             <w:r>
               <w:rPr>
                 <w:sz w:val="20"/>
               </w:rPr>
               <w:t>funding_rounds</w:t>
             </w:r>
-            <w:proofErr w:type="spellEnd"/>
           </w:p>
         </w:tc>
         <w:tc>
@@ -1829,14 +1814,12 @@
             <w:pPr>
               <w:jc w:val="center"/>
             </w:pPr>
-            <w:proofErr w:type="spellStart"/>
             <w:r>
               <w:rPr>
                 <w:sz w:val="20"/>
               </w:rPr>
               <w:t>founder_experience_years</w:t>
             </w:r>
-            <w:proofErr w:type="spellEnd"/>
           </w:p>
         </w:tc>
         <w:tc>
@@ -1884,14 +1867,12 @@
             <w:pPr>
               <w:jc w:val="center"/>
             </w:pPr>
-            <w:proofErr w:type="spellStart"/>
             <w:r>
               <w:rPr>
                 <w:sz w:val="20"/>
               </w:rPr>
               <w:t>team_size</w:t>
             </w:r>
-            <w:proofErr w:type="spellEnd"/>
           </w:p>
         </w:tc>
         <w:tc>
@@ -1939,14 +1920,12 @@
             <w:pPr>
               <w:jc w:val="center"/>
             </w:pPr>
-            <w:proofErr w:type="spellStart"/>
             <w:r>
               <w:rPr>
                 <w:sz w:val="20"/>
               </w:rPr>
               <w:t>market_size_billion</w:t>
             </w:r>
-            <w:proofErr w:type="spellEnd"/>
           </w:p>
         </w:tc>
         <w:tc>
@@ -1994,14 +1973,12 @@
             <w:pPr>
               <w:jc w:val="center"/>
             </w:pPr>
-            <w:proofErr w:type="spellStart"/>
             <w:r>
               <w:rPr>
                 <w:sz w:val="20"/>
               </w:rPr>
               <w:t>product_traction_users</w:t>
             </w:r>
-            <w:proofErr w:type="spellEnd"/>
           </w:p>
         </w:tc>
         <w:tc>
@@ -2049,14 +2026,12 @@
             <w:pPr>
               <w:jc w:val="center"/>
             </w:pPr>
-            <w:proofErr w:type="spellStart"/>
             <w:r>
               <w:rPr>
                 <w:sz w:val="20"/>
               </w:rPr>
               <w:t>burn_rate_million</w:t>
             </w:r>
-            <w:proofErr w:type="spellEnd"/>
           </w:p>
         </w:tc>
         <w:tc>
@@ -2104,14 +2079,12 @@
             <w:pPr>
               <w:jc w:val="center"/>
             </w:pPr>
-            <w:proofErr w:type="spellStart"/>
             <w:r>
               <w:rPr>
                 <w:sz w:val="20"/>
               </w:rPr>
               <w:t>revenue_million</w:t>
             </w:r>
-            <w:proofErr w:type="spellEnd"/>
           </w:p>
         </w:tc>
         <w:tc>
@@ -2159,14 +2132,12 @@
             <w:pPr>
               <w:jc w:val="center"/>
             </w:pPr>
-            <w:proofErr w:type="spellStart"/>
             <w:r>
               <w:rPr>
                 <w:sz w:val="20"/>
               </w:rPr>
               <w:t>investor_type</w:t>
             </w:r>
-            <w:proofErr w:type="spellEnd"/>
           </w:p>
         </w:tc>
         <w:tc>
@@ -2267,14 +2238,12 @@
             <w:pPr>
               <w:jc w:val="center"/>
             </w:pPr>
-            <w:proofErr w:type="spellStart"/>
             <w:r>
               <w:rPr>
                 <w:sz w:val="20"/>
               </w:rPr>
               <w:t>founder_background</w:t>
             </w:r>
-            <w:proofErr w:type="spellEnd"/>
           </w:p>
         </w:tc>
         <w:tc>
@@ -2305,44 +2274,8 @@
               <w:rPr>
                 <w:sz w:val="20"/>
               </w:rPr>
-              <w:t xml:space="preserve">academic / </w:t>
-            </w:r>
-            <w:proofErr w:type="spellStart"/>
-            <w:r>
-              <w:rPr>
-                <w:sz w:val="20"/>
-              </w:rPr>
-              <w:t>first_time</w:t>
-            </w:r>
-            <w:proofErr w:type="spellEnd"/>
-            <w:r>
-              <w:rPr>
-                <w:sz w:val="20"/>
-              </w:rPr>
-              <w:t xml:space="preserve"> / </w:t>
-            </w:r>
-            <w:proofErr w:type="spellStart"/>
-            <w:r>
-              <w:rPr>
-                <w:sz w:val="20"/>
-              </w:rPr>
-              <w:t>ex_bigtech</w:t>
-            </w:r>
-            <w:proofErr w:type="spellEnd"/>
-            <w:r>
-              <w:rPr>
-                <w:sz w:val="20"/>
-              </w:rPr>
-              <w:t xml:space="preserve"> / </w:t>
-            </w:r>
-            <w:proofErr w:type="spellStart"/>
-            <w:r>
-              <w:rPr>
-                <w:sz w:val="20"/>
-              </w:rPr>
-              <w:t>serial_founder</w:t>
-            </w:r>
-            <w:proofErr w:type="spellEnd"/>
+              <w:t>academic / first_time / ex_bigtech / serial_founder</w:t>
+            </w:r>
           </w:p>
         </w:tc>
       </w:tr>
@@ -2419,15 +2352,10 @@
       <w:pPr>
         <w:pStyle w:val="1"/>
       </w:pPr>
-      <w:bookmarkStart w:id="2" w:name="_Toc226058547"/>
-      <w:proofErr w:type="gramStart"/>
+      <w:bookmarkStart w:id="2" w:name="_Toc226057037"/>
       <w:r>
         <w:lastRenderedPageBreak/>
-        <w:t>2  Exploratory</w:t>
-      </w:r>
-      <w:proofErr w:type="gramEnd"/>
-      <w:r>
-        <w:t xml:space="preserve"> Data Analysis</w:t>
+        <w:t>2  Exploratory Data Analysis</w:t>
       </w:r>
       <w:bookmarkEnd w:id="2"/>
     </w:p>
@@ -2435,14 +2363,9 @@
       <w:pPr>
         <w:pStyle w:val="21"/>
       </w:pPr>
-      <w:bookmarkStart w:id="3" w:name="_Toc226058548"/>
-      <w:proofErr w:type="gramStart"/>
+      <w:bookmarkStart w:id="3" w:name="_Toc226057038"/>
       <w:r>
-        <w:t>2.1  Class</w:t>
-      </w:r>
-      <w:proofErr w:type="gramEnd"/>
-      <w:r>
-        <w:t xml:space="preserve"> Distribution</w:t>
+        <w:t>2.1  Class Distribution</w:t>
       </w:r>
       <w:bookmarkEnd w:id="3"/>
     </w:p>
@@ -2701,14 +2624,9 @@
       <w:pPr>
         <w:pStyle w:val="21"/>
       </w:pPr>
-      <w:bookmarkStart w:id="4" w:name="_Toc226058549"/>
-      <w:proofErr w:type="gramStart"/>
+      <w:bookmarkStart w:id="4" w:name="_Toc226057039"/>
       <w:r>
-        <w:t>2.2  Feature</w:t>
-      </w:r>
-      <w:proofErr w:type="gramEnd"/>
-      <w:r>
-        <w:t xml:space="preserve"> Distributions and Skewness</w:t>
+        <w:t>2.2  Feature Distributions and Skewness</w:t>
       </w:r>
       <w:bookmarkEnd w:id="4"/>
     </w:p>
@@ -2719,58 +2637,48 @@
       <w:r>
         <w:t xml:space="preserve">Histograms reveal that several numerical features have right-skewed distributions, as quantified in Table 3. In particular, </w:t>
       </w:r>
-      <w:proofErr w:type="spellStart"/>
       <w:r>
         <w:rPr>
           <w:b/>
         </w:rPr>
         <w:t>market_size_billion</w:t>
       </w:r>
-      <w:proofErr w:type="spellEnd"/>
       <w:r>
         <w:t xml:space="preserve"> (skewness = 5.26) and </w:t>
       </w:r>
-      <w:proofErr w:type="spellStart"/>
       <w:r>
         <w:rPr>
           <w:b/>
         </w:rPr>
         <w:t>burn_rate_million</w:t>
       </w:r>
-      <w:proofErr w:type="spellEnd"/>
       <w:r>
         <w:t xml:space="preserve"> (skewness = 3.35) are heavily skewed, while </w:t>
       </w:r>
-      <w:proofErr w:type="spellStart"/>
       <w:r>
         <w:rPr>
           <w:b/>
         </w:rPr>
         <w:t>revenue_million</w:t>
       </w:r>
-      <w:proofErr w:type="spellEnd"/>
       <w:r>
         <w:t xml:space="preserve"> shows moderate skewness (1.25). Features such as </w:t>
       </w:r>
-      <w:proofErr w:type="spellStart"/>
       <w:r>
         <w:rPr>
           <w:b/>
         </w:rPr>
         <w:t>founder_experience_years</w:t>
       </w:r>
-      <w:proofErr w:type="spellEnd"/>
       <w:r>
         <w:t xml:space="preserve"> and </w:t>
       </w:r>
-      <w:proofErr w:type="spellStart"/>
       <w:r>
         <w:rPr>
           <w:b/>
         </w:rPr>
         <w:t>team_size</w:t>
       </w:r>
-      <w:proofErr w:type="spellEnd"/>
       <w:r>
         <w:t xml:space="preserve"> are approximately symmetric (skewness ≈ 0).</w:t>
       </w:r>
@@ -2855,14 +2763,12 @@
             <w:pPr>
               <w:jc w:val="center"/>
             </w:pPr>
-            <w:proofErr w:type="spellStart"/>
             <w:r>
               <w:rPr>
                 <w:sz w:val="20"/>
               </w:rPr>
               <w:t>funding_rounds</w:t>
             </w:r>
-            <w:proofErr w:type="spellEnd"/>
           </w:p>
         </w:tc>
         <w:tc>
@@ -2910,14 +2816,12 @@
             <w:pPr>
               <w:jc w:val="center"/>
             </w:pPr>
-            <w:proofErr w:type="spellStart"/>
             <w:r>
               <w:rPr>
                 <w:sz w:val="20"/>
               </w:rPr>
               <w:t>founder_experience_years</w:t>
             </w:r>
-            <w:proofErr w:type="spellEnd"/>
           </w:p>
         </w:tc>
         <w:tc>
@@ -2965,14 +2869,12 @@
             <w:pPr>
               <w:jc w:val="center"/>
             </w:pPr>
-            <w:proofErr w:type="spellStart"/>
             <w:r>
               <w:rPr>
                 <w:sz w:val="20"/>
               </w:rPr>
               <w:t>team_size</w:t>
             </w:r>
-            <w:proofErr w:type="spellEnd"/>
           </w:p>
         </w:tc>
         <w:tc>
@@ -3020,14 +2922,12 @@
             <w:pPr>
               <w:jc w:val="center"/>
             </w:pPr>
-            <w:proofErr w:type="spellStart"/>
             <w:r>
               <w:rPr>
                 <w:sz w:val="20"/>
               </w:rPr>
               <w:t>market_size_billion</w:t>
             </w:r>
-            <w:proofErr w:type="spellEnd"/>
           </w:p>
         </w:tc>
         <w:tc>
@@ -3075,14 +2975,12 @@
             <w:pPr>
               <w:jc w:val="center"/>
             </w:pPr>
-            <w:proofErr w:type="spellStart"/>
             <w:r>
               <w:rPr>
                 <w:sz w:val="20"/>
               </w:rPr>
               <w:t>product_traction_users</w:t>
             </w:r>
-            <w:proofErr w:type="spellEnd"/>
           </w:p>
         </w:tc>
         <w:tc>
@@ -3130,14 +3028,12 @@
             <w:pPr>
               <w:jc w:val="center"/>
             </w:pPr>
-            <w:proofErr w:type="spellStart"/>
             <w:r>
               <w:rPr>
                 <w:sz w:val="20"/>
               </w:rPr>
               <w:t>burn_rate_million</w:t>
             </w:r>
-            <w:proofErr w:type="spellEnd"/>
           </w:p>
         </w:tc>
         <w:tc>
@@ -3185,14 +3081,12 @@
             <w:pPr>
               <w:jc w:val="center"/>
             </w:pPr>
-            <w:proofErr w:type="spellStart"/>
             <w:r>
               <w:rPr>
                 <w:sz w:val="20"/>
               </w:rPr>
               <w:t>revenue_million</w:t>
             </w:r>
-            <w:proofErr w:type="spellEnd"/>
           </w:p>
         </w:tc>
         <w:tc>
@@ -3251,14 +3145,9 @@
       <w:pPr>
         <w:pStyle w:val="21"/>
       </w:pPr>
-      <w:bookmarkStart w:id="5" w:name="_Toc226058550"/>
-      <w:proofErr w:type="gramStart"/>
+      <w:bookmarkStart w:id="5" w:name="_Toc226057040"/>
       <w:r>
-        <w:t>2.3  Feature</w:t>
-      </w:r>
-      <w:proofErr w:type="gramEnd"/>
-      <w:r>
-        <w:t xml:space="preserve"> Quality Analysis</w:t>
+        <w:t>2.3  Feature Quality Analysis</w:t>
       </w:r>
       <w:bookmarkEnd w:id="5"/>
     </w:p>
@@ -3277,39 +3166,7 @@
         <w:t>*</w:t>
       </w:r>
       <w:r>
-        <w:t xml:space="preserve"> between each numerical feature and the target (encoded ordinally). The results, shown in Table 4, reveal that only </w:t>
-      </w:r>
-      <w:proofErr w:type="spellStart"/>
-      <w:r>
-        <w:t>revenue_million</w:t>
-      </w:r>
-      <w:proofErr w:type="spellEnd"/>
-      <w:r>
-        <w:t xml:space="preserve"> (r = −0.34) and </w:t>
-      </w:r>
-      <w:proofErr w:type="spellStart"/>
-      <w:r>
-        <w:t>product_traction_users</w:t>
-      </w:r>
-      <w:proofErr w:type="spellEnd"/>
-      <w:r>
-        <w:t xml:space="preserve"> (r = −0.32) carry meaningful signal. The remaining five features — notably </w:t>
-      </w:r>
-      <w:proofErr w:type="spellStart"/>
-      <w:r>
-        <w:t>market_size_billion</w:t>
-      </w:r>
-      <w:proofErr w:type="spellEnd"/>
-      <w:r>
-        <w:t xml:space="preserve"> (r = 0.001) and </w:t>
-      </w:r>
-      <w:proofErr w:type="spellStart"/>
-      <w:r>
-        <w:t>burn_rate_million</w:t>
-      </w:r>
-      <w:proofErr w:type="spellEnd"/>
-      <w:r>
-        <w:t xml:space="preserve"> (r = −0.001) — are essentially noise.</w:t>
+        <w:t xml:space="preserve"> between each numerical feature and the target (encoded ordinally). The results, shown in Table 4, reveal that only revenue_million (r = −0.34) and product_traction_users (r = −0.32) carry meaningful signal. The remaining five features — notably market_size_billion (r = 0.001) and burn_rate_million (r = −0.001) — are essentially noise.</w:t>
       </w:r>
     </w:p>
     <w:tbl>
@@ -3392,14 +3249,12 @@
             <w:pPr>
               <w:jc w:val="center"/>
             </w:pPr>
-            <w:proofErr w:type="spellStart"/>
             <w:r>
               <w:rPr>
                 <w:sz w:val="20"/>
               </w:rPr>
               <w:t>revenue_million</w:t>
             </w:r>
-            <w:proofErr w:type="spellEnd"/>
           </w:p>
         </w:tc>
         <w:tc>
@@ -3447,14 +3302,12 @@
             <w:pPr>
               <w:jc w:val="center"/>
             </w:pPr>
-            <w:proofErr w:type="spellStart"/>
             <w:r>
               <w:rPr>
                 <w:sz w:val="20"/>
               </w:rPr>
               <w:t>product_traction_users</w:t>
             </w:r>
-            <w:proofErr w:type="spellEnd"/>
           </w:p>
         </w:tc>
         <w:tc>
@@ -3502,14 +3355,12 @@
             <w:pPr>
               <w:jc w:val="center"/>
             </w:pPr>
-            <w:proofErr w:type="spellStart"/>
             <w:r>
               <w:rPr>
                 <w:sz w:val="20"/>
               </w:rPr>
               <w:t>funding_rounds</w:t>
             </w:r>
-            <w:proofErr w:type="spellEnd"/>
           </w:p>
         </w:tc>
         <w:tc>
@@ -3557,14 +3408,12 @@
             <w:pPr>
               <w:jc w:val="center"/>
             </w:pPr>
-            <w:proofErr w:type="spellStart"/>
             <w:r>
               <w:rPr>
                 <w:sz w:val="20"/>
               </w:rPr>
               <w:t>founder_experience_years</w:t>
             </w:r>
-            <w:proofErr w:type="spellEnd"/>
           </w:p>
         </w:tc>
         <w:tc>
@@ -3612,14 +3461,12 @@
             <w:pPr>
               <w:jc w:val="center"/>
             </w:pPr>
-            <w:proofErr w:type="spellStart"/>
             <w:r>
               <w:rPr>
                 <w:sz w:val="20"/>
               </w:rPr>
               <w:t>team_size</w:t>
             </w:r>
-            <w:proofErr w:type="spellEnd"/>
           </w:p>
         </w:tc>
         <w:tc>
@@ -3667,14 +3514,12 @@
             <w:pPr>
               <w:jc w:val="center"/>
             </w:pPr>
-            <w:proofErr w:type="spellStart"/>
             <w:r>
               <w:rPr>
                 <w:sz w:val="20"/>
               </w:rPr>
               <w:t>burn_rate_million</w:t>
             </w:r>
-            <w:proofErr w:type="spellEnd"/>
           </w:p>
         </w:tc>
         <w:tc>
@@ -3722,14 +3567,12 @@
             <w:pPr>
               <w:jc w:val="center"/>
             </w:pPr>
-            <w:proofErr w:type="spellStart"/>
             <w:r>
               <w:rPr>
                 <w:sz w:val="20"/>
               </w:rPr>
               <w:t>market_size_billion</w:t>
             </w:r>
-            <w:proofErr w:type="spellEnd"/>
           </w:p>
         </w:tc>
         <w:tc>
@@ -3786,23 +3629,7 @@
       </w:pPr>
       <w:r>
         <w:lastRenderedPageBreak/>
-        <w:t xml:space="preserve">Furthermore, the maximum inter-feature Pearson correlation is 0.714 (between </w:t>
-      </w:r>
-      <w:proofErr w:type="spellStart"/>
-      <w:r>
-        <w:t>revenue_million</w:t>
-      </w:r>
-      <w:proofErr w:type="spellEnd"/>
-      <w:r>
-        <w:t xml:space="preserve"> and </w:t>
-      </w:r>
-      <w:proofErr w:type="spellStart"/>
-      <w:r>
-        <w:t>product_traction_users</w:t>
-      </w:r>
-      <w:proofErr w:type="spellEnd"/>
-      <w:r>
-        <w:t>), but most pairs are near zero. This absence of natural structure limits the discriminative power of all models trained on this data.</w:t>
+        <w:t>Furthermore, the maximum inter-feature Pearson correlation is 0.714 (between revenue_million and product_traction_users), but most pairs are near zero. This absence of natural structure limits the discriminative power of all models trained on this data.</w:t>
       </w:r>
     </w:p>
     <w:p/>
@@ -3810,36 +3637,18 @@
       <w:pPr>
         <w:pStyle w:val="1"/>
       </w:pPr>
-      <w:bookmarkStart w:id="6" w:name="_Toc226058551"/>
-      <w:proofErr w:type="gramStart"/>
+      <w:bookmarkStart w:id="6" w:name="_Toc226057041"/>
       <w:r>
         <w:t>3  Preprocessing</w:t>
       </w:r>
       <w:bookmarkEnd w:id="6"/>
-      <w:proofErr w:type="gramEnd"/>
     </w:p>
     <w:p>
       <w:pPr>
         <w:spacing w:after="120"/>
       </w:pPr>
       <w:r>
-        <w:t>We built a modular preprocessing pipeline using scikit-</w:t>
-      </w:r>
-      <w:proofErr w:type="spellStart"/>
-      <w:r>
-        <w:t>learn's</w:t>
-      </w:r>
-      <w:proofErr w:type="spellEnd"/>
-      <w:r>
-        <w:t xml:space="preserve"> Pipeline and </w:t>
-      </w:r>
-      <w:proofErr w:type="spellStart"/>
-      <w:r>
-        <w:t>ColumnTransformer</w:t>
-      </w:r>
-      <w:proofErr w:type="spellEnd"/>
-      <w:r>
-        <w:t xml:space="preserve"> (following the TD07 pattern), which ensures identical transformations are applied at training and inference time with no data leakage.</w:t>
+        <w:t>We built a modular preprocessing pipeline using scikit-learn's Pipeline and ColumnTransformer (following the TD07 pattern), which ensures identical transformations are applied at training and inference time with no data leakage.</w:t>
       </w:r>
     </w:p>
     <w:p>
@@ -3853,15 +3662,7 @@
         <w:t>Numerical features</w:t>
       </w:r>
       <w:r>
-        <w:t xml:space="preserve"> were transformed with log1p (to reduce skewness) followed by </w:t>
-      </w:r>
-      <w:proofErr w:type="spellStart"/>
-      <w:r>
-        <w:t>StandardScaler</w:t>
-      </w:r>
-      <w:proofErr w:type="spellEnd"/>
-      <w:r>
-        <w:t xml:space="preserve"> (zero mean, unit variance). </w:t>
+        <w:t xml:space="preserve"> were transformed with log1p (to reduce skewness) followed by StandardScaler (zero mean, unit variance). </w:t>
       </w:r>
       <w:r>
         <w:rPr>
@@ -3870,31 +3671,7 @@
         <w:t>Categorical features</w:t>
       </w:r>
       <w:r>
-        <w:t xml:space="preserve"> (</w:t>
-      </w:r>
-      <w:proofErr w:type="spellStart"/>
-      <w:r>
-        <w:t>investor_type</w:t>
-      </w:r>
-      <w:proofErr w:type="spellEnd"/>
-      <w:r>
-        <w:t xml:space="preserve">, sector, </w:t>
-      </w:r>
-      <w:proofErr w:type="spellStart"/>
-      <w:r>
-        <w:t>founder_background</w:t>
-      </w:r>
-      <w:proofErr w:type="spellEnd"/>
-      <w:r>
-        <w:t xml:space="preserve">) were encoded with </w:t>
-      </w:r>
-      <w:proofErr w:type="spellStart"/>
-      <w:r>
-        <w:t>OrdinalEncoder</w:t>
-      </w:r>
-      <w:proofErr w:type="spellEnd"/>
-      <w:r>
-        <w:t>, assigning an integer rank to each category. The dataset was split 80/20 into training (80,000 samples) and test sets (20,000 samples) using stratified sampling to preserve class proportions.</w:t>
+        <w:t xml:space="preserve"> (investor_type, sector, founder_background) were encoded with OrdinalEncoder, assigning an integer rank to each category. The dataset was split 80/20 into training (80,000 samples) and test sets (20,000 samples) using stratified sampling to preserve class proportions.</w:t>
       </w:r>
     </w:p>
     <w:p/>
@@ -3902,14 +3679,9 @@
       <w:pPr>
         <w:pStyle w:val="1"/>
       </w:pPr>
-      <w:bookmarkStart w:id="7" w:name="_Toc226058552"/>
-      <w:proofErr w:type="gramStart"/>
+      <w:bookmarkStart w:id="7" w:name="_Toc226057042"/>
       <w:r>
-        <w:t>4  Supervised</w:t>
-      </w:r>
-      <w:proofErr w:type="gramEnd"/>
-      <w:r>
-        <w:t xml:space="preserve"> Learning</w:t>
+        <w:t>4  Supervised Learning</w:t>
       </w:r>
       <w:bookmarkEnd w:id="7"/>
     </w:p>
@@ -3918,69 +3690,16 @@
         <w:spacing w:after="120"/>
       </w:pPr>
       <w:r>
-        <w:t xml:space="preserve">We evaluated four classifiers: k-Nearest </w:t>
-      </w:r>
-      <w:proofErr w:type="spellStart"/>
-      <w:r>
-        <w:t>Neighbours</w:t>
-      </w:r>
-      <w:proofErr w:type="spellEnd"/>
-      <w:r>
-        <w:t xml:space="preserve"> (k-NN), Decision Tree, Logistic Regression, and Linear Discriminant Analysis (LDA). k-NN and Decision Tree were tuned via </w:t>
-      </w:r>
-      <w:proofErr w:type="spellStart"/>
-      <w:r>
-        <w:t>GridSearchCV</w:t>
-      </w:r>
-      <w:proofErr w:type="spellEnd"/>
-      <w:r>
-        <w:t xml:space="preserve"> with 5-fold </w:t>
-      </w:r>
-      <w:proofErr w:type="spellStart"/>
-      <w:r>
-        <w:t>StratifiedKFold</w:t>
-      </w:r>
-      <w:proofErr w:type="spellEnd"/>
-      <w:r>
-        <w:t xml:space="preserve">. Logistic Regression and LDA were evaluated directly with </w:t>
-      </w:r>
-      <w:proofErr w:type="spellStart"/>
-      <w:r>
-        <w:t>cross_val_score</w:t>
-      </w:r>
-      <w:proofErr w:type="spellEnd"/>
-      <w:r>
-        <w:t xml:space="preserve"> (no hyperparameter grid), following the course approach: LR uses </w:t>
-      </w:r>
-      <w:proofErr w:type="spellStart"/>
-      <w:r>
-        <w:t>max_iter</w:t>
-      </w:r>
-      <w:proofErr w:type="spellEnd"/>
-      <w:r>
-        <w:t xml:space="preserve">=1000 with default </w:t>
-      </w:r>
-      <w:proofErr w:type="spellStart"/>
-      <w:r>
-        <w:t>regularisation</w:t>
-      </w:r>
-      <w:proofErr w:type="spellEnd"/>
-      <w:r>
-        <w:t>, LDA has no critical hyperparameters.</w:t>
+        <w:t>We evaluated four classifiers: k-Nearest Neighbours (k-NN), Decision Tree, Logistic Regression, and Linear Discriminant Analysis (LDA). k-NN and Decision Tree were tuned via GridSearchCV with 5-fold StratifiedKFold. Logistic Regression and LDA were evaluated directly with cross_val_score (no hyperparameter grid), following the course approach: LR uses max_iter=1000 with default regularisation, LDA has no critical hyperparameters.</w:t>
       </w:r>
     </w:p>
     <w:p>
       <w:pPr>
         <w:pStyle w:val="21"/>
       </w:pPr>
-      <w:bookmarkStart w:id="8" w:name="_Toc226058553"/>
-      <w:proofErr w:type="gramStart"/>
+      <w:bookmarkStart w:id="8" w:name="_Toc226057043"/>
       <w:r>
-        <w:t>4.1  Hyperparameter</w:t>
-      </w:r>
-      <w:proofErr w:type="gramEnd"/>
-      <w:r>
-        <w:t xml:space="preserve"> Tuning</w:t>
+        <w:t>4.1  Hyperparameter Tuning</w:t>
       </w:r>
       <w:bookmarkEnd w:id="8"/>
     </w:p>
@@ -3989,15 +3708,7 @@
         <w:spacing w:after="120"/>
       </w:pPr>
       <w:r>
-        <w:t xml:space="preserve">Table 5 </w:t>
-      </w:r>
-      <w:proofErr w:type="spellStart"/>
-      <w:r>
-        <w:t>summarises</w:t>
-      </w:r>
-      <w:proofErr w:type="spellEnd"/>
-      <w:r>
-        <w:t xml:space="preserve"> the best hyperparameters and cross-validated accuracy for each model.</w:t>
+        <w:t>Table 5 summarises the best hyperparameters and cross-validated accuracy for each model.</w:t>
       </w:r>
     </w:p>
     <w:tbl>
@@ -4118,21 +3829,7 @@
               <w:rPr>
                 <w:sz w:val="20"/>
               </w:rPr>
-              <w:t>k ∈ {3,</w:t>
-            </w:r>
-            <w:proofErr w:type="gramStart"/>
-            <w:r>
-              <w:rPr>
-                <w:sz w:val="20"/>
-              </w:rPr>
-              <w:t>5,7,…</w:t>
-            </w:r>
-            <w:proofErr w:type="gramEnd"/>
-            <w:r>
-              <w:rPr>
-                <w:sz w:val="20"/>
-              </w:rPr>
-              <w:t>,201}</w:t>
+              <w:t>k ∈ {3,5,7,…,201}</w:t>
             </w:r>
           </w:p>
         </w:tc>
@@ -4197,42 +3894,12 @@
             <w:pPr>
               <w:jc w:val="center"/>
             </w:pPr>
-            <w:proofErr w:type="spellStart"/>
-            <w:r>
-              <w:rPr>
-                <w:sz w:val="20"/>
-              </w:rPr>
-              <w:t>max_depth</w:t>
-            </w:r>
-            <w:proofErr w:type="spellEnd"/>
-            <w:r>
-              <w:rPr>
-                <w:sz w:val="20"/>
-              </w:rPr>
-              <w:t xml:space="preserve"> ∈ {5,10,15,</w:t>
-            </w:r>
-            <w:proofErr w:type="gramStart"/>
-            <w:r>
-              <w:rPr>
-                <w:sz w:val="20"/>
-              </w:rPr>
-              <w:t>20,None</w:t>
-            </w:r>
-            <w:proofErr w:type="gramEnd"/>
-            <w:r>
-              <w:rPr>
-                <w:sz w:val="20"/>
-              </w:rPr>
-              <w:t xml:space="preserve">}, </w:t>
-            </w:r>
-            <w:proofErr w:type="spellStart"/>
-            <w:r>
-              <w:rPr>
-                <w:sz w:val="20"/>
-              </w:rPr>
-              <w:t>min_split</w:t>
-            </w:r>
-            <w:proofErr w:type="spellEnd"/>
+            <w:r>
+              <w:rPr>
+                <w:sz w:val="20"/>
+              </w:rPr>
+              <w:t>max_depth ∈ {5,10,15,20,None}, min_split</w:t>
+            </w:r>
           </w:p>
         </w:tc>
         <w:tc>
@@ -4243,33 +3910,11 @@
             <w:pPr>
               <w:jc w:val="center"/>
             </w:pPr>
-            <w:proofErr w:type="spellStart"/>
-            <w:r>
-              <w:rPr>
-                <w:sz w:val="20"/>
-              </w:rPr>
-              <w:t>max_depth</w:t>
-            </w:r>
-            <w:proofErr w:type="spellEnd"/>
-            <w:r>
-              <w:rPr>
-                <w:sz w:val="20"/>
-              </w:rPr>
-              <w:t xml:space="preserve">=10, </w:t>
-            </w:r>
-            <w:proofErr w:type="spellStart"/>
-            <w:r>
-              <w:rPr>
-                <w:sz w:val="20"/>
-              </w:rPr>
-              <w:t>min_split</w:t>
-            </w:r>
-            <w:proofErr w:type="spellEnd"/>
-            <w:r>
-              <w:rPr>
-                <w:sz w:val="20"/>
-              </w:rPr>
-              <w:t>=50</w:t>
+            <w:r>
+              <w:rPr>
+                <w:sz w:val="20"/>
+              </w:rPr>
+              <w:t>max_depth=10, min_split=50</w:t>
             </w:r>
           </w:p>
         </w:tc>
@@ -4322,21 +3967,7 @@
               <w:rPr>
                 <w:sz w:val="20"/>
               </w:rPr>
-              <w:t>no tuning (</w:t>
-            </w:r>
-            <w:proofErr w:type="spellStart"/>
-            <w:r>
-              <w:rPr>
-                <w:sz w:val="20"/>
-              </w:rPr>
-              <w:t>max_iter</w:t>
-            </w:r>
-            <w:proofErr w:type="spellEnd"/>
-            <w:r>
-              <w:rPr>
-                <w:sz w:val="20"/>
-              </w:rPr>
-              <w:t>=1000)</w:t>
+              <w:t>no tuning (max_iter=1000)</w:t>
             </w:r>
           </w:p>
         </w:tc>
@@ -4484,15 +4115,7 @@
         </w:rPr>
       </w:pPr>
       <w:r>
-        <w:t xml:space="preserve">A notable finding is that the best k for k-NN reached the upper boundary of the search grid (k = 201), even after extending the grid to 201. This indicates that k-NN performs best with maximal smoothing — a strong signal that the data has no meaningful local </w:t>
-      </w:r>
-      <w:proofErr w:type="spellStart"/>
-      <w:r>
-        <w:t>neighbourhood</w:t>
-      </w:r>
-      <w:proofErr w:type="spellEnd"/>
-      <w:r>
-        <w:t xml:space="preserve"> structure, consistent with the synthetic nature of the dataset.</w:t>
+        <w:t>A notable finding is that the best k for k-NN reached the upper boundary of the search grid (k = 201), even after extending the grid to 201. This indicates that k-NN performs best with maximal smoothing — a strong signal that the data has no meaningful local neighbourhood structure, consistent with the synthetic nature of the dataset.</w:t>
       </w:r>
     </w:p>
     <w:p/>
@@ -4592,27 +4215,7 @@
           <w:sz w:val="18"/>
           <w:szCs w:val="18"/>
         </w:rPr>
-        <w:t xml:space="preserve"> — CV accuracy comparison for all four tuned models (5-fold </w:t>
-      </w:r>
-      <w:proofErr w:type="spellStart"/>
-      <w:r>
-        <w:rPr>
-          <w:i/>
-          <w:color w:val="646464"/>
-          <w:sz w:val="18"/>
-          <w:szCs w:val="18"/>
-        </w:rPr>
-        <w:t>StratifiedKFold</w:t>
-      </w:r>
-      <w:proofErr w:type="spellEnd"/>
-      <w:r>
-        <w:rPr>
-          <w:i/>
-          <w:color w:val="646464"/>
-          <w:sz w:val="18"/>
-          <w:szCs w:val="18"/>
-        </w:rPr>
-        <w:t>).</w:t>
+        <w:t xml:space="preserve"> — CV accuracy comparison for all four tuned models (5-fold StratifiedKFold).</w:t>
       </w:r>
     </w:p>
     <w:p>
@@ -4624,14 +4227,9 @@
       <w:pPr>
         <w:pStyle w:val="21"/>
       </w:pPr>
-      <w:bookmarkStart w:id="9" w:name="_Toc226058554"/>
-      <w:proofErr w:type="gramStart"/>
+      <w:bookmarkStart w:id="9" w:name="_Toc226057044"/>
       <w:r>
-        <w:t>4.2  Model</w:t>
-      </w:r>
-      <w:proofErr w:type="gramEnd"/>
-      <w:r>
-        <w:t xml:space="preserve"> Comparison</w:t>
+        <w:t>4.2  Model Comparison</w:t>
       </w:r>
       <w:bookmarkEnd w:id="9"/>
     </w:p>
@@ -4657,14 +4255,9 @@
       <w:pPr>
         <w:pStyle w:val="21"/>
       </w:pPr>
-      <w:bookmarkStart w:id="10" w:name="_Toc226058555"/>
-      <w:proofErr w:type="gramStart"/>
+      <w:bookmarkStart w:id="10" w:name="_Toc226057045"/>
       <w:r>
-        <w:t>4.3  Final</w:t>
-      </w:r>
-      <w:proofErr w:type="gramEnd"/>
-      <w:r>
-        <w:t xml:space="preserve"> Model Evaluation — Logistic Regression</w:t>
+        <w:t>4.3  Final Model Evaluation — Logistic Regression</w:t>
       </w:r>
       <w:bookmarkEnd w:id="10"/>
     </w:p>
@@ -5310,23 +4903,7 @@
         <w:spacing w:after="120"/>
       </w:pPr>
       <w:r>
-        <w:t xml:space="preserve">The model performs well on Failure (F1 = 0.775) and reasonably on Acquisition (F1 = 0.682), but struggles with IPO (F1 = 0.296, Recall = 0.190). The low recall for IPO is a direct consequence of class imbalance: with only 2.1% of samples, the model rarely predicts this class. The ROC curves (one-vs-rest) confirm this, and feature importances show that </w:t>
-      </w:r>
-      <w:proofErr w:type="spellStart"/>
-      <w:r>
-        <w:t>revenue_million</w:t>
-      </w:r>
-      <w:proofErr w:type="spellEnd"/>
-      <w:r>
-        <w:t xml:space="preserve"> and </w:t>
-      </w:r>
-      <w:proofErr w:type="spellStart"/>
-      <w:r>
-        <w:t>product_traction_users</w:t>
-      </w:r>
-      <w:proofErr w:type="spellEnd"/>
-      <w:r>
-        <w:t xml:space="preserve"> dominate the decision boundary.</w:t>
+        <w:t>The model performs well on Failure (F1 = 0.775) and reasonably on Acquisition (F1 = 0.682), but struggles with IPO (F1 = 0.296, Recall = 0.190). The low recall for IPO is a direct consequence of class imbalance: with only 2.1% of samples, the model rarely predicts this class. The ROC curves (one-vs-rest) confirm this, and feature importances show that revenue_million and product_traction_users dominate the decision boundary.</w:t>
       </w:r>
     </w:p>
     <w:p/>
@@ -5414,14 +4991,9 @@
       <w:pPr>
         <w:pStyle w:val="21"/>
       </w:pPr>
-      <w:bookmarkStart w:id="11" w:name="_Toc226058556"/>
-      <w:proofErr w:type="gramStart"/>
+      <w:bookmarkStart w:id="11" w:name="_Toc226057046"/>
       <w:r>
-        <w:t>4.4  Binary</w:t>
-      </w:r>
-      <w:proofErr w:type="gramEnd"/>
-      <w:r>
-        <w:t xml:space="preserve"> Classification — Failure vs Acquisition</w:t>
+        <w:t>4.4  Binary Classification — Failure vs Acquisition</w:t>
       </w:r>
       <w:bookmarkEnd w:id="11"/>
     </w:p>
@@ -5438,23 +5010,7 @@
         <w:spacing w:after="120"/>
       </w:pPr>
       <w:r>
-        <w:t xml:space="preserve">Table 7 </w:t>
-      </w:r>
-      <w:proofErr w:type="spellStart"/>
-      <w:r>
-        <w:t>summarises</w:t>
-      </w:r>
-      <w:proofErr w:type="spellEnd"/>
-      <w:r>
-        <w:t xml:space="preserve"> the </w:t>
-      </w:r>
-      <w:proofErr w:type="spellStart"/>
-      <w:r>
-        <w:t>GridSearchCV</w:t>
-      </w:r>
-      <w:proofErr w:type="spellEnd"/>
-      <w:r>
-        <w:t xml:space="preserve"> results on the binary dataset.</w:t>
+        <w:t>Table 7 summarises the GridSearchCV results on the binary dataset.</w:t>
       </w:r>
     </w:p>
     <w:tbl>
@@ -5606,33 +5162,11 @@
             <w:pPr>
               <w:jc w:val="center"/>
             </w:pPr>
-            <w:proofErr w:type="spellStart"/>
-            <w:r>
-              <w:rPr>
-                <w:sz w:val="20"/>
-              </w:rPr>
-              <w:t>max_depth</w:t>
-            </w:r>
-            <w:proofErr w:type="spellEnd"/>
-            <w:r>
-              <w:rPr>
-                <w:sz w:val="20"/>
-              </w:rPr>
-              <w:t xml:space="preserve">=10, </w:t>
-            </w:r>
-            <w:proofErr w:type="spellStart"/>
-            <w:r>
-              <w:rPr>
-                <w:sz w:val="20"/>
-              </w:rPr>
-              <w:t>min_split</w:t>
-            </w:r>
-            <w:proofErr w:type="spellEnd"/>
-            <w:r>
-              <w:rPr>
-                <w:sz w:val="20"/>
-              </w:rPr>
-              <w:t>=50</w:t>
+            <w:r>
+              <w:rPr>
+                <w:sz w:val="20"/>
+              </w:rPr>
+              <w:t>max_depth=10, min_split=50</w:t>
             </w:r>
           </w:p>
         </w:tc>
@@ -5738,21 +5272,7 @@
               <w:rPr>
                 <w:sz w:val="20"/>
               </w:rPr>
-              <w:t>no tuning (</w:t>
-            </w:r>
-            <w:proofErr w:type="spellStart"/>
-            <w:r>
-              <w:rPr>
-                <w:sz w:val="20"/>
-              </w:rPr>
-              <w:t>max_iter</w:t>
-            </w:r>
-            <w:proofErr w:type="spellEnd"/>
-            <w:r>
-              <w:rPr>
-                <w:sz w:val="20"/>
-              </w:rPr>
-              <w:t>=1000)</w:t>
+              <w:t>no tuning (max_iter=1000)</w:t>
             </w:r>
           </w:p>
         </w:tc>
@@ -5785,25 +5305,7 @@
           <w:color w:val="646464"/>
           <w:sz w:val="18"/>
         </w:rPr>
-        <w:t xml:space="preserve">Table 7 — Binary classification </w:t>
-      </w:r>
-      <w:proofErr w:type="spellStart"/>
-      <w:r>
-        <w:rPr>
-          <w:i/>
-          <w:color w:val="646464"/>
-          <w:sz w:val="18"/>
-        </w:rPr>
-        <w:t>GridSearchCV</w:t>
-      </w:r>
-      <w:proofErr w:type="spellEnd"/>
-      <w:r>
-        <w:rPr>
-          <w:i/>
-          <w:color w:val="646464"/>
-          <w:sz w:val="18"/>
-        </w:rPr>
-        <w:t xml:space="preserve"> results.</w:t>
+        <w:t>Table 7 — Binary classification GridSearchCV results.</w:t>
       </w:r>
     </w:p>
     <w:p>
@@ -6380,14 +5882,9 @@
       <w:pPr>
         <w:pStyle w:val="1"/>
       </w:pPr>
-      <w:bookmarkStart w:id="12" w:name="_Toc226058557"/>
-      <w:proofErr w:type="gramStart"/>
+      <w:bookmarkStart w:id="12" w:name="_Toc226057047"/>
       <w:r>
-        <w:t>5  Unsupervised</w:t>
-      </w:r>
-      <w:proofErr w:type="gramEnd"/>
-      <w:r>
-        <w:t xml:space="preserve"> Learning</w:t>
+        <w:t>5  Unsupervised Learning</w:t>
       </w:r>
       <w:bookmarkEnd w:id="12"/>
     </w:p>
@@ -6404,14 +5901,9 @@
       <w:pPr>
         <w:pStyle w:val="21"/>
       </w:pPr>
-      <w:bookmarkStart w:id="13" w:name="_Toc226058558"/>
-      <w:proofErr w:type="gramStart"/>
+      <w:bookmarkStart w:id="13" w:name="_Toc226057048"/>
       <w:r>
-        <w:t>5.1  PCA</w:t>
-      </w:r>
-      <w:proofErr w:type="gramEnd"/>
-      <w:r>
-        <w:t xml:space="preserve"> — Variance Analysis</w:t>
+        <w:t>5.1  PCA — Variance Analysis</w:t>
       </w:r>
       <w:bookmarkEnd w:id="13"/>
     </w:p>
@@ -6670,14 +6162,9 @@
       <w:pPr>
         <w:pStyle w:val="21"/>
       </w:pPr>
-      <w:bookmarkStart w:id="14" w:name="_Toc226058559"/>
-      <w:proofErr w:type="gramStart"/>
+      <w:bookmarkStart w:id="14" w:name="_Toc226057049"/>
       <w:r>
-        <w:t>5.2  Choosing</w:t>
-      </w:r>
-      <w:proofErr w:type="gramEnd"/>
-      <w:r>
-        <w:t xml:space="preserve"> k — Comparing k=2 and k=3</w:t>
+        <w:t>5.2  Choosing k — Comparing k=2 and k=3</w:t>
       </w:r>
       <w:bookmarkEnd w:id="14"/>
     </w:p>
@@ -6891,14 +6378,9 @@
       <w:pPr>
         <w:pStyle w:val="21"/>
       </w:pPr>
-      <w:bookmarkStart w:id="15" w:name="_Toc226058560"/>
-      <w:proofErr w:type="gramStart"/>
+      <w:bookmarkStart w:id="15" w:name="_Toc226057050"/>
       <w:r>
-        <w:t>5.3  Cluster</w:t>
-      </w:r>
-      <w:proofErr w:type="gramEnd"/>
-      <w:r>
-        <w:t xml:space="preserve"> Profiles</w:t>
+        <w:t>5.3  Cluster Profiles</w:t>
       </w:r>
       <w:bookmarkEnd w:id="15"/>
     </w:p>
@@ -7008,14 +6490,12 @@
             <w:pPr>
               <w:jc w:val="center"/>
             </w:pPr>
-            <w:proofErr w:type="spellStart"/>
             <w:r>
               <w:rPr>
                 <w:sz w:val="20"/>
               </w:rPr>
               <w:t>revenue_million</w:t>
             </w:r>
-            <w:proofErr w:type="spellEnd"/>
           </w:p>
         </w:tc>
         <w:tc>
@@ -7079,14 +6559,12 @@
             <w:pPr>
               <w:jc w:val="center"/>
             </w:pPr>
-            <w:proofErr w:type="spellStart"/>
             <w:r>
               <w:rPr>
                 <w:sz w:val="20"/>
               </w:rPr>
               <w:t>product_traction_users</w:t>
             </w:r>
-            <w:proofErr w:type="spellEnd"/>
           </w:p>
         </w:tc>
         <w:tc>
@@ -7150,14 +6628,12 @@
             <w:pPr>
               <w:jc w:val="center"/>
             </w:pPr>
-            <w:proofErr w:type="spellStart"/>
             <w:r>
               <w:rPr>
                 <w:sz w:val="20"/>
               </w:rPr>
               <w:t>founder_experience_years</w:t>
             </w:r>
-            <w:proofErr w:type="spellEnd"/>
           </w:p>
         </w:tc>
         <w:tc>
@@ -7221,14 +6697,12 @@
             <w:pPr>
               <w:jc w:val="center"/>
             </w:pPr>
-            <w:proofErr w:type="spellStart"/>
             <w:r>
               <w:rPr>
                 <w:sz w:val="20"/>
               </w:rPr>
               <w:t>funding_rounds</w:t>
             </w:r>
-            <w:proofErr w:type="spellEnd"/>
           </w:p>
         </w:tc>
         <w:tc>
@@ -7292,14 +6766,12 @@
             <w:pPr>
               <w:jc w:val="center"/>
             </w:pPr>
-            <w:proofErr w:type="spellStart"/>
             <w:r>
               <w:rPr>
                 <w:sz w:val="20"/>
               </w:rPr>
               <w:t>team_size</w:t>
             </w:r>
-            <w:proofErr w:type="spellEnd"/>
           </w:p>
         </w:tc>
         <w:tc>
@@ -7363,14 +6835,12 @@
             <w:pPr>
               <w:jc w:val="center"/>
             </w:pPr>
-            <w:proofErr w:type="spellStart"/>
             <w:r>
               <w:rPr>
                 <w:sz w:val="20"/>
               </w:rPr>
               <w:t>market_size_billion</w:t>
             </w:r>
-            <w:proofErr w:type="spellEnd"/>
           </w:p>
         </w:tc>
         <w:tc>
@@ -7434,14 +6904,12 @@
             <w:pPr>
               <w:jc w:val="center"/>
             </w:pPr>
-            <w:proofErr w:type="spellStart"/>
             <w:r>
               <w:rPr>
                 <w:sz w:val="20"/>
               </w:rPr>
               <w:t>burn_rate_million</w:t>
             </w:r>
-            <w:proofErr w:type="spellEnd"/>
           </w:p>
         </w:tc>
         <w:tc>
@@ -7513,39 +6981,7 @@
         <w:spacing w:after="120"/>
       </w:pPr>
       <w:r>
-        <w:t xml:space="preserve">The clusters are differentiated almost exclusively by revenue and product traction. </w:t>
-      </w:r>
-      <w:proofErr w:type="spellStart"/>
-      <w:r>
-        <w:t>team_size</w:t>
-      </w:r>
-      <w:proofErr w:type="spellEnd"/>
-      <w:r>
-        <w:t xml:space="preserve">, </w:t>
-      </w:r>
-      <w:proofErr w:type="spellStart"/>
-      <w:r>
-        <w:t>market_size_billion</w:t>
-      </w:r>
-      <w:proofErr w:type="spellEnd"/>
-      <w:r>
-        <w:t xml:space="preserve">, </w:t>
-      </w:r>
-      <w:proofErr w:type="spellStart"/>
-      <w:r>
-        <w:t>burn_rate_million</w:t>
-      </w:r>
-      <w:proofErr w:type="spellEnd"/>
-      <w:r>
-        <w:t xml:space="preserve">, and </w:t>
-      </w:r>
-      <w:proofErr w:type="spellStart"/>
-      <w:r>
-        <w:t>funding_rounds</w:t>
-      </w:r>
-      <w:proofErr w:type="spellEnd"/>
-      <w:r>
-        <w:t xml:space="preserve"> are nearly identical across all three clusters, confirming they carry no structural information.</w:t>
+        <w:t>The clusters are differentiated almost exclusively by revenue and product traction. team_size, market_size_billion, burn_rate_million, and funding_rounds are nearly identical across all three clusters, confirming they carry no structural information.</w:t>
       </w:r>
     </w:p>
     <w:p>
@@ -7560,14 +6996,9 @@
       <w:pPr>
         <w:pStyle w:val="21"/>
       </w:pPr>
-      <w:bookmarkStart w:id="16" w:name="_Toc226058561"/>
-      <w:proofErr w:type="gramStart"/>
+      <w:bookmarkStart w:id="16" w:name="_Toc226057051"/>
       <w:r>
-        <w:t>5.4  Cluster</w:t>
-      </w:r>
-      <w:proofErr w:type="gramEnd"/>
-      <w:r>
-        <w:t xml:space="preserve"> Archetypes</w:t>
+        <w:t>5.4  Cluster Archetypes</w:t>
       </w:r>
       <w:bookmarkEnd w:id="16"/>
     </w:p>
@@ -7967,14 +7398,9 @@
       <w:pPr>
         <w:pStyle w:val="21"/>
       </w:pPr>
-      <w:bookmarkStart w:id="17" w:name="_Toc226058562"/>
-      <w:proofErr w:type="gramStart"/>
+      <w:bookmarkStart w:id="17" w:name="_Toc226057052"/>
       <w:r>
-        <w:t>5.5  k</w:t>
-      </w:r>
-      <w:proofErr w:type="gramEnd"/>
-      <w:r>
-        <w:t>=2 vs Failure / Non-Failure</w:t>
+        <w:t>5.5  k=2 vs Failure / Non-Failure</w:t>
       </w:r>
       <w:bookmarkEnd w:id="17"/>
     </w:p>
@@ -7983,15 +7409,7 @@
         <w:spacing w:after="120"/>
       </w:pPr>
       <w:r>
-        <w:t xml:space="preserve">As a sanity check, we compare k=2 clusters with a binary outcome grouping (Failure vs </w:t>
-      </w:r>
-      <w:proofErr w:type="gramStart"/>
-      <w:r>
-        <w:t>Non-Failure</w:t>
-      </w:r>
-      <w:proofErr w:type="gramEnd"/>
-      <w:r>
-        <w:t>). Table 13 shows the composition.</w:t>
+        <w:t>As a sanity check, we compare k=2 clusters with a binary outcome grouping (Failure vs Non-Failure). Table 13 shows the composition.</w:t>
       </w:r>
     </w:p>
     <w:tbl>
@@ -8144,16 +7562,8 @@
               <w:rPr>
                 <w:sz w:val="20"/>
               </w:rPr>
-              <w:t xml:space="preserve">Mostly </w:t>
-            </w:r>
-            <w:proofErr w:type="gramStart"/>
-            <w:r>
-              <w:rPr>
-                <w:sz w:val="20"/>
-              </w:rPr>
-              <w:t>Non-Failure</w:t>
-            </w:r>
-            <w:proofErr w:type="gramEnd"/>
+              <w:t>Mostly Non-Failure</w:t>
+            </w:r>
           </w:p>
         </w:tc>
       </w:tr>
@@ -8254,14 +7664,9 @@
       <w:pPr>
         <w:pStyle w:val="21"/>
       </w:pPr>
-      <w:bookmarkStart w:id="18" w:name="_Toc226058563"/>
-      <w:proofErr w:type="gramStart"/>
+      <w:bookmarkStart w:id="18" w:name="_Toc226057053"/>
       <w:r>
-        <w:t>5.6  Hierarchical</w:t>
-      </w:r>
-      <w:proofErr w:type="gramEnd"/>
-      <w:r>
-        <w:t xml:space="preserve"> Clustering</w:t>
+        <w:t>5.6  Hierarchical Clustering</w:t>
       </w:r>
       <w:bookmarkEnd w:id="18"/>
     </w:p>
@@ -8270,23 +7675,7 @@
         <w:spacing w:after="120"/>
       </w:pPr>
       <w:r>
-        <w:t xml:space="preserve">We applied Agglomerative Clustering with Ward linkage on a 2,000-row subsample. The dendrogram was reconstructed from the </w:t>
-      </w:r>
-      <w:proofErr w:type="spellStart"/>
-      <w:r>
-        <w:t>sklearn</w:t>
-      </w:r>
-      <w:proofErr w:type="spellEnd"/>
-      <w:r>
-        <w:t xml:space="preserve"> model using the TD06 method. With k=3, the hierarchical solution produces a more imbalanced partition (Cluster 0: 78%, Cluster 1: 15%, Cluster 2: 7%) compared to K-Means (53/27/20%). This is expected: Ward linkage </w:t>
-      </w:r>
-      <w:proofErr w:type="spellStart"/>
-      <w:r>
-        <w:t>minimises</w:t>
-      </w:r>
-      <w:proofErr w:type="spellEnd"/>
-      <w:r>
-        <w:t xml:space="preserve"> intra-cluster variance without any constraint on cluster size, while K-Means tends toward more balanced partitions.</w:t>
+        <w:t>We applied Agglomerative Clustering with Ward linkage on a 2,000-row subsample. The dendrogram was reconstructed from the sklearn model using the TD06 method. With k=3, the hierarchical solution produces a more imbalanced partition (Cluster 0: 78%, Cluster 1: 15%, Cluster 2: 7%) compared to K-Means (53/27/20%). This is expected: Ward linkage minimises intra-cluster variance without any constraint on cluster size, while K-Means tends toward more balanced partitions.</w:t>
       </w:r>
     </w:p>
     <w:p>
@@ -8302,13 +7691,11 @@
       <w:pPr>
         <w:pStyle w:val="1"/>
       </w:pPr>
-      <w:bookmarkStart w:id="19" w:name="_Toc226058564"/>
-      <w:proofErr w:type="gramStart"/>
+      <w:bookmarkStart w:id="19" w:name="_Toc226057054"/>
       <w:r>
         <w:t>6  Conclusion</w:t>
       </w:r>
       <w:bookmarkEnd w:id="19"/>
-      <w:proofErr w:type="gramEnd"/>
     </w:p>
     <w:p>
       <w:pPr>

</xml_diff>

<commit_message>
Add three figures to report + re-run notebook for updated cluster profiles
- Figure 4 (binary model comparison bar chart) inserted between Table 7 and Table 8 in section 4.4
- Figure 5 (cluster profiles split bar chart) inserted at end of section 5.3
- Figure 6 (K-Means vs Hierarchical side-by-side PCA) inserted at end of section 5.4
- Re-ran notebook to generate updated split bar chart (small vs large scale features)

https://claude.ai/code/session_01QhGjCchUC55W7pMvffa1Aj
</commit_message>
<xml_diff>
--- a/scientificProject1/report/startup_success_report.docx
+++ b/scientificProject1/report/startup_success_report.docx
@@ -5310,6 +5310,57 @@
     </w:p>
     <w:p>
       <w:pPr>
+        <w:jc w:val="center"/>
+      </w:pPr>
+      <w:r>
+        <w:drawing>
+          <wp:inline xmlns:a="http://schemas.openxmlformats.org/drawingml/2006/main" xmlns:pic="http://schemas.openxmlformats.org/drawingml/2006/picture">
+            <wp:extent cx="5029200" cy="2772000"/>
+            <wp:docPr id="4" name="Picture 4"/>
+            <wp:cNvGraphicFramePr>
+              <a:graphicFrameLocks noChangeAspect="1"/>
+            </wp:cNvGraphicFramePr>
+            <a:graphic>
+              <a:graphicData uri="http://schemas.openxmlformats.org/drawingml/2006/picture">
+                <pic:pic>
+                  <pic:nvPicPr>
+                    <pic:cNvPr id="0" name="binary_model_comparison.png"/>
+                    <pic:cNvPicPr/>
+                  </pic:nvPicPr>
+                  <pic:blipFill>
+                    <a:blip r:embed="rId14"/>
+                    <a:stretch>
+                      <a:fillRect/>
+                    </a:stretch>
+                  </pic:blipFill>
+                  <pic:spPr>
+                    <a:xfrm>
+                      <a:off x="0" y="0"/>
+                      <a:ext cx="5029200" cy="2772000"/>
+                    </a:xfrm>
+                    <a:prstGeom prst="rect"/>
+                  </pic:spPr>
+                </pic:pic>
+              </a:graphicData>
+            </a:graphic>
+          </wp:inline>
+        </w:drawing>
+      </w:r>
+    </w:p>
+    <w:p>
+      <w:pPr>
+        <w:jc w:val="center"/>
+      </w:pPr>
+      <w:r>
+        <w:rPr>
+          <w:i/>
+          <w:sz w:val="20"/>
+        </w:rPr>
+        <w:t>Figure 4 — CV accuracy comparison for the four models on the binary dataset (Failure vs Acquisition).</w:t>
+      </w:r>
+    </w:p>
+    <w:p>
+      <w:pPr>
         <w:spacing w:after="120"/>
         <w:rPr>
           <w:rFonts w:eastAsia="宋体"/>
@@ -6986,6 +7037,57 @@
     </w:p>
     <w:p>
       <w:pPr>
+        <w:jc w:val="center"/>
+      </w:pPr>
+      <w:r>
+        <w:drawing>
+          <wp:inline xmlns:a="http://schemas.openxmlformats.org/drawingml/2006/main" xmlns:pic="http://schemas.openxmlformats.org/drawingml/2006/picture">
+            <wp:extent cx="5486400" cy="2047473"/>
+            <wp:docPr id="5" name="Picture 5"/>
+            <wp:cNvGraphicFramePr>
+              <a:graphicFrameLocks noChangeAspect="1"/>
+            </wp:cNvGraphicFramePr>
+            <a:graphic>
+              <a:graphicData uri="http://schemas.openxmlformats.org/drawingml/2006/picture">
+                <pic:pic>
+                  <pic:nvPicPr>
+                    <pic:cNvPr id="0" name="cluster_profiles.png"/>
+                    <pic:cNvPicPr/>
+                  </pic:nvPicPr>
+                  <pic:blipFill>
+                    <a:blip r:embed="rId15"/>
+                    <a:stretch>
+                      <a:fillRect/>
+                    </a:stretch>
+                  </pic:blipFill>
+                  <pic:spPr>
+                    <a:xfrm>
+                      <a:off x="0" y="0"/>
+                      <a:ext cx="5486400" cy="2047473"/>
+                    </a:xfrm>
+                    <a:prstGeom prst="rect"/>
+                  </pic:spPr>
+                </pic:pic>
+              </a:graphicData>
+            </a:graphic>
+          </wp:inline>
+        </w:drawing>
+      </w:r>
+    </w:p>
+    <w:p>
+      <w:pPr>
+        <w:jc w:val="center"/>
+      </w:pPr>
+      <w:r>
+        <w:rPr>
+          <w:i/>
+          <w:sz w:val="20"/>
+        </w:rPr>
+        <w:t>Figure 5 — Cluster profiles (mean feature values). Left: small-scale features; Right: large-scale features.</w:t>
+      </w:r>
+    </w:p>
+    <w:p>
+      <w:pPr>
         <w:rPr>
           <w:rFonts w:eastAsia="宋体" w:hint="eastAsia"/>
           <w:lang w:eastAsia="zh-CN"/>
@@ -7391,6 +7493,57 @@
       <w:r>
         <w:lastRenderedPageBreak/>
         <w:t>This interpretation is independent of the outcome labels and has its own business logic: the feature space naturally separates companies by their revenue level and traction, which reflects their development stage. Note that K-Means clusters do not correspond one-to-one with the outcome classes — this would only be possible if the features perfectly predicted the outcome, which they do not (synthetic data limitation).</w:t>
+      </w:r>
+    </w:p>
+    <w:p>
+      <w:pPr>
+        <w:jc w:val="center"/>
+      </w:pPr>
+      <w:r>
+        <w:drawing>
+          <wp:inline xmlns:a="http://schemas.openxmlformats.org/drawingml/2006/main" xmlns:pic="http://schemas.openxmlformats.org/drawingml/2006/picture">
+            <wp:extent cx="5486400" cy="2338336"/>
+            <wp:docPr id="6" name="Picture 6"/>
+            <wp:cNvGraphicFramePr>
+              <a:graphicFrameLocks noChangeAspect="1"/>
+            </wp:cNvGraphicFramePr>
+            <a:graphic>
+              <a:graphicData uri="http://schemas.openxmlformats.org/drawingml/2006/picture">
+                <pic:pic>
+                  <pic:nvPicPr>
+                    <pic:cNvPr id="0" name="kmeans_vs_hc.png"/>
+                    <pic:cNvPicPr/>
+                  </pic:nvPicPr>
+                  <pic:blipFill>
+                    <a:blip r:embed="rId16"/>
+                    <a:stretch>
+                      <a:fillRect/>
+                    </a:stretch>
+                  </pic:blipFill>
+                  <pic:spPr>
+                    <a:xfrm>
+                      <a:off x="0" y="0"/>
+                      <a:ext cx="5486400" cy="2338336"/>
+                    </a:xfrm>
+                    <a:prstGeom prst="rect"/>
+                  </pic:spPr>
+                </pic:pic>
+              </a:graphicData>
+            </a:graphic>
+          </wp:inline>
+        </w:drawing>
+      </w:r>
+    </w:p>
+    <w:p>
+      <w:pPr>
+        <w:jc w:val="center"/>
+      </w:pPr>
+      <w:r>
+        <w:rPr>
+          <w:i/>
+          <w:sz w:val="20"/>
+        </w:rPr>
+        <w:t>Figure 6 — Side-by-side PCA projection: K-Means (left) vs Hierarchical / Ward (right). Both methods identify the same three groups.</w:t>
       </w:r>
     </w:p>
     <w:p/>

</xml_diff>

<commit_message>
Fix figure caption style to match table captions (9pt italic #646464)
https://claude.ai/code/session_01QhGjCchUC55W7pMvffa1Aj
</commit_message>
<xml_diff>
--- a/scientificProject1/report/startup_success_report.docx
+++ b/scientificProject1/report/startup_success_report.docx
@@ -5354,7 +5354,8 @@
       <w:r>
         <w:rPr>
           <w:i/>
-          <w:sz w:val="20"/>
+          <w:color w:val="646464"/>
+          <w:sz w:val="18"/>
         </w:rPr>
         <w:t>Figure 4 — CV accuracy comparison for the four models on the binary dataset (Failure vs Acquisition).</w:t>
       </w:r>
@@ -7081,7 +7082,8 @@
       <w:r>
         <w:rPr>
           <w:i/>
-          <w:sz w:val="20"/>
+          <w:color w:val="646464"/>
+          <w:sz w:val="18"/>
         </w:rPr>
         <w:t>Figure 5 — Cluster profiles (mean feature values). Left: small-scale features; Right: large-scale features.</w:t>
       </w:r>
@@ -7541,7 +7543,8 @@
       <w:r>
         <w:rPr>
           <w:i/>
-          <w:sz w:val="20"/>
+          <w:color w:val="646464"/>
+          <w:sz w:val="18"/>
         </w:rPr>
         <w:t>Figure 6 — Side-by-side PCA projection: K-Means (left) vs Hierarchical / Ward (right). Both methods identify the same three groups.</w:t>
       </w:r>

</xml_diff>

<commit_message>
Fix all figure captions: clone exact XML from Table 7 caption
Figure 3 had extra w:szCs and wrong spacing; Figure 4/5/6 were missing
w:spacing before=40. Replaced pPr and rPr of all figure captions by
cloning directly from Table 7 caption XML to guarantee identical styling.

https://claude.ai/code/session_01QhGjCchUC55W7pMvffa1Aj
</commit_message>
<xml_diff>
--- a/scientificProject1/report/startup_success_report.docx
+++ b/scientificProject1/report/startup_success_report.docx
@@ -4185,7 +4185,7 @@
     </w:p>
     <w:p>
       <w:pPr>
-        <w:spacing w:before="20" w:after="120"/>
+        <w:spacing w:before="40"/>
         <w:jc w:val="center"/>
       </w:pPr>
       <w:r>
@@ -4193,29 +4193,8 @@
           <w:i/>
           <w:color w:val="646464"/>
           <w:sz w:val="18"/>
-          <w:szCs w:val="18"/>
         </w:rPr>
-        <w:t xml:space="preserve">Figure </w:t>
-      </w:r>
-      <w:r>
-        <w:rPr>
-          <w:rFonts w:eastAsia="宋体" w:hint="eastAsia"/>
-          <w:i/>
-          <w:color w:val="646464"/>
-          <w:sz w:val="18"/>
-          <w:szCs w:val="18"/>
-          <w:lang w:eastAsia="zh-CN"/>
-        </w:rPr>
-        <w:t>1</w:t>
-      </w:r>
-      <w:r>
-        <w:rPr>
-          <w:i/>
-          <w:color w:val="646464"/>
-          <w:sz w:val="18"/>
-          <w:szCs w:val="18"/>
-        </w:rPr>
-        <w:t xml:space="preserve"> — CV accuracy comparison for all four tuned models (5-fold StratifiedKFold).</w:t>
+        <w:t>Figure 1 — CV accuracy comparison for all four tuned models (5-fold StratifiedKFold).</w:t>
       </w:r>
     </w:p>
     <w:p>
@@ -4954,7 +4933,7 @@
     </w:p>
     <w:p>
       <w:pPr>
-        <w:spacing w:before="20" w:after="120"/>
+        <w:spacing w:before="40"/>
         <w:jc w:val="center"/>
       </w:pPr>
       <w:r>
@@ -4962,29 +4941,8 @@
           <w:i/>
           <w:color w:val="646464"/>
           <w:sz w:val="18"/>
-          <w:szCs w:val="18"/>
         </w:rPr>
-        <w:t xml:space="preserve">Figure </w:t>
-      </w:r>
-      <w:r>
-        <w:rPr>
-          <w:rFonts w:eastAsia="宋体" w:hint="eastAsia"/>
-          <w:i/>
-          <w:color w:val="646464"/>
-          <w:sz w:val="18"/>
-          <w:szCs w:val="18"/>
-          <w:lang w:eastAsia="zh-CN"/>
-        </w:rPr>
-        <w:t>2</w:t>
-      </w:r>
-      <w:r>
-        <w:rPr>
-          <w:i/>
-          <w:color w:val="646464"/>
-          <w:sz w:val="18"/>
-          <w:szCs w:val="18"/>
-        </w:rPr>
-        <w:t xml:space="preserve"> — ROC Curves (One-vs-Rest) for Logistic Regression on the 3-class test set.</w:t>
+        <w:t>Figure 2 — ROC Curves (One-vs-Rest) for Logistic Regression on the 3-class test set.</w:t>
       </w:r>
     </w:p>
     <w:p>
@@ -5349,6 +5307,7 @@
     </w:p>
     <w:p>
       <w:pPr>
+        <w:spacing w:before="40"/>
         <w:jc w:val="center"/>
       </w:pPr>
       <w:r>
@@ -5912,7 +5871,7 @@
     </w:p>
     <w:p>
       <w:pPr>
-        <w:spacing w:before="20" w:after="120"/>
+        <w:spacing w:before="40"/>
         <w:jc w:val="center"/>
       </w:pPr>
       <w:r>
@@ -5920,7 +5879,6 @@
           <w:i/>
           <w:color w:val="646464"/>
           <w:sz w:val="18"/>
-          <w:szCs w:val="18"/>
         </w:rPr>
         <w:t>Figure 3 — ROC Curve for binary Logistic Regression (Acquisition vs Failure), AUC = 0.8163.</w:t>
       </w:r>
@@ -7077,6 +7035,7 @@
     </w:p>
     <w:p>
       <w:pPr>
+        <w:spacing w:before="40"/>
         <w:jc w:val="center"/>
       </w:pPr>
       <w:r>
@@ -7538,6 +7497,7 @@
     </w:p>
     <w:p>
       <w:pPr>
+        <w:spacing w:before="40"/>
         <w:jc w:val="center"/>
       </w:pPr>
       <w:r>

</xml_diff>